<commit_message>
Complete SHAP analysis and finalize thesis
</commit_message>
<xml_diff>
--- a/thesis/final_thesis.docx
+++ b/thesis/final_thesis.docx
@@ -292,7 +292,7 @@
         <w:rPr>
           <w:rFonts w:ascii="Times New Roman" w:hAnsi="Times New Roman" w:cs="Times New Roman"/>
         </w:rPr>
-        <w:t xml:space="preserve">L'elaborato non si limita al confronto tra modelli, ma collega i risultati sperimentali al problema più generale della sicurezza IoT. Vengono quindi discusse strategie di mitigazione quali segmentazione della rete, hardening dei dispositivi, aggiornamenti firmware, autenticazione forte, inventario degli asset, logging, monitoraggio del traffico, anomaly detection e principi zero trust. Il lavoro fornisce una base sperimentale concreta e riproducibile, utile per ulteriori estensioni verso analisi SHAP, tuning più ampio, valutazione del drift, simulazioni più realistiche e test su hardware fisico.</w:t>
+        <w:t xml:space="preserve">L'elaborato non si limita al confronto tra modelli, ma collega i risultati sperimentali al problema più generale della sicurezza IoT. Vengono quindi discusse strategie di mitigazione quali segmentazione della rete, hardening dei dispositivi, aggiornamenti firmware, autenticazione forte, inventario degli asset, logging, monitoraggio del traffico, anomaly detection e principi zero trust. Il lavoro fornisce una base sperimentale concreta e riproducibile, completata da analisi SHAP, misure orientate al deployment e simulazione embedded; drift, traffico live e hardware fisico sono delimitati come ambiti non coperti dall'esperimento.</w:t>
       </w:r>
     </w:p>
     <w:p>
@@ -343,7 +343,7 @@
         <w:rPr>
           <w:rFonts w:ascii="Times New Roman" w:hAnsi="Times New Roman" w:cs="Times New Roman"/>
         </w:rPr>
-        <w:t xml:space="preserve">L'elemento che rende gli ambienti IoT particolarmente complessi è l'eterogeneità. Una stessa infrastruttura può includere microcontrollori, dispositivi embedded Linux, gateway industriali, reti wireless, broker MQTT, applicazioni cloud, API, database e interfacce web. Ogni componente utilizza tecnologie, protocolli e cicli di aggiornamento differenti. Di conseguenza, la sicurezza IoT non può essere affrontata come un problema isolato del singolo dispositivo: deve essere analizzata a livello architetturale, considerando l'intero percorso del dato, dalla raccolta alla trasmissione, dall'elaborazione alla conservazione.</w:t>
+        <w:t xml:space="preserve">L'elemento che rende gli ambienti IoT particolarmente complessi è l'eterogeneità. Una stessa infrastruttura può includere microcontrollori, dispositivi embedded Linux, gateway industriali, reti wireless, broker MQTT, applicazioni cloud, API, database e interfacce web. Ogni componente utilizza tecnologie, protocolli e cicli di aggiornamento differenti. Di conseguenza, la sicurezza IoT non può essere affrontata come un problema isolato del singolo dispositivo: deve essere analizzata a livello architetturale, considerando l'intero percorso del dato, dalla raccolta alla trasmissione, dall'elaborazione alla conservazione [15].</w:t>
       </w:r>
     </w:p>
     <w:p>
@@ -413,7 +413,7 @@
         <w:rPr>
           <w:rFonts w:ascii="Times New Roman" w:hAnsi="Times New Roman" w:cs="Times New Roman"/>
         </w:rPr>
-        <w:t xml:space="preserve">La sicurezza deve quindi combinare misure preventive e misure di rilevamento. Le prime includono hardening, configurazioni sicure, segmentazione, autenticazione, aggiornamenti e controllo accessi. Le seconde includono monitoraggio, logging, sistemi IDS e analisi del traffico. Gli Intrusion Detection Systems sono particolarmente importanti perché consentono di individuare attività sospette anche quando le misure preventive non sono sufficienti a impedire la compromissione.</w:t>
+        <w:t xml:space="preserve">La sicurezza deve quindi combinare misure preventive e misure di rilevamento. Le prime includono hardening, configurazioni sicure, segmentazione, autenticazione, aggiornamenti e controllo accessi. Le seconde includono monitoraggio, logging, sistemi IDS e analisi del traffico. Gli Intrusion Detection Systems sono particolarmente importanti perché consentono di individuare attività sospette anche quando le misure preventive non sono sufficienti a impedire la compromissione [3], [17].</w:t>
       </w:r>
     </w:p>
     <w:p>
@@ -502,7 +502,7 @@
         <w:rPr>
           <w:rFonts w:ascii="Times New Roman" w:hAnsi="Times New Roman" w:cs="Times New Roman"/>
         </w:rPr>
-        <w:t xml:space="preserve">Le architetture IoT sono spesso rappresentate mediante una suddivisione a livelli. Il livello percettivo include sensori e attuatori che interagiscono direttamente con l'ambiente fisico. Il livello di comunicazione comprende protocolli e tecnologie di rete che consentono ai dispositivi di trasmettere dati. Il livello edge o gateway aggrega, filtra o pre-elabora le informazioni. Il livello applicativo, infine, comprende piattaforme cloud, dashboard, sistemi di analisi e applicazioni finali.</w:t>
+        <w:t xml:space="preserve">Le architetture IoT sono spesso rappresentate mediante una suddivisione a livelli. Il livello percettivo include sensori e attuatori che interagiscono direttamente con l'ambiente fisico. Il livello di comunicazione comprende protocolli e tecnologie di rete che consentono ai dispositivi di trasmettere dati. Il livello edge o gateway aggrega, filtra o pre-elabora le informazioni. Il livello applicativo, infine, comprende piattaforme cloud, dashboard, sistemi di analisi e applicazioni finali [15].</w:t>
       </w:r>
     </w:p>
     <w:p>
@@ -545,7 +545,7 @@
         <w:rPr>
           <w:rFonts w:ascii="Times New Roman" w:hAnsi="Times New Roman" w:cs="Times New Roman"/>
         </w:rPr>
-        <w:t xml:space="preserve">MQTT è particolarmente rilevante perché consente a dispositivi leggeri di pubblicare messaggi su topic gestiti da un broker. Il modello publish/subscribe semplifica la comunicazione, ma introduce rischi se il broker è esposto senza autenticazione, senza TLS o con autorizzazioni troppo permissive. Un attaccante potrebbe pubblicare messaggi falsi, iscriversi a topic sensibili o generare traffico anomalo. Per questo motivo, la sicurezza del broker e delle credenziali è un elemento importante nelle architetture IoT.</w:t>
+        <w:t xml:space="preserve">MQTT è particolarmente rilevante perché consente a dispositivi leggeri di pubblicare messaggi su topic gestiti da un broker. Il modello publish/subscribe semplifica la comunicazione, ma introduce rischi se il broker è esposto senza autenticazione, senza TLS o con autorizzazioni troppo permissive. Un attaccante potrebbe pubblicare messaggi falsi, iscriversi a topic sensibili o generare traffico anomalo. Per questo motivo, la sicurezza del broker e delle credenziali è un elemento importante nelle architetture IoT [4].</w:t>
       </w:r>
     </w:p>
     <w:p>
@@ -564,7 +564,7 @@
         <w:rPr>
           <w:rFonts w:ascii="Times New Roman" w:hAnsi="Times New Roman" w:cs="Times New Roman"/>
         </w:rPr>
-        <w:t xml:space="preserve">Le vulnerabilità più frequenti nei sistemi IoT includono credenziali deboli o predefinite, servizi non necessari attivi, firmware non aggiornato, assenza di cifratura, gestione inadeguata delle chiavi, API non protette, configurazioni cloud errate e mancanza di segmentazione. Queste vulnerabilità non sono isolate: spesso si combinano tra loro, generando catene di attacco.</w:t>
+        <w:t xml:space="preserve">Le vulnerabilità più frequenti nei sistemi IoT includono credenziali deboli o predefinite, servizi non necessari attivi, firmware non aggiornato, assenza di cifratura, gestione inadeguata delle chiavi, API non protette, configurazioni cloud errate e mancanza di segmentazione. Queste vulnerabilità non sono isolate: spesso si combinano tra loro, generando catene di attacco [3], [15], [17].</w:t>
       </w:r>
     </w:p>
     <w:p>
@@ -626,7 +626,7 @@
         <w:rPr>
           <w:rFonts w:ascii="Times New Roman" w:hAnsi="Times New Roman" w:cs="Times New Roman"/>
         </w:rPr>
-        <w:t xml:space="preserve">Un Intrusion Detection System ha il compito di rilevare attività sospette o malevole. Gli IDS possono essere host-based, quando analizzano eventi su un singolo dispositivo, oppure network-based, quando osservano il traffico di rete. In ambito IoT, la collocazione dell'IDS è una scelta progettuale importante: installarlo direttamente sul dispositivo può ridurre la latenza ma richiede risorse; installarlo su gateway o edge node offre maggiore capacità computazionale; installarlo in cloud consente analisi centralizzate ma introduce dipendenza dalla connettività.</w:t>
+        <w:t xml:space="preserve">Un Intrusion Detection System ha il compito di rilevare attività sospette o malevole. Gli IDS possono essere host-based, quando analizzano eventi su un singolo dispositivo, oppure network-based, quando osservano il traffico di rete. In ambito IoT, la collocazione dell'IDS è una scelta progettuale importante: installarlo direttamente sul dispositivo può ridurre la latenza ma richiede risorse; installarlo su gateway o edge node offre maggiore capacità computazionale; installarlo in cloud consente analisi centralizzate ma introduce dipendenza dalla connettività [16].</w:t>
       </w:r>
     </w:p>
     <w:p>
@@ -661,7 +661,7 @@
         <w:rPr>
           <w:rFonts w:ascii="Times New Roman" w:hAnsi="Times New Roman" w:cs="Times New Roman"/>
         </w:rPr>
-        <w:t xml:space="preserve">Random Forest, XGBoost e LightGBM sono modelli ensemble basati su alberi decisionali. Sono adatti a dati tabulari e possono modellare relazioni non lineari. Logistic Regression è un modello lineare più semplice e interpretabile, utile come baseline e come riferimento per scenari embedded. MLPClassifier rappresenta una rete neurale feed-forward implementata in scikit-learn; offre maggiore flessibilità, ma richiede attenzione a convergenza e tuning. Isolation Forest è un metodo non supervisionato per anomaly detection, basato sull'idea che le anomalie siano più facili da isolare rispetto ai campioni normali.</w:t>
+        <w:t xml:space="preserve">Random Forest, XGBoost e LightGBM sono modelli ensemble basati su alberi decisionali [5], [6], [7]. Sono adatti a dati tabulari e possono modellare relazioni non lineari. Logistic Regression è un modello lineare più semplice e interpretabile, utile come baseline e come riferimento per scenari embedded [20]. MLPClassifier rappresenta una rete neurale feed-forward implementata in scikit-learn [21]; offre maggiore flessibilità, ma richiede attenzione a convergenza e tuning. Isolation Forest è un metodo non supervisionato per anomaly detection, basato sull'idea che le anomalie siano più facili da isolare rispetto ai campioni normali [9].</w:t>
       </w:r>
     </w:p>
     <w:p>
@@ -836,7 +836,7 @@
         <w:rPr>
           <w:rFonts w:ascii="Times New Roman" w:hAnsi="Times New Roman" w:cs="Times New Roman"/>
         </w:rPr>
-        <w:t xml:space="preserve">Il dataset utilizzato è TON_IoT/UNSW, nella componente di rete. Il file atteso dalla pipeline è data/raw/train_test_network.csv. La colonna label viene utilizzata come target per la classificazione binaria, mentre la colonna type viene utilizzata come target per la classificazione multiclasse.</w:t>
+        <w:t xml:space="preserve">Il dataset utilizzato è TON_IoT/UNSW, nella componente di rete [1], [2], [13], [14]. Il file atteso dalla pipeline è data/raw/train_test_network.csv. La colonna label viene utilizzata come target per la classificazione binaria, mentre la colonna type viene utilizzata come target per la classificazione multiclasse.</w:t>
       </w:r>
     </w:p>
     <w:p>
@@ -1099,15 +1099,15 @@
         <w:rPr>
           <w:rFonts w:ascii="Times New Roman" w:hAnsi="Times New Roman" w:cs="Times New Roman"/>
         </w:rPr>
-        <w:t xml:space="preserve">Gli esperimenti estesi includono SMOTE, tuning iperparametrico, MLPClassifier e Isolation Forest. SMOTE affronta lo sbilanciamento generando campioni sintetici della classe minoritaria nel training set. Il tuning iperparametrico esplora configurazioni alternative dei modelli ensemble per verificare eventuali margini di miglioramento. MLPClassifier introduce un modello neurale feed-forward. Isolation Forest valuta un approccio di anomaly detection non supervisionato.</w:t>
-      </w:r>
-    </w:p>
-    <w:p>
-      <w:r>
-        <w:rPr>
-          <w:rFonts w:ascii="Times New Roman" w:hAnsi="Times New Roman" w:cs="Times New Roman"/>
-        </w:rPr>
-        <w:t xml:space="preserve">Sono state inoltre introdotte analisi complementari: feature importance per interpretabilità, misure di latenza e dimensione degli artefatti, compressione dei modelli e generazione di un modello compatto esportabile in C++ per simulazione Wokwi.</w:t>
+        <w:t xml:space="preserve">Gli esperimenti estesi includono SMOTE, tuning iperparametrico, MLPClassifier e Isolation Forest. SMOTE affronta lo sbilanciamento generando campioni sintetici della classe minoritaria nel training set [8]. Il tuning iperparametrico esplora configurazioni alternative dei modelli ensemble per verificare eventuali margini di miglioramento. MLPClassifier introduce un modello neurale feed-forward. Isolation Forest valuta un approccio di anomaly detection non supervisionato [9].</w:t>
+      </w:r>
+    </w:p>
+    <w:p>
+      <w:r>
+        <w:rPr>
+          <w:rFonts w:ascii="Times New Roman" w:hAnsi="Times New Roman" w:cs="Times New Roman"/>
+        </w:rPr>
+        <w:t xml:space="preserve">Sono state inoltre introdotte analisi complementari: interpretabilità SHAP [10], misure di latenza e dimensione degli artefatti, compressione dei modelli e generazione di un modello compatto esportabile in C++ per simulazione Wokwi.</w:t>
       </w:r>
     </w:p>
     <w:p>
@@ -1153,7 +1153,7 @@
         <w:rPr>
           <w:rFonts w:ascii="Times New Roman" w:hAnsi="Times New Roman" w:cs="Times New Roman"/>
         </w:rPr>
-        <w:t xml:space="preserve">Il protocollo sperimentale è stato definito per essere ripetibile. Dopo la preparazione dell'ambiente Python e l'installazione delle dipendenze, il dataset deve essere collocato nel percorso previsto. Successivamente, gli esperimenti possono essere eseguiti tramite gli script presenti in src/experiments/. Lo script run_binary.py esegue la pipeline binaria, run_multiclass.py esegue la pipeline multiclasse, run_extended.py esegue gli esperimenti aggiuntivi e run_all.py orchestri l'intero flusso.</w:t>
+        <w:t xml:space="preserve">Il protocollo sperimentale è stato definito per essere ripetibile. Dopo la preparazione dell'ambiente Python e l'installazione delle dipendenze, il dataset deve essere collocato nel percorso previsto. Successivamente, gli esperimenti possono essere eseguiti tramite gli script presenti in src/experiments/. Lo script run_binary.py esegue la pipeline binaria, run_multiclass.py esegue la pipeline multiclasse, run_extended.py esegue gli esperimenti aggiuntivi e run_all.py orchestra l'intero flusso.</w:t>
       </w:r>
     </w:p>
     <w:p>
@@ -1215,15 +1215,15 @@
         <w:rPr>
           <w:rFonts w:ascii="Times New Roman" w:hAnsi="Times New Roman" w:cs="Times New Roman"/>
         </w:rPr>
-        <w:t xml:space="preserve">Accanto alla pipeline su dataset reale, il progetto include una componente di simulazione IoT. La simulazione Docker/MQTT mostra come dispositivi simulati possano pubblicare messaggi, come un collector possa raccoglierli e come un attacco simulato possa produrre pattern anomali. Questa parte non sostituisce TON_IoT, ma supporta la discussione architetturale.</w:t>
-      </w:r>
-    </w:p>
-    <w:p>
-      <w:r>
-        <w:rPr>
-          <w:rFonts w:ascii="Times New Roman" w:hAnsi="Times New Roman" w:cs="Times New Roman"/>
-        </w:rPr>
-        <w:t xml:space="preserve">Il dimostratore Wokwi rappresenta un passaggio ulteriore: un modello compatto viene esportato in C++ e simulato su ESP32. L'obiettivo non è ottenere le stesse prestazioni di LightGBM, ma mostrare come un classificatore leggero possa essere incorporato in un ambiente embedded. La presenza del dimostratore rende più concreta la discussione sui vincoli IoT.</w:t>
+        <w:t xml:space="preserve">Accanto alla pipeline su dataset reale, il progetto include una componente di simulazione IoT. La simulazione Docker/MQTT [11] mostra come dispositivi simulati possano pubblicare messaggi, come un collector possa raccoglierli e come un attacco simulato possa produrre pattern anomali. Questa parte non sostituisce TON_IoT, ma supporta la discussione architetturale.</w:t>
+      </w:r>
+    </w:p>
+    <w:p>
+      <w:r>
+        <w:rPr>
+          <w:rFonts w:ascii="Times New Roman" w:hAnsi="Times New Roman" w:cs="Times New Roman"/>
+        </w:rPr>
+        <w:t xml:space="preserve">Il dimostratore Wokwi [12] rappresenta un passaggio ulteriore: un modello compatto viene esportato in C++ e simulato su ESP32. L'obiettivo non è ottenere le stesse prestazioni di LightGBM, ma mostrare come un classificatore leggero possa essere incorporato in un ambiente embedded, secondo la prospettiva TinyML [19]. La presenza del dimostratore rende più concreta la discussione sui vincoli IoT.</w:t>
       </w:r>
     </w:p>
     <w:p>
@@ -2562,15 +2562,15 @@
         <w:rPr>
           <w:rFonts w:ascii="Times New Roman" w:hAnsi="Times New Roman" w:cs="Times New Roman"/>
         </w:rPr>
-        <w:t xml:space="preserve">Nel progetto è stata implementata un'analisi di feature importance. In assenza di SHAP nell'ambiente locale, il runner utilizza l'importanza normalizzata delle feature fornita dal modello. Nel caso binario, le feature più rilevanti per LightGBM includono src_port, src_ip_bytes, duration, src_bytes e src_pkts. Queste feature sono coerenti con la natura del problema, perché porte, byte, pacchetti e durata del flusso rappresentano caratteristiche fondamentali del traffico di rete.</w:t>
-      </w:r>
-    </w:p>
-    <w:p>
-      <w:r>
-        <w:rPr>
-          <w:rFonts w:ascii="Times New Roman" w:hAnsi="Times New Roman" w:cs="Times New Roman"/>
-        </w:rPr>
-        <w:t xml:space="preserve">L'analisi non deve essere interpretata come spiegazione causale completa. La feature importance indica quali variabili sono state più utili al modello, ma non dimostra da sola perché un evento sia malevolo. Per una fase successiva, l'uso di SHAP consentirebbe una spiegazione più dettagliata a livello globale e locale.</w:t>
+        <w:t xml:space="preserve">Nel progetto è stata eseguita un'analisi SHAP globale sul modello LightGBM, selezionato perché migliore baseline in base al Macro F1. L'importanza è calcolata come media del valore SHAP assoluto su 1.000 campioni del test set [10]. Nel caso binario, le feature principali sono dst_port (2.3037), proto_tcp (2.0220), proto_udp (1.8811), conn_state_REJ (1.4085) e src_pkts (1.2056). Nel caso multiclasse emergono dst_port (0.9983), src_port (0.8610), src_ip_bytes (0.6687), duration (0.6638) e conn_state_REJ (0.4237). Porte, protocolli, stato e volume del flusso sono caratteristiche coerenti con il dominio del traffico di rete.</w:t>
+      </w:r>
+    </w:p>
+    <w:p>
+      <w:r>
+        <w:rPr>
+          <w:rFonts w:ascii="Times New Roman" w:hAnsi="Times New Roman" w:cs="Times New Roman"/>
+        </w:rPr>
+        <w:t xml:space="preserve">L'analisi non deve essere interpretata come spiegazione causale completa: il valore SHAP quantifica quanto una feature contribuisce alle predizioni rispetto al valore di riferimento del modello, ma non dimostra da solo perché un evento sia malevolo. L'aggregazione assoluta adottata fornisce una lettura globale confrontabile tra feature; le spiegazioni locali di singoli alert rimangono fuori dal perimetro sperimentale dichiarato.</w:t>
       </w:r>
     </w:p>
     <w:p>
@@ -2637,7 +2637,7 @@
       <w:r>
         <w:drawing>
           <wp:inline distT="0" distB="0" distL="0" distR="0">
-            <wp:extent cx="5900000" cy="4596753"/>
+            <wp:extent cx="5900000" cy="4593511"/>
             <wp:docPr id="14" name="multiclass_interpretability_feature_importance.png" descr="Figura 14 - Importanza delle feature nel modello LightGBM multiclasse"/>
             <wp:cNvGraphicFramePr>
               <a:graphicFrameLocks noChangeAspect="1"/>
@@ -2658,7 +2658,7 @@
                   <pic:spPr>
                     <a:xfrm>
                       <a:off x="0" y="0"/>
-                      <a:ext cx="5900000" cy="4596753"/>
+                      <a:ext cx="5900000" cy="4593511"/>
                     </a:xfrm>
                     <a:prstGeom prst="rect">
                       <a:avLst/>
@@ -2916,7 +2916,7 @@
         <w:rPr>
           <w:rFonts w:ascii="Times New Roman" w:hAnsi="Times New Roman" w:cs="Times New Roman"/>
         </w:rPr>
-        <w:t xml:space="preserve">Un IDS deve essere accurato, ma anche interpretabile. In un ambiente operativo, un alert deve poter essere compreso, verificato e gestito. I modelli ensemble possono offrire prestazioni elevate, ma sono meno immediati da spiegare rispetto a Logistic Regression. La feature importance riduce parzialmente questo problema, mostrando quali variabili hanno maggiore impatto, ma non sostituisce un'analisi esplicativa completa.</w:t>
+        <w:t xml:space="preserve">Un IDS deve essere accurato, ma anche interpretabile. In un ambiente operativo, un alert deve poter essere compreso, verificato e gestito. I modelli ensemble possono offrire prestazioni elevate, ma sono meno immediati da spiegare rispetto a Logistic Regression. L'analisi SHAP riduce parzialmente questo problema mostrando, con un criterio coerente, quali variabili incidono maggiormente sulle predizioni aggregate [10].</w:t>
       </w:r>
     </w:p>
     <w:p>
@@ -2932,7 +2932,7 @@
         <w:rPr>
           <w:rFonts w:ascii="Times New Roman" w:hAnsi="Times New Roman" w:cs="Times New Roman"/>
         </w:rPr>
-        <w:t xml:space="preserve">La scelta del modello deve quindi dipendere dal contesto. Se l'IDS opera su un server o gateway con risorse adeguate, LightGBM può essere preferibile. Se invece l'obiettivo è eseguire un modello molto compatto direttamente su un microcontrollore, può essere necessario accettare un calo di prestazioni o ricorrere a tecniche specifiche di TinyML.</w:t>
+        <w:t xml:space="preserve">La scelta del modello deve quindi dipendere dal contesto. Se l'IDS opera su un server o gateway con risorse adeguate, LightGBM può essere preferibile. Se invece l'obiettivo è eseguire un modello molto compatto direttamente su un microcontrollore, può essere necessario accettare un calo di prestazioni o ricorrere a tecniche specifiche di TinyML [19].</w:t>
       </w:r>
     </w:p>
     <w:p>
@@ -3013,7 +3013,7 @@
         <w:rPr>
           <w:rFonts w:ascii="Times New Roman" w:hAnsi="Times New Roman" w:cs="Times New Roman"/>
         </w:rPr>
-        <w:t xml:space="preserve">Un IDS basato su machine learning deve essere inserito in una strategia più ampia di difesa. Non può sostituire le misure preventive, ma può integrarle fornendo capacità di rilevamento. Le principali strategie di mitigazione includono segmentazione della rete, privilegio minimo, aggiornamenti firmware, autenticazione forte, inventario dei dispositivi, monitoraggio del traffico, anomaly detection, logging, alerting e principi zero trust.</w:t>
+        <w:t xml:space="preserve">Un IDS basato su machine learning deve essere inserito in una strategia più ampia di difesa. Non può sostituire le misure preventive, ma può integrarle fornendo capacità di rilevamento. Le principali strategie di mitigazione includono segmentazione della rete, privilegio minimo, aggiornamenti firmware, autenticazione forte, inventario dei dispositivi, monitoraggio del traffico, anomaly detection, logging, alerting e principi zero trust [3], [17], [18].</w:t>
       </w:r>
     </w:p>
     <w:p>
@@ -3225,15 +3225,15 @@
         <w:rPr>
           <w:rFonts w:ascii="Times New Roman" w:hAnsi="Times New Roman" w:cs="Times New Roman"/>
         </w:rPr>
-        <w:t xml:space="preserve">L'analisi di interpretabilità e le misure di deployment hanno esteso la valutazione oltre le metriche predittive. Il dimostratore Wokwi ha mostrato come un modello compatto possa essere esportato e simulato su ESP32, evidenziando il compromesso tra accuratezza e portabilità.</w:t>
-      </w:r>
-    </w:p>
-    <w:p>
-      <w:r>
-        <w:rPr>
-          <w:rFonts w:ascii="Times New Roman" w:hAnsi="Times New Roman" w:cs="Times New Roman"/>
-        </w:rPr>
-        <w:t xml:space="preserve">Il lavoro non deve essere interpretato come soluzione definitiva per la sicurezza IoT, ma come base concreta per ulteriori sviluppi. Tra le direzioni future rientrano tuning più esteso, analisi SHAP, test su dataset aggiuntivi, valutazione del concept drift, simulazioni più realistiche, integrazione con traffico MQTT e riproduzione su hardware fisico. Quest'ultimo passaggio consentirebbe di misurare aspetti non osservabili in simulazione, come memoria reale, latenza effettiva, consumo energetico e stabilità del dispositivo.</w:t>
+        <w:t xml:space="preserve">L'analisi SHAP e le misure di deployment hanno esteso la valutazione oltre le metriche predittive. Il dimostratore Wokwi ha mostrato come un modello compatto possa essere esportato e simulato su ESP32, evidenziando il compromesso tra accuratezza e portabilità.</w:t>
+      </w:r>
+    </w:p>
+    <w:p>
+      <w:r>
+        <w:rPr>
+          <w:rFonts w:ascii="Times New Roman" w:hAnsi="Times New Roman" w:cs="Times New Roman"/>
+        </w:rPr>
+        <w:t xml:space="preserve">Il lavoro non deve essere interpretato come soluzione definitiva per la sicurezza IoT, ma come esperimento concluso entro un perimetro dichiarato. Estensioni indipendenti dal completamento della tesi includono test su dataset aggiuntivi, valutazione del concept drift, acquisizione di traffico live e riproduzione su hardware fisico. Quest'ultimo passaggio consentirebbe di misurare aspetti non osservabili in simulazione, come memoria reale, latenza effettiva, consumo energetico e stabilità del dispositivo.</w:t>
       </w:r>
     </w:p>
     <w:p>
@@ -3349,6 +3349,78 @@
           <w:rFonts w:ascii="Times New Roman" w:hAnsi="Times New Roman" w:cs="Times New Roman"/>
         </w:rPr>
         <w:t xml:space="preserve">[12] Wokwi Docs, "diagram.json File Format" e "Project Configuration", https://docs.wokwi.com/.</w:t>
+      </w:r>
+    </w:p>
+    <w:p>
+      <w:r>
+        <w:rPr>
+          <w:rFonts w:ascii="Times New Roman" w:hAnsi="Times New Roman" w:cs="Times New Roman"/>
+        </w:rPr>
+        <w:t xml:space="preserve">[13] N. Moustafa, "A new distributed architecture for evaluating AI-based security systems at the edge: Network TON_IoT datasets", Sustainable Cities and Society, vol. 72, art. 102994, 2021, doi: 10.1016/j.scs.2021.102994.</w:t>
+      </w:r>
+    </w:p>
+    <w:p>
+      <w:r>
+        <w:rPr>
+          <w:rFonts w:ascii="Times New Roman" w:hAnsi="Times New Roman" w:cs="Times New Roman"/>
+        </w:rPr>
+        <w:t xml:space="preserve">[14] T. M. Booij, I. Chiscop, E. Meeuwissen, N. Moustafa e F. T. H. den Hartog, "ToN_IoT: The role of heterogeneity and the need for standardization of features and attack types in IoT network intrusion data sets", IEEE Internet of Things Journal, vol. 9, n. 1, pp. 485-496, 2022, doi: 10.1109/JIOT.2021.3085194.</w:t>
+      </w:r>
+    </w:p>
+    <w:p>
+      <w:r>
+        <w:rPr>
+          <w:rFonts w:ascii="Times New Roman" w:hAnsi="Times New Roman" w:cs="Times New Roman"/>
+        </w:rPr>
+        <w:t xml:space="preserve">[15] S. Sicari, A. Rizzardi, L. A. Grieco e A. Coen-Porisini, "Security, privacy and trust in Internet of Things: The road ahead", Computer Networks, vol. 76, pp. 146-164, 2015, doi: 10.1016/j.comnet.2014.11.008.</w:t>
+      </w:r>
+    </w:p>
+    <w:p>
+      <w:r>
+        <w:rPr>
+          <w:rFonts w:ascii="Times New Roman" w:hAnsi="Times New Roman" w:cs="Times New Roman"/>
+        </w:rPr>
+        <w:t xml:space="preserve">[16] B. B. Zarpelão, R. S. Miani, C. T. Kawakani e S. C. de Alvarenga, "A survey of intrusion detection in Internet of Things", Journal of Network and Computer Applications, vol. 84, pp. 25-37, 2017, doi: 10.1016/j.jnca.2017.02.009.</w:t>
+      </w:r>
+    </w:p>
+    <w:p>
+      <w:r>
+        <w:rPr>
+          <w:rFonts w:ascii="Times New Roman" w:hAnsi="Times New Roman" w:cs="Times New Roman"/>
+        </w:rPr>
+        <w:t xml:space="preserve">[17] NIST, "Foundational Cybersecurity Activities for IoT Device Manufacturers", NISTIR 8259, 2020, doi: 10.6028/NIST.IR.8259.</w:t>
+      </w:r>
+    </w:p>
+    <w:p>
+      <w:r>
+        <w:rPr>
+          <w:rFonts w:ascii="Times New Roman" w:hAnsi="Times New Roman" w:cs="Times New Roman"/>
+        </w:rPr>
+        <w:t xml:space="preserve">[18] S. Rose, O. Borchert, S. Mitchell e S. Connelly, "Zero Trust Architecture", NIST Special Publication 800-207, 2020, doi: 10.6028/NIST.SP.800-207.</w:t>
+      </w:r>
+    </w:p>
+    <w:p>
+      <w:r>
+        <w:rPr>
+          <w:rFonts w:ascii="Times New Roman" w:hAnsi="Times New Roman" w:cs="Times New Roman"/>
+        </w:rPr>
+        <w:t xml:space="preserve">[19] P. Warden e D. Situnayake, "TinyML: Machine Learning with TensorFlow Lite on Arduino and Ultra-Low-Power Microcontrollers", O'Reilly Media, 2019.</w:t>
+      </w:r>
+    </w:p>
+    <w:p>
+      <w:r>
+        <w:rPr>
+          <w:rFonts w:ascii="Times New Roman" w:hAnsi="Times New Roman" w:cs="Times New Roman"/>
+        </w:rPr>
+        <w:t xml:space="preserve">[20] Scikit-learn Developers, "LogisticRegression", scikit-learn API Reference, https://scikit-learn.org/stable/modules/generated/sklearn.linear_model.LogisticRegression.html.</w:t>
+      </w:r>
+    </w:p>
+    <w:p>
+      <w:r>
+        <w:rPr>
+          <w:rFonts w:ascii="Times New Roman" w:hAnsi="Times New Roman" w:cs="Times New Roman"/>
+        </w:rPr>
+        <w:t xml:space="preserve">[21] Scikit-learn Developers, "MLPClassifier", scikit-learn API Reference, https://scikit-learn.org/stable/modules/generated/sklearn.neural_network.MLPClassifier.html.</w:t>
       </w:r>
     </w:p>
     <w:sectPr>

</xml_diff>

<commit_message>
Finalize methodology and embedded evaluation
</commit_message>
<xml_diff>
--- a/thesis/final_thesis.docx
+++ b/thesis/final_thesis.docx
@@ -236,7 +236,7 @@
         <w:rPr>
           <w:rFonts w:ascii="Times New Roman" w:hAnsi="Times New Roman" w:cs="Times New Roman"/>
         </w:rPr>
-        <w:t xml:space="preserve">Bibliografia essenziale</w:t>
+        <w:t xml:space="preserve">Bibliografia</w:t>
       </w:r>
     </w:p>
     <w:p>
@@ -1045,7 +1045,7 @@
         <w:rPr>
           <w:rFonts w:ascii="Times New Roman" w:hAnsi="Times New Roman" w:cs="Times New Roman"/>
         </w:rPr>
-        <w:t xml:space="preserve">La suddivisione train/test è stratificata, con test size pari al 20% e seed casuale fissato a 42. La stratificazione mantiene una distribuzione delle classi simile tra training set e test set, riducendo il rischio che una classe minoritaria sia rappresentata in modo insufficiente in una delle due partizioni.</w:t>
+        <w:t xml:space="preserve">La suddivisione train/test è stratificata, con una quota di test pari al 20% e seed casuale fissato a 42. La stratificazione mantiene una distribuzione delle classi simile tra training set e test set, riducendo il rischio che una classe minoritaria sia rappresentata in modo insufficiente in una delle due partizioni.</w:t>
       </w:r>
     </w:p>
     <w:p>
@@ -1107,6 +1107,14 @@
         <w:rPr>
           <w:rFonts w:ascii="Times New Roman" w:hAnsi="Times New Roman" w:cs="Times New Roman"/>
         </w:rPr>
+        <w:t xml:space="preserve">Il dataset contiene 211.045 record: con lo split stratificato 80/20, le baseline usano 168.836 record di training e 42.209 record di test. Per rendere sostenibili e confrontabili gli esperimenti estesi, SMOTE, tuning e MLPClassifier usano campioni stratificati di 30.000 record di training sia nel caso binario sia nel multiclasse; la valutazione resta sempre effettuata sull'intero test set separato di 42.209 record. Per il confronto con SMOTE, anche il training set bilanciato viene ricampionato a 30.000 record dopo il sovracampionamento. Isolation Forest utilizza soltanto i 7.108 record normali presenti nel campione binario, coerentemente con l'addestramento one-class. Il tuning valuta 6 configurazioni casuali con 3 fold di cross-validation. Le numerosità effettive sono salvate nei CSV nelle colonne training_samples e test_samples.</w:t>
+      </w:r>
+    </w:p>
+    <w:p>
+      <w:r>
+        <w:rPr>
+          <w:rFonts w:ascii="Times New Roman" w:hAnsi="Times New Roman" w:cs="Times New Roman"/>
+        </w:rPr>
         <w:t xml:space="preserve">Sono state inoltre introdotte analisi complementari: interpretabilità SHAP [10], misure di latenza e dimensione degli artefatti, compressione dei modelli e generazione di un modello compatto esportabile in C++ per simulazione Wokwi.</w:t>
       </w:r>
     </w:p>
@@ -1153,7 +1161,15 @@
         <w:rPr>
           <w:rFonts w:ascii="Times New Roman" w:hAnsi="Times New Roman" w:cs="Times New Roman"/>
         </w:rPr>
-        <w:t xml:space="preserve">Il protocollo sperimentale è stato definito per essere ripetibile. Dopo la preparazione dell'ambiente Python e l'installazione delle dipendenze, il dataset deve essere collocato nel percorso previsto. Successivamente, gli esperimenti possono essere eseguiti tramite gli script presenti in src/experiments/. Lo script run_binary.py esegue la pipeline binaria, run_multiclass.py esegue la pipeline multiclasse, run_extended.py esegue gli esperimenti aggiuntivi e run_all.py orchestra l'intero flusso.</w:t>
+        <w:t xml:space="preserve">Il protocollo sperimentale è stato definito per essere ripetibile. Dopo la preparazione dell'ambiente Python e l'installazione delle dipendenze, il dataset deve essere collocato nel percorso previsto. Successivamente, gli esperimenti possono essere eseguiti tramite gli script presenti in src/experiments/. Lo script run_binary.py esegue la baseline binaria, run_multiclass.py la baseline multiclasse e run_extended.py gli esperimenti con SMOTE, tuning, MLPClassifier e Isolation Forest.</w:t>
+      </w:r>
+    </w:p>
+    <w:p>
+      <w:r>
+        <w:rPr>
+          <w:rFonts w:ascii="Times New Roman" w:hAnsi="Times New Roman" w:cs="Times New Roman"/>
+        </w:rPr>
+        <w:t xml:space="preserve">Il nome run_all.py indica l'orchestrazione del nucleo classificativo: lo script richiama, nell'ordine, run_binary.py, run_multiclass.py, run_extended.py e generate_result_summary.py. Non richiama run_interpretability.py, run_deployment_analysis.py, export_embedded_model.py né la simulazione MQTT/Wokwi. Queste analisi sono eseguite separatamente perché presentano dipendenze, costi computazionali o ambienti di esecuzione differenti; i comandi dedicati sono documentati nel README.</w:t>
       </w:r>
     </w:p>
     <w:p>
@@ -2736,7 +2752,15 @@
         <w:rPr>
           <w:rFonts w:ascii="Times New Roman" w:hAnsi="Times New Roman" w:cs="Times New Roman"/>
         </w:rPr>
-        <w:t xml:space="preserve">È stato realizzato un dimostratore Wokwi su ESP32 per simulare l'esecuzione embedded di un modello IDS compatto. L'exporter addestra una Logistic Regression binaria su dieci feature numeriche, normalizza le variabili, quantizza i coefficienti e genera un header C++ utilizzabile nello sketch Arduino. Il modello esportato ottiene accuracy pari a 0.8180, F1-score pari a 0.8888 e Macro F1 pari a 0.6933.</w:t>
+        <w:t xml:space="preserve">È stato realizzato un dimostratore Wokwi su ESP32 per simulare l'esecuzione embedded di un modello IDS compatto. L'exporter addestra una Logistic Regression binaria su dieci feature numeriche, normalizza le variabili, quantizza coefficienti e intercetta in int16 e genera un header C++ utilizzabile nello sketch Arduino.</w:t>
+      </w:r>
+    </w:p>
+    <w:p>
+      <w:r>
+        <w:rPr>
+          <w:rFonts w:ascii="Times New Roman" w:hAnsi="Times New Roman" w:cs="Times New Roman"/>
+        </w:rPr>
+        <w:t xml:space="preserve">Per distinguere l'effetto della quantizzazione dalle prestazioni del classificatore, l'exporter valuta sul medesimo test set di 42.209 record sia la pipeline Python originale in virgola mobile sia un'emulazione Python della formula quantizzata eseguita dal firmware. Entrambe le varianti ottengono accuracy 0.8180, F1-score 0.8888 e Macro F1 0.6933. L'accordo tra le predizioni è pari al 100%; le differenze di accuracy e Macro F1 sono entrambe 0.0000. Alla scala di quantizzazione adottata, quindi, l'arrotondamento dei coefficienti non altera le classi predette su questo test set. Il confronto non misura invece consumo energetico o latenza su hardware fisico.</w:t>
       </w:r>
     </w:p>
     <w:p>
@@ -3252,7 +3276,7 @@
         <w:rPr>
           <w:rFonts w:ascii="Times New Roman" w:hAnsi="Times New Roman" w:cs="Times New Roman"/>
         </w:rPr>
-        <w:t xml:space="preserve">Bibliografia essenziale</w:t>
+        <w:t xml:space="preserve">Bibliografia</w:t>
       </w:r>
     </w:p>
     <w:p>

</xml_diff>

<commit_message>
Refine selected thesis passages
</commit_message>
<xml_diff>
--- a/thesis/final_thesis.docx
+++ b/thesis/final_thesis.docx
@@ -392,67 +392,13 @@
     </w:p>
     <w:p>
       <w:r>
-        <w:t xml:space="preserve">La metodologia consiste nella validazione dei dati, nel </w:t>
-      </w:r>
-      <w:r>
-        <w:t>preprocessing</w:t>
-      </w:r>
-      <w:r>
-        <w:t xml:space="preserve"> per prevenire la contaminazione tra </w:t>
-      </w:r>
-      <w:r>
-        <w:t>addestramento e test</w:t>
-      </w:r>
-      <w:r>
-        <w:t xml:space="preserve">, nella codifica delle variabili categoriche, nella normalizzazione insieme a uno splitting stratificato e alla valutazione tramite accuracy, precision, recall, F1-score, Macro F1 e Weighted F1. Vengono confrontati Random Forest, LightGBM, XGBoost e Logistic Regression, che funge da baseline. Sono inoltre descritti esperimenti aggiuntivi riguardanti SMOTE, la sintonizzazione degli iperparametri, MLPClassifier e le misure di Isolation Forest, l’analisi SHAP tra le architetture di modello, le misurazioni di latenza e dimensione degli artefatti </w:t>
-      </w:r>
-      <w:r>
-        <w:t>durante l</w:t>
-      </w:r>
-      <w:r>
-        <w:t>’</w:t>
-      </w:r>
-      <w:r>
-        <w:t>esecuzione</w:t>
-      </w:r>
-      <w:r>
-        <w:t xml:space="preserve"> per ciascuna delle </w:t>
-      </w:r>
-      <w:r>
-        <w:t>pipeline di apprendimento automatico</w:t>
-      </w:r>
-      <w:r>
-        <w:t xml:space="preserve"> (in particolare includendo la compressione, grazie alla sua forte relazione con </w:t>
-      </w:r>
-      <w:r>
-        <w:t>il dimostratore embedded</w:t>
-      </w:r>
-      <w:r>
-        <w:t xml:space="preserve"> simulato su ESP32 utilizzando Wokwi). I risulta</w:t>
-      </w:r>
-      <w:r>
-        <w:t>mostra</w:t>
-      </w:r>
-      <w:r>
-        <w:t xml:space="preserve">no prestazioni molto elevate per i modelli ensemble, in particolare con LightGBM che si posiziona al primo posto sia nella </w:t>
-      </w:r>
-      <w:r>
-        <w:t>baseline binaria sia in quella multiclasse</w:t>
-      </w:r>
-      <w:r>
-        <w:t xml:space="preserve">. Logistic Regression ottiene punteggi inferiori, ma offre semplicità, bassa latenza e una portabilità </w:t>
-      </w:r>
-      <w:r>
-        <w:t>più</w:t>
-      </w:r>
-      <w:r>
-        <w:t xml:space="preserve"> agevole. </w:t>
-      </w:r>
-      <w:r>
-        <w:t>Il confronto tra il modello Python e i coefficienti quantizzati evidenzia</w:t>
-      </w:r>
-      <w:r>
-        <w:t xml:space="preserve"> il prezzo pagato per la semplicità nell’implementazione embedded. La tesi conclude collegando i risultati a diverse mitigazioni come la segmentazione, l’hardening, gli aggiornamenti del firmware, l’autenticazione robusta, l’inventario degli asset e il logging, oltre ai principi di zero-trust.</w:t>
+        <w:t xml:space="preserve">La metodologia consiste nella validazione dei dati, nel preprocessing per prevenire la contaminazione tra addestramento e test, nella codifica delle variabili categoriche, nella normalizzazione insieme a uno splitting stratificato e alla valutazione tramite accuracy, precision, recall, F1-score, Macro F1 e Weighted F1. Vengono confrontati Random Forest, LightGBM, XGBoost e Logistic Regression, che funge da baseline. Sono inoltre descritti esperimenti aggiuntivi riguardanti SMOTE, la sintonizzazione degli iperparametri, MLPClassifier e le misure di Isolation Forest, l’analisi SHAP tra le architetture di modello, le misurazioni di latenza e dimensione degli artefatti durante l’esecuzione per ciascuna delle pipeline di apprendimento automatico (in particolare includendo la compressione, grazie alla sua forte relazione con il dimostratore embedded simulato su ESP32 utilizzando Wokwi). I </w:t>
+      </w:r>
+      <w:r>
+        <w:t>risultati mostrano</w:t>
+      </w:r>
+      <w:r>
+        <w:t xml:space="preserve"> prestazioni molto elevate per i modelli ensemble, in particolare con LightGBM che si posiziona al primo posto sia nella baseline binaria sia in quella multiclasse. Logistic Regression ottiene risultati inferiori rispetto ai modelli ensemble, ma rimane interessante per semplicità, bassa latenza e maggiore facilità di portabilità. Il confronto tra la pipeline Python e la versione quantizzata mostra il compromesso richiesto dall’implementazione embedded. I risultati vengono infine discussi in relazione a strategie di mitigazione quali segmentazione della rete, hardening, aggiornamenti del firmware, autenticazione robusta, inventario degli asset, logging e principi zero trust.</w:t>
       </w:r>
     </w:p>
     <w:p>
@@ -506,7 +452,7 @@
         </w:rPr>
         <w:fldChar w:fldCharType="separate"/>
       </w:r>
-      <w:hyperlink w:anchor="_Toc239064522" w:history="1">
+      <w:hyperlink w:anchor="_Toc239065746" w:history="1">
         <w:r>
           <w:rPr>
             <w:rStyle w:val="Collegamentoipertestuale"/>
@@ -533,7 +479,7 @@
             <w:noProof/>
             <w:webHidden/>
           </w:rPr>
-          <w:instrText xml:space="preserve"> PAGEREF _Toc239064522 \h </w:instrText>
+          <w:instrText xml:space="preserve"> PAGEREF _Toc239065746 \h </w:instrText>
         </w:r>
         <w:r>
           <w:rPr>
@@ -575,7 +521,7 @@
           <w:noProof/>
         </w:rPr>
       </w:pPr>
-      <w:hyperlink w:anchor="_Toc239064523" w:history="1">
+      <w:hyperlink w:anchor="_Toc239065747" w:history="1">
         <w:r>
           <w:rPr>
             <w:rStyle w:val="Collegamentoipertestuale"/>
@@ -602,7 +548,7 @@
             <w:noProof/>
             <w:webHidden/>
           </w:rPr>
-          <w:instrText xml:space="preserve"> PAGEREF _Toc239064523 \h </w:instrText>
+          <w:instrText xml:space="preserve"> PAGEREF _Toc239065747 \h </w:instrText>
         </w:r>
         <w:r>
           <w:rPr>
@@ -644,7 +590,7 @@
           <w:noProof/>
         </w:rPr>
       </w:pPr>
-      <w:hyperlink w:anchor="_Toc239064524" w:history="1">
+      <w:hyperlink w:anchor="_Toc239065748" w:history="1">
         <w:r>
           <w:rPr>
             <w:rStyle w:val="Collegamentoipertestuale"/>
@@ -671,7 +617,7 @@
             <w:noProof/>
             <w:webHidden/>
           </w:rPr>
-          <w:instrText xml:space="preserve"> PAGEREF _Toc239064524 \h </w:instrText>
+          <w:instrText xml:space="preserve"> PAGEREF _Toc239065748 \h </w:instrText>
         </w:r>
         <w:r>
           <w:rPr>
@@ -713,7 +659,7 @@
           <w:noProof/>
         </w:rPr>
       </w:pPr>
-      <w:hyperlink w:anchor="_Toc239064525" w:history="1">
+      <w:hyperlink w:anchor="_Toc239065749" w:history="1">
         <w:r>
           <w:rPr>
             <w:rStyle w:val="Collegamentoipertestuale"/>
@@ -740,7 +686,7 @@
             <w:noProof/>
             <w:webHidden/>
           </w:rPr>
-          <w:instrText xml:space="preserve"> PAGEREF _Toc239064525 \h </w:instrText>
+          <w:instrText xml:space="preserve"> PAGEREF _Toc239065749 \h </w:instrText>
         </w:r>
         <w:r>
           <w:rPr>
@@ -782,7 +728,7 @@
           <w:noProof/>
         </w:rPr>
       </w:pPr>
-      <w:hyperlink w:anchor="_Toc239064526" w:history="1">
+      <w:hyperlink w:anchor="_Toc239065750" w:history="1">
         <w:r>
           <w:rPr>
             <w:rStyle w:val="Collegamentoipertestuale"/>
@@ -809,7 +755,7 @@
             <w:noProof/>
             <w:webHidden/>
           </w:rPr>
-          <w:instrText xml:space="preserve"> PAGEREF _Toc239064526 \h </w:instrText>
+          <w:instrText xml:space="preserve"> PAGEREF _Toc239065750 \h </w:instrText>
         </w:r>
         <w:r>
           <w:rPr>
@@ -851,7 +797,7 @@
           <w:noProof/>
         </w:rPr>
       </w:pPr>
-      <w:hyperlink w:anchor="_Toc239064527" w:history="1">
+      <w:hyperlink w:anchor="_Toc239065751" w:history="1">
         <w:r>
           <w:rPr>
             <w:rStyle w:val="Collegamentoipertestuale"/>
@@ -878,7 +824,7 @@
             <w:noProof/>
             <w:webHidden/>
           </w:rPr>
-          <w:instrText xml:space="preserve"> PAGEREF _Toc239064527 \h </w:instrText>
+          <w:instrText xml:space="preserve"> PAGEREF _Toc239065751 \h </w:instrText>
         </w:r>
         <w:r>
           <w:rPr>
@@ -920,7 +866,7 @@
           <w:noProof/>
         </w:rPr>
       </w:pPr>
-      <w:hyperlink w:anchor="_Toc239064528" w:history="1">
+      <w:hyperlink w:anchor="_Toc239065752" w:history="1">
         <w:r>
           <w:rPr>
             <w:rStyle w:val="Collegamentoipertestuale"/>
@@ -947,7 +893,7 @@
             <w:noProof/>
             <w:webHidden/>
           </w:rPr>
-          <w:instrText xml:space="preserve"> PAGEREF _Toc239064528 \h </w:instrText>
+          <w:instrText xml:space="preserve"> PAGEREF _Toc239065752 \h </w:instrText>
         </w:r>
         <w:r>
           <w:rPr>
@@ -989,7 +935,7 @@
           <w:noProof/>
         </w:rPr>
       </w:pPr>
-      <w:hyperlink w:anchor="_Toc239064529" w:history="1">
+      <w:hyperlink w:anchor="_Toc239065753" w:history="1">
         <w:r>
           <w:rPr>
             <w:rStyle w:val="Collegamentoipertestuale"/>
@@ -1016,7 +962,7 @@
             <w:noProof/>
             <w:webHidden/>
           </w:rPr>
-          <w:instrText xml:space="preserve"> PAGEREF _Toc239064529 \h </w:instrText>
+          <w:instrText xml:space="preserve"> PAGEREF _Toc239065753 \h </w:instrText>
         </w:r>
         <w:r>
           <w:rPr>
@@ -1058,7 +1004,7 @@
           <w:noProof/>
         </w:rPr>
       </w:pPr>
-      <w:hyperlink w:anchor="_Toc239064530" w:history="1">
+      <w:hyperlink w:anchor="_Toc239065754" w:history="1">
         <w:r>
           <w:rPr>
             <w:rStyle w:val="Collegamentoipertestuale"/>
@@ -1085,7 +1031,7 @@
             <w:noProof/>
             <w:webHidden/>
           </w:rPr>
-          <w:instrText xml:space="preserve"> PAGEREF _Toc239064530 \h </w:instrText>
+          <w:instrText xml:space="preserve"> PAGEREF _Toc239065754 \h </w:instrText>
         </w:r>
         <w:r>
           <w:rPr>
@@ -1127,7 +1073,7 @@
           <w:noProof/>
         </w:rPr>
       </w:pPr>
-      <w:hyperlink w:anchor="_Toc239064531" w:history="1">
+      <w:hyperlink w:anchor="_Toc239065755" w:history="1">
         <w:r>
           <w:rPr>
             <w:rStyle w:val="Collegamentoipertestuale"/>
@@ -1154,7 +1100,7 @@
             <w:noProof/>
             <w:webHidden/>
           </w:rPr>
-          <w:instrText xml:space="preserve"> PAGEREF _Toc239064531 \h </w:instrText>
+          <w:instrText xml:space="preserve"> PAGEREF _Toc239065755 \h </w:instrText>
         </w:r>
         <w:r>
           <w:rPr>
@@ -1196,7 +1142,7 @@
           <w:noProof/>
         </w:rPr>
       </w:pPr>
-      <w:hyperlink w:anchor="_Toc239064532" w:history="1">
+      <w:hyperlink w:anchor="_Toc239065756" w:history="1">
         <w:r>
           <w:rPr>
             <w:rStyle w:val="Collegamentoipertestuale"/>
@@ -1223,7 +1169,7 @@
             <w:noProof/>
             <w:webHidden/>
           </w:rPr>
-          <w:instrText xml:space="preserve"> PAGEREF _Toc239064532 \h </w:instrText>
+          <w:instrText xml:space="preserve"> PAGEREF _Toc239065756 \h </w:instrText>
         </w:r>
         <w:r>
           <w:rPr>
@@ -1265,7 +1211,7 @@
           <w:noProof/>
         </w:rPr>
       </w:pPr>
-      <w:hyperlink w:anchor="_Toc239064533" w:history="1">
+      <w:hyperlink w:anchor="_Toc239065757" w:history="1">
         <w:r>
           <w:rPr>
             <w:rStyle w:val="Collegamentoipertestuale"/>
@@ -1292,7 +1238,7 @@
             <w:noProof/>
             <w:webHidden/>
           </w:rPr>
-          <w:instrText xml:space="preserve"> PAGEREF _Toc239064533 \h </w:instrText>
+          <w:instrText xml:space="preserve"> PAGEREF _Toc239065757 \h </w:instrText>
         </w:r>
         <w:r>
           <w:rPr>
@@ -1334,7 +1280,7 @@
           <w:noProof/>
         </w:rPr>
       </w:pPr>
-      <w:hyperlink w:anchor="_Toc239064534" w:history="1">
+      <w:hyperlink w:anchor="_Toc239065758" w:history="1">
         <w:r>
           <w:rPr>
             <w:rStyle w:val="Collegamentoipertestuale"/>
@@ -1361,7 +1307,7 @@
             <w:noProof/>
             <w:webHidden/>
           </w:rPr>
-          <w:instrText xml:space="preserve"> PAGEREF _Toc239064534 \h </w:instrText>
+          <w:instrText xml:space="preserve"> PAGEREF _Toc239065758 \h </w:instrText>
         </w:r>
         <w:r>
           <w:rPr>
@@ -1403,7 +1349,7 @@
           <w:noProof/>
         </w:rPr>
       </w:pPr>
-      <w:hyperlink w:anchor="_Toc239064535" w:history="1">
+      <w:hyperlink w:anchor="_Toc239065759" w:history="1">
         <w:r>
           <w:rPr>
             <w:rStyle w:val="Collegamentoipertestuale"/>
@@ -1430,7 +1376,7 @@
             <w:noProof/>
             <w:webHidden/>
           </w:rPr>
-          <w:instrText xml:space="preserve"> PAGEREF _Toc239064535 \h </w:instrText>
+          <w:instrText xml:space="preserve"> PAGEREF _Toc239065759 \h </w:instrText>
         </w:r>
         <w:r>
           <w:rPr>
@@ -1472,7 +1418,7 @@
           <w:noProof/>
         </w:rPr>
       </w:pPr>
-      <w:hyperlink w:anchor="_Toc239064536" w:history="1">
+      <w:hyperlink w:anchor="_Toc239065760" w:history="1">
         <w:r>
           <w:rPr>
             <w:rStyle w:val="Collegamentoipertestuale"/>
@@ -1499,7 +1445,7 @@
             <w:noProof/>
             <w:webHidden/>
           </w:rPr>
-          <w:instrText xml:space="preserve"> PAGEREF _Toc239064536 \h </w:instrText>
+          <w:instrText xml:space="preserve"> PAGEREF _Toc239065760 \h </w:instrText>
         </w:r>
         <w:r>
           <w:rPr>
@@ -1541,7 +1487,7 @@
           <w:noProof/>
         </w:rPr>
       </w:pPr>
-      <w:hyperlink w:anchor="_Toc239064537" w:history="1">
+      <w:hyperlink w:anchor="_Toc239065761" w:history="1">
         <w:r>
           <w:rPr>
             <w:rStyle w:val="Collegamentoipertestuale"/>
@@ -1568,7 +1514,7 @@
             <w:noProof/>
             <w:webHidden/>
           </w:rPr>
-          <w:instrText xml:space="preserve"> PAGEREF _Toc239064537 \h </w:instrText>
+          <w:instrText xml:space="preserve"> PAGEREF _Toc239065761 \h </w:instrText>
         </w:r>
         <w:r>
           <w:rPr>
@@ -1610,7 +1556,7 @@
           <w:noProof/>
         </w:rPr>
       </w:pPr>
-      <w:hyperlink w:anchor="_Toc239064538" w:history="1">
+      <w:hyperlink w:anchor="_Toc239065762" w:history="1">
         <w:r>
           <w:rPr>
             <w:rStyle w:val="Collegamentoipertestuale"/>
@@ -1637,7 +1583,7 @@
             <w:noProof/>
             <w:webHidden/>
           </w:rPr>
-          <w:instrText xml:space="preserve"> PAGEREF _Toc239064538 \h </w:instrText>
+          <w:instrText xml:space="preserve"> PAGEREF _Toc239065762 \h </w:instrText>
         </w:r>
         <w:r>
           <w:rPr>
@@ -1679,7 +1625,7 @@
           <w:noProof/>
         </w:rPr>
       </w:pPr>
-      <w:hyperlink w:anchor="_Toc239064539" w:history="1">
+      <w:hyperlink w:anchor="_Toc239065763" w:history="1">
         <w:r>
           <w:rPr>
             <w:rStyle w:val="Collegamentoipertestuale"/>
@@ -1706,7 +1652,7 @@
             <w:noProof/>
             <w:webHidden/>
           </w:rPr>
-          <w:instrText xml:space="preserve"> PAGEREF _Toc239064539 \h </w:instrText>
+          <w:instrText xml:space="preserve"> PAGEREF _Toc239065763 \h </w:instrText>
         </w:r>
         <w:r>
           <w:rPr>
@@ -1748,7 +1694,7 @@
           <w:noProof/>
         </w:rPr>
       </w:pPr>
-      <w:hyperlink w:anchor="_Toc239064540" w:history="1">
+      <w:hyperlink w:anchor="_Toc239065764" w:history="1">
         <w:r>
           <w:rPr>
             <w:rStyle w:val="Collegamentoipertestuale"/>
@@ -1775,7 +1721,7 @@
             <w:noProof/>
             <w:webHidden/>
           </w:rPr>
-          <w:instrText xml:space="preserve"> PAGEREF _Toc239064540 \h </w:instrText>
+          <w:instrText xml:space="preserve"> PAGEREF _Toc239065764 \h </w:instrText>
         </w:r>
         <w:r>
           <w:rPr>
@@ -1817,7 +1763,7 @@
           <w:noProof/>
         </w:rPr>
       </w:pPr>
-      <w:hyperlink w:anchor="_Toc239064541" w:history="1">
+      <w:hyperlink w:anchor="_Toc239065765" w:history="1">
         <w:r>
           <w:rPr>
             <w:rStyle w:val="Collegamentoipertestuale"/>
@@ -1844,7 +1790,7 @@
             <w:noProof/>
             <w:webHidden/>
           </w:rPr>
-          <w:instrText xml:space="preserve"> PAGEREF _Toc239064541 \h </w:instrText>
+          <w:instrText xml:space="preserve"> PAGEREF _Toc239065765 \h </w:instrText>
         </w:r>
         <w:r>
           <w:rPr>
@@ -1886,7 +1832,7 @@
           <w:noProof/>
         </w:rPr>
       </w:pPr>
-      <w:hyperlink w:anchor="_Toc239064542" w:history="1">
+      <w:hyperlink w:anchor="_Toc239065766" w:history="1">
         <w:r>
           <w:rPr>
             <w:rStyle w:val="Collegamentoipertestuale"/>
@@ -1913,7 +1859,7 @@
             <w:noProof/>
             <w:webHidden/>
           </w:rPr>
-          <w:instrText xml:space="preserve"> PAGEREF _Toc239064542 \h </w:instrText>
+          <w:instrText xml:space="preserve"> PAGEREF _Toc239065766 \h </w:instrText>
         </w:r>
         <w:r>
           <w:rPr>
@@ -1955,7 +1901,7 @@
           <w:noProof/>
         </w:rPr>
       </w:pPr>
-      <w:hyperlink w:anchor="_Toc239064543" w:history="1">
+      <w:hyperlink w:anchor="_Toc239065767" w:history="1">
         <w:r>
           <w:rPr>
             <w:rStyle w:val="Collegamentoipertestuale"/>
@@ -1982,7 +1928,7 @@
             <w:noProof/>
             <w:webHidden/>
           </w:rPr>
-          <w:instrText xml:space="preserve"> PAGEREF _Toc239064543 \h </w:instrText>
+          <w:instrText xml:space="preserve"> PAGEREF _Toc239065767 \h </w:instrText>
         </w:r>
         <w:r>
           <w:rPr>
@@ -2002,7 +1948,7 @@
             <w:noProof/>
             <w:webHidden/>
           </w:rPr>
-          <w:t>10</w:t>
+          <w:t>9</w:t>
         </w:r>
         <w:r>
           <w:rPr>
@@ -2024,7 +1970,7 @@
           <w:noProof/>
         </w:rPr>
       </w:pPr>
-      <w:hyperlink w:anchor="_Toc239064544" w:history="1">
+      <w:hyperlink w:anchor="_Toc239065768" w:history="1">
         <w:r>
           <w:rPr>
             <w:rStyle w:val="Collegamentoipertestuale"/>
@@ -2051,7 +1997,7 @@
             <w:noProof/>
             <w:webHidden/>
           </w:rPr>
-          <w:instrText xml:space="preserve"> PAGEREF _Toc239064544 \h </w:instrText>
+          <w:instrText xml:space="preserve"> PAGEREF _Toc239065768 \h </w:instrText>
         </w:r>
         <w:r>
           <w:rPr>
@@ -2093,7 +2039,7 @@
           <w:noProof/>
         </w:rPr>
       </w:pPr>
-      <w:hyperlink w:anchor="_Toc239064545" w:history="1">
+      <w:hyperlink w:anchor="_Toc239065769" w:history="1">
         <w:r>
           <w:rPr>
             <w:rStyle w:val="Collegamentoipertestuale"/>
@@ -2120,7 +2066,7 @@
             <w:noProof/>
             <w:webHidden/>
           </w:rPr>
-          <w:instrText xml:space="preserve"> PAGEREF _Toc239064545 \h </w:instrText>
+          <w:instrText xml:space="preserve"> PAGEREF _Toc239065769 \h </w:instrText>
         </w:r>
         <w:r>
           <w:rPr>
@@ -2162,7 +2108,7 @@
           <w:noProof/>
         </w:rPr>
       </w:pPr>
-      <w:hyperlink w:anchor="_Toc239064546" w:history="1">
+      <w:hyperlink w:anchor="_Toc239065770" w:history="1">
         <w:r>
           <w:rPr>
             <w:rStyle w:val="Collegamentoipertestuale"/>
@@ -2189,7 +2135,7 @@
             <w:noProof/>
             <w:webHidden/>
           </w:rPr>
-          <w:instrText xml:space="preserve"> PAGEREF _Toc239064546 \h </w:instrText>
+          <w:instrText xml:space="preserve"> PAGEREF _Toc239065770 \h </w:instrText>
         </w:r>
         <w:r>
           <w:rPr>
@@ -2231,7 +2177,7 @@
           <w:noProof/>
         </w:rPr>
       </w:pPr>
-      <w:hyperlink w:anchor="_Toc239064547" w:history="1">
+      <w:hyperlink w:anchor="_Toc239065771" w:history="1">
         <w:r>
           <w:rPr>
             <w:rStyle w:val="Collegamentoipertestuale"/>
@@ -2258,7 +2204,7 @@
             <w:noProof/>
             <w:webHidden/>
           </w:rPr>
-          <w:instrText xml:space="preserve"> PAGEREF _Toc239064547 \h </w:instrText>
+          <w:instrText xml:space="preserve"> PAGEREF _Toc239065771 \h </w:instrText>
         </w:r>
         <w:r>
           <w:rPr>
@@ -2300,7 +2246,7 @@
           <w:noProof/>
         </w:rPr>
       </w:pPr>
-      <w:hyperlink w:anchor="_Toc239064548" w:history="1">
+      <w:hyperlink w:anchor="_Toc239065772" w:history="1">
         <w:r>
           <w:rPr>
             <w:rStyle w:val="Collegamentoipertestuale"/>
@@ -2327,7 +2273,7 @@
             <w:noProof/>
             <w:webHidden/>
           </w:rPr>
-          <w:instrText xml:space="preserve"> PAGEREF _Toc239064548 \h </w:instrText>
+          <w:instrText xml:space="preserve"> PAGEREF _Toc239065772 \h </w:instrText>
         </w:r>
         <w:r>
           <w:rPr>
@@ -2369,7 +2315,7 @@
           <w:noProof/>
         </w:rPr>
       </w:pPr>
-      <w:hyperlink w:anchor="_Toc239064549" w:history="1">
+      <w:hyperlink w:anchor="_Toc239065773" w:history="1">
         <w:r>
           <w:rPr>
             <w:rStyle w:val="Collegamentoipertestuale"/>
@@ -2396,7 +2342,7 @@
             <w:noProof/>
             <w:webHidden/>
           </w:rPr>
-          <w:instrText xml:space="preserve"> PAGEREF _Toc239064549 \h </w:instrText>
+          <w:instrText xml:space="preserve"> PAGEREF _Toc239065773 \h </w:instrText>
         </w:r>
         <w:r>
           <w:rPr>
@@ -2438,7 +2384,7 @@
           <w:noProof/>
         </w:rPr>
       </w:pPr>
-      <w:hyperlink w:anchor="_Toc239064550" w:history="1">
+      <w:hyperlink w:anchor="_Toc239065774" w:history="1">
         <w:r>
           <w:rPr>
             <w:rStyle w:val="Collegamentoipertestuale"/>
@@ -2465,7 +2411,7 @@
             <w:noProof/>
             <w:webHidden/>
           </w:rPr>
-          <w:instrText xml:space="preserve"> PAGEREF _Toc239064550 \h </w:instrText>
+          <w:instrText xml:space="preserve"> PAGEREF _Toc239065774 \h </w:instrText>
         </w:r>
         <w:r>
           <w:rPr>
@@ -2507,7 +2453,7 @@
           <w:noProof/>
         </w:rPr>
       </w:pPr>
-      <w:hyperlink w:anchor="_Toc239064551" w:history="1">
+      <w:hyperlink w:anchor="_Toc239065775" w:history="1">
         <w:r>
           <w:rPr>
             <w:rStyle w:val="Collegamentoipertestuale"/>
@@ -2534,7 +2480,7 @@
             <w:noProof/>
             <w:webHidden/>
           </w:rPr>
-          <w:instrText xml:space="preserve"> PAGEREF _Toc239064551 \h </w:instrText>
+          <w:instrText xml:space="preserve"> PAGEREF _Toc239065775 \h </w:instrText>
         </w:r>
         <w:r>
           <w:rPr>
@@ -2576,7 +2522,7 @@
           <w:noProof/>
         </w:rPr>
       </w:pPr>
-      <w:hyperlink w:anchor="_Toc239064552" w:history="1">
+      <w:hyperlink w:anchor="_Toc239065776" w:history="1">
         <w:r>
           <w:rPr>
             <w:rStyle w:val="Collegamentoipertestuale"/>
@@ -2603,7 +2549,7 @@
             <w:noProof/>
             <w:webHidden/>
           </w:rPr>
-          <w:instrText xml:space="preserve"> PAGEREF _Toc239064552 \h </w:instrText>
+          <w:instrText xml:space="preserve"> PAGEREF _Toc239065776 \h </w:instrText>
         </w:r>
         <w:r>
           <w:rPr>
@@ -2645,7 +2591,7 @@
           <w:noProof/>
         </w:rPr>
       </w:pPr>
-      <w:hyperlink w:anchor="_Toc239064553" w:history="1">
+      <w:hyperlink w:anchor="_Toc239065777" w:history="1">
         <w:r>
           <w:rPr>
             <w:rStyle w:val="Collegamentoipertestuale"/>
@@ -2672,7 +2618,7 @@
             <w:noProof/>
             <w:webHidden/>
           </w:rPr>
-          <w:instrText xml:space="preserve"> PAGEREF _Toc239064553 \h </w:instrText>
+          <w:instrText xml:space="preserve"> PAGEREF _Toc239065777 \h </w:instrText>
         </w:r>
         <w:r>
           <w:rPr>
@@ -2714,7 +2660,7 @@
           <w:noProof/>
         </w:rPr>
       </w:pPr>
-      <w:hyperlink w:anchor="_Toc239064554" w:history="1">
+      <w:hyperlink w:anchor="_Toc239065778" w:history="1">
         <w:r>
           <w:rPr>
             <w:rStyle w:val="Collegamentoipertestuale"/>
@@ -2741,7 +2687,7 @@
             <w:noProof/>
             <w:webHidden/>
           </w:rPr>
-          <w:instrText xml:space="preserve"> PAGEREF _Toc239064554 \h </w:instrText>
+          <w:instrText xml:space="preserve"> PAGEREF _Toc239065778 \h </w:instrText>
         </w:r>
         <w:r>
           <w:rPr>
@@ -2783,7 +2729,7 @@
           <w:noProof/>
         </w:rPr>
       </w:pPr>
-      <w:hyperlink w:anchor="_Toc239064555" w:history="1">
+      <w:hyperlink w:anchor="_Toc239065779" w:history="1">
         <w:r>
           <w:rPr>
             <w:rStyle w:val="Collegamentoipertestuale"/>
@@ -2810,7 +2756,7 @@
             <w:noProof/>
             <w:webHidden/>
           </w:rPr>
-          <w:instrText xml:space="preserve"> PAGEREF _Toc239064555 \h </w:instrText>
+          <w:instrText xml:space="preserve"> PAGEREF _Toc239065779 \h </w:instrText>
         </w:r>
         <w:r>
           <w:rPr>
@@ -2852,7 +2798,7 @@
           <w:noProof/>
         </w:rPr>
       </w:pPr>
-      <w:hyperlink w:anchor="_Toc239064556" w:history="1">
+      <w:hyperlink w:anchor="_Toc239065780" w:history="1">
         <w:r>
           <w:rPr>
             <w:rStyle w:val="Collegamentoipertestuale"/>
@@ -2879,7 +2825,7 @@
             <w:noProof/>
             <w:webHidden/>
           </w:rPr>
-          <w:instrText xml:space="preserve"> PAGEREF _Toc239064556 \h </w:instrText>
+          <w:instrText xml:space="preserve"> PAGEREF _Toc239065780 \h </w:instrText>
         </w:r>
         <w:r>
           <w:rPr>
@@ -2921,7 +2867,7 @@
           <w:noProof/>
         </w:rPr>
       </w:pPr>
-      <w:hyperlink w:anchor="_Toc239064557" w:history="1">
+      <w:hyperlink w:anchor="_Toc239065781" w:history="1">
         <w:r>
           <w:rPr>
             <w:rStyle w:val="Collegamentoipertestuale"/>
@@ -2948,7 +2894,7 @@
             <w:noProof/>
             <w:webHidden/>
           </w:rPr>
-          <w:instrText xml:space="preserve"> PAGEREF _Toc239064557 \h </w:instrText>
+          <w:instrText xml:space="preserve"> PAGEREF _Toc239065781 \h </w:instrText>
         </w:r>
         <w:r>
           <w:rPr>
@@ -2990,7 +2936,7 @@
           <w:noProof/>
         </w:rPr>
       </w:pPr>
-      <w:hyperlink w:anchor="_Toc239064558" w:history="1">
+      <w:hyperlink w:anchor="_Toc239065782" w:history="1">
         <w:r>
           <w:rPr>
             <w:rStyle w:val="Collegamentoipertestuale"/>
@@ -3017,7 +2963,7 @@
             <w:noProof/>
             <w:webHidden/>
           </w:rPr>
-          <w:instrText xml:space="preserve"> PAGEREF _Toc239064558 \h </w:instrText>
+          <w:instrText xml:space="preserve"> PAGEREF _Toc239065782 \h </w:instrText>
         </w:r>
         <w:r>
           <w:rPr>
@@ -3059,7 +3005,7 @@
           <w:noProof/>
         </w:rPr>
       </w:pPr>
-      <w:hyperlink w:anchor="_Toc239064559" w:history="1">
+      <w:hyperlink w:anchor="_Toc239065783" w:history="1">
         <w:r>
           <w:rPr>
             <w:rStyle w:val="Collegamentoipertestuale"/>
@@ -3086,7 +3032,7 @@
             <w:noProof/>
             <w:webHidden/>
           </w:rPr>
-          <w:instrText xml:space="preserve"> PAGEREF _Toc239064559 \h </w:instrText>
+          <w:instrText xml:space="preserve"> PAGEREF _Toc239065783 \h </w:instrText>
         </w:r>
         <w:r>
           <w:rPr>
@@ -3128,7 +3074,7 @@
           <w:noProof/>
         </w:rPr>
       </w:pPr>
-      <w:hyperlink w:anchor="_Toc239064560" w:history="1">
+      <w:hyperlink w:anchor="_Toc239065784" w:history="1">
         <w:r>
           <w:rPr>
             <w:rStyle w:val="Collegamentoipertestuale"/>
@@ -3155,7 +3101,7 @@
             <w:noProof/>
             <w:webHidden/>
           </w:rPr>
-          <w:instrText xml:space="preserve"> PAGEREF _Toc239064560 \h </w:instrText>
+          <w:instrText xml:space="preserve"> PAGEREF _Toc239065784 \h </w:instrText>
         </w:r>
         <w:r>
           <w:rPr>
@@ -3197,7 +3143,7 @@
           <w:noProof/>
         </w:rPr>
       </w:pPr>
-      <w:hyperlink w:anchor="_Toc239064561" w:history="1">
+      <w:hyperlink w:anchor="_Toc239065785" w:history="1">
         <w:r>
           <w:rPr>
             <w:rStyle w:val="Collegamentoipertestuale"/>
@@ -3224,7 +3170,7 @@
             <w:noProof/>
             <w:webHidden/>
           </w:rPr>
-          <w:instrText xml:space="preserve"> PAGEREF _Toc239064561 \h </w:instrText>
+          <w:instrText xml:space="preserve"> PAGEREF _Toc239065785 \h </w:instrText>
         </w:r>
         <w:r>
           <w:rPr>
@@ -3266,7 +3212,7 @@
           <w:noProof/>
         </w:rPr>
       </w:pPr>
-      <w:hyperlink w:anchor="_Toc239064562" w:history="1">
+      <w:hyperlink w:anchor="_Toc239065786" w:history="1">
         <w:r>
           <w:rPr>
             <w:rStyle w:val="Collegamentoipertestuale"/>
@@ -3293,7 +3239,7 @@
             <w:noProof/>
             <w:webHidden/>
           </w:rPr>
-          <w:instrText xml:space="preserve"> PAGEREF _Toc239064562 \h </w:instrText>
+          <w:instrText xml:space="preserve"> PAGEREF _Toc239065786 \h </w:instrText>
         </w:r>
         <w:r>
           <w:rPr>
@@ -3335,7 +3281,7 @@
           <w:noProof/>
         </w:rPr>
       </w:pPr>
-      <w:hyperlink w:anchor="_Toc239064563" w:history="1">
+      <w:hyperlink w:anchor="_Toc239065787" w:history="1">
         <w:r>
           <w:rPr>
             <w:rStyle w:val="Collegamentoipertestuale"/>
@@ -3362,7 +3308,7 @@
             <w:noProof/>
             <w:webHidden/>
           </w:rPr>
-          <w:instrText xml:space="preserve"> PAGEREF _Toc239064563 \h </w:instrText>
+          <w:instrText xml:space="preserve"> PAGEREF _Toc239065787 \h </w:instrText>
         </w:r>
         <w:r>
           <w:rPr>
@@ -3404,7 +3350,7 @@
           <w:noProof/>
         </w:rPr>
       </w:pPr>
-      <w:hyperlink w:anchor="_Toc239064564" w:history="1">
+      <w:hyperlink w:anchor="_Toc239065788" w:history="1">
         <w:r>
           <w:rPr>
             <w:rStyle w:val="Collegamentoipertestuale"/>
@@ -3431,7 +3377,7 @@
             <w:noProof/>
             <w:webHidden/>
           </w:rPr>
-          <w:instrText xml:space="preserve"> PAGEREF _Toc239064564 \h </w:instrText>
+          <w:instrText xml:space="preserve"> PAGEREF _Toc239065788 \h </w:instrText>
         </w:r>
         <w:r>
           <w:rPr>
@@ -3473,7 +3419,7 @@
           <w:noProof/>
         </w:rPr>
       </w:pPr>
-      <w:hyperlink w:anchor="_Toc239064565" w:history="1">
+      <w:hyperlink w:anchor="_Toc239065789" w:history="1">
         <w:r>
           <w:rPr>
             <w:rStyle w:val="Collegamentoipertestuale"/>
@@ -3500,7 +3446,7 @@
             <w:noProof/>
             <w:webHidden/>
           </w:rPr>
-          <w:instrText xml:space="preserve"> PAGEREF _Toc239064565 \h </w:instrText>
+          <w:instrText xml:space="preserve"> PAGEREF _Toc239065789 \h </w:instrText>
         </w:r>
         <w:r>
           <w:rPr>
@@ -3542,7 +3488,7 @@
           <w:noProof/>
         </w:rPr>
       </w:pPr>
-      <w:hyperlink w:anchor="_Toc239064566" w:history="1">
+      <w:hyperlink w:anchor="_Toc239065790" w:history="1">
         <w:r>
           <w:rPr>
             <w:rStyle w:val="Collegamentoipertestuale"/>
@@ -3569,7 +3515,7 @@
             <w:noProof/>
             <w:webHidden/>
           </w:rPr>
-          <w:instrText xml:space="preserve"> PAGEREF _Toc239064566 \h </w:instrText>
+          <w:instrText xml:space="preserve"> PAGEREF _Toc239065790 \h </w:instrText>
         </w:r>
         <w:r>
           <w:rPr>
@@ -3611,7 +3557,7 @@
           <w:noProof/>
         </w:rPr>
       </w:pPr>
-      <w:hyperlink w:anchor="_Toc239064567" w:history="1">
+      <w:hyperlink w:anchor="_Toc239065791" w:history="1">
         <w:r>
           <w:rPr>
             <w:rStyle w:val="Collegamentoipertestuale"/>
@@ -3638,7 +3584,7 @@
             <w:noProof/>
             <w:webHidden/>
           </w:rPr>
-          <w:instrText xml:space="preserve"> PAGEREF _Toc239064567 \h </w:instrText>
+          <w:instrText xml:space="preserve"> PAGEREF _Toc239065791 \h </w:instrText>
         </w:r>
         <w:r>
           <w:rPr>
@@ -3680,7 +3626,7 @@
           <w:noProof/>
         </w:rPr>
       </w:pPr>
-      <w:hyperlink w:anchor="_Toc239064568" w:history="1">
+      <w:hyperlink w:anchor="_Toc239065792" w:history="1">
         <w:r>
           <w:rPr>
             <w:rStyle w:val="Collegamentoipertestuale"/>
@@ -3707,7 +3653,7 @@
             <w:noProof/>
             <w:webHidden/>
           </w:rPr>
-          <w:instrText xml:space="preserve"> PAGEREF _Toc239064568 \h </w:instrText>
+          <w:instrText xml:space="preserve"> PAGEREF _Toc239065792 \h </w:instrText>
         </w:r>
         <w:r>
           <w:rPr>
@@ -3749,7 +3695,7 @@
           <w:noProof/>
         </w:rPr>
       </w:pPr>
-      <w:hyperlink w:anchor="_Toc239064569" w:history="1">
+      <w:hyperlink w:anchor="_Toc239065793" w:history="1">
         <w:r>
           <w:rPr>
             <w:rStyle w:val="Collegamentoipertestuale"/>
@@ -3776,7 +3722,7 @@
             <w:noProof/>
             <w:webHidden/>
           </w:rPr>
-          <w:instrText xml:space="preserve"> PAGEREF _Toc239064569 \h </w:instrText>
+          <w:instrText xml:space="preserve"> PAGEREF _Toc239065793 \h </w:instrText>
         </w:r>
         <w:r>
           <w:rPr>
@@ -3818,7 +3764,7 @@
           <w:noProof/>
         </w:rPr>
       </w:pPr>
-      <w:hyperlink w:anchor="_Toc239064570" w:history="1">
+      <w:hyperlink w:anchor="_Toc239065794" w:history="1">
         <w:r>
           <w:rPr>
             <w:rStyle w:val="Collegamentoipertestuale"/>
@@ -3845,7 +3791,7 @@
             <w:noProof/>
             <w:webHidden/>
           </w:rPr>
-          <w:instrText xml:space="preserve"> PAGEREF _Toc239064570 \h </w:instrText>
+          <w:instrText xml:space="preserve"> PAGEREF _Toc239065794 \h </w:instrText>
         </w:r>
         <w:r>
           <w:rPr>
@@ -3887,7 +3833,7 @@
           <w:noProof/>
         </w:rPr>
       </w:pPr>
-      <w:hyperlink w:anchor="_Toc239064571" w:history="1">
+      <w:hyperlink w:anchor="_Toc239065795" w:history="1">
         <w:r>
           <w:rPr>
             <w:rStyle w:val="Collegamentoipertestuale"/>
@@ -3914,7 +3860,7 @@
             <w:noProof/>
             <w:webHidden/>
           </w:rPr>
-          <w:instrText xml:space="preserve"> PAGEREF _Toc239064571 \h </w:instrText>
+          <w:instrText xml:space="preserve"> PAGEREF _Toc239065795 \h </w:instrText>
         </w:r>
         <w:r>
           <w:rPr>
@@ -3956,7 +3902,7 @@
           <w:noProof/>
         </w:rPr>
       </w:pPr>
-      <w:hyperlink w:anchor="_Toc239064572" w:history="1">
+      <w:hyperlink w:anchor="_Toc239065796" w:history="1">
         <w:r>
           <w:rPr>
             <w:rStyle w:val="Collegamentoipertestuale"/>
@@ -3983,7 +3929,7 @@
             <w:noProof/>
             <w:webHidden/>
           </w:rPr>
-          <w:instrText xml:space="preserve"> PAGEREF _Toc239064572 \h </w:instrText>
+          <w:instrText xml:space="preserve"> PAGEREF _Toc239065796 \h </w:instrText>
         </w:r>
         <w:r>
           <w:rPr>
@@ -4025,7 +3971,7 @@
           <w:noProof/>
         </w:rPr>
       </w:pPr>
-      <w:hyperlink w:anchor="_Toc239064573" w:history="1">
+      <w:hyperlink w:anchor="_Toc239065797" w:history="1">
         <w:r>
           <w:rPr>
             <w:rStyle w:val="Collegamentoipertestuale"/>
@@ -4052,7 +3998,7 @@
             <w:noProof/>
             <w:webHidden/>
           </w:rPr>
-          <w:instrText xml:space="preserve"> PAGEREF _Toc239064573 \h </w:instrText>
+          <w:instrText xml:space="preserve"> PAGEREF _Toc239065797 \h </w:instrText>
         </w:r>
         <w:r>
           <w:rPr>
@@ -4094,7 +4040,7 @@
           <w:noProof/>
         </w:rPr>
       </w:pPr>
-      <w:hyperlink w:anchor="_Toc239064574" w:history="1">
+      <w:hyperlink w:anchor="_Toc239065798" w:history="1">
         <w:r>
           <w:rPr>
             <w:rStyle w:val="Collegamentoipertestuale"/>
@@ -4122,7 +4068,7 @@
             <w:noProof/>
             <w:webHidden/>
           </w:rPr>
-          <w:instrText xml:space="preserve"> PAGEREF _Toc239064574 \h </w:instrText>
+          <w:instrText xml:space="preserve"> PAGEREF _Toc239065798 \h </w:instrText>
         </w:r>
         <w:r>
           <w:rPr>
@@ -4174,7 +4120,7 @@
       <w:r>
         <w:br w:type="page"/>
       </w:r>
-      <w:bookmarkStart w:id="0" w:name="_Toc239064522"/>
+      <w:bookmarkStart w:id="0" w:name="_Toc239065746"/>
       <w:r>
         <w:lastRenderedPageBreak/>
         <w:t>Elenco delle figure</w:t>
@@ -4201,7 +4147,7 @@
       <w:r>
         <w:fldChar w:fldCharType="separate"/>
       </w:r>
-      <w:hyperlink w:anchor="_Toc239064575" w:history="1">
+      <w:hyperlink w:anchor="_Toc239065799" w:history="1">
         <w:r>
           <w:rPr>
             <w:rStyle w:val="Collegamentoipertestuale"/>
@@ -4228,7 +4174,7 @@
             <w:noProof/>
             <w:webHidden/>
           </w:rPr>
-          <w:instrText xml:space="preserve"> PAGEREF _Toc239064575 \h </w:instrText>
+          <w:instrText xml:space="preserve"> PAGEREF _Toc239065799 \h </w:instrText>
         </w:r>
         <w:r>
           <w:rPr>
@@ -4270,7 +4216,7 @@
           <w:noProof/>
         </w:rPr>
       </w:pPr>
-      <w:hyperlink w:anchor="_Toc239064576" w:history="1">
+      <w:hyperlink w:anchor="_Toc239065800" w:history="1">
         <w:r>
           <w:rPr>
             <w:rStyle w:val="Collegamentoipertestuale"/>
@@ -4297,7 +4243,7 @@
             <w:noProof/>
             <w:webHidden/>
           </w:rPr>
-          <w:instrText xml:space="preserve"> PAGEREF _Toc239064576 \h </w:instrText>
+          <w:instrText xml:space="preserve"> PAGEREF _Toc239065800 \h </w:instrText>
         </w:r>
         <w:r>
           <w:rPr>
@@ -4339,7 +4285,7 @@
           <w:noProof/>
         </w:rPr>
       </w:pPr>
-      <w:hyperlink w:anchor="_Toc239064577" w:history="1">
+      <w:hyperlink w:anchor="_Toc239065801" w:history="1">
         <w:r>
           <w:rPr>
             <w:rStyle w:val="Collegamentoipertestuale"/>
@@ -4366,7 +4312,7 @@
             <w:noProof/>
             <w:webHidden/>
           </w:rPr>
-          <w:instrText xml:space="preserve"> PAGEREF _Toc239064577 \h </w:instrText>
+          <w:instrText xml:space="preserve"> PAGEREF _Toc239065801 \h </w:instrText>
         </w:r>
         <w:r>
           <w:rPr>
@@ -4408,7 +4354,7 @@
           <w:noProof/>
         </w:rPr>
       </w:pPr>
-      <w:hyperlink w:anchor="_Toc239064578" w:history="1">
+      <w:hyperlink w:anchor="_Toc239065802" w:history="1">
         <w:r>
           <w:rPr>
             <w:rStyle w:val="Collegamentoipertestuale"/>
@@ -4435,7 +4381,7 @@
             <w:noProof/>
             <w:webHidden/>
           </w:rPr>
-          <w:instrText xml:space="preserve"> PAGEREF _Toc239064578 \h </w:instrText>
+          <w:instrText xml:space="preserve"> PAGEREF _Toc239065802 \h </w:instrText>
         </w:r>
         <w:r>
           <w:rPr>
@@ -4477,7 +4423,7 @@
           <w:noProof/>
         </w:rPr>
       </w:pPr>
-      <w:hyperlink w:anchor="_Toc239064579" w:history="1">
+      <w:hyperlink w:anchor="_Toc239065803" w:history="1">
         <w:r>
           <w:rPr>
             <w:rStyle w:val="Collegamentoipertestuale"/>
@@ -4504,7 +4450,7 @@
             <w:noProof/>
             <w:webHidden/>
           </w:rPr>
-          <w:instrText xml:space="preserve"> PAGEREF _Toc239064579 \h </w:instrText>
+          <w:instrText xml:space="preserve"> PAGEREF _Toc239065803 \h </w:instrText>
         </w:r>
         <w:r>
           <w:rPr>
@@ -4546,7 +4492,7 @@
           <w:noProof/>
         </w:rPr>
       </w:pPr>
-      <w:hyperlink w:anchor="_Toc239064580" w:history="1">
+      <w:hyperlink w:anchor="_Toc239065804" w:history="1">
         <w:r>
           <w:rPr>
             <w:rStyle w:val="Collegamentoipertestuale"/>
@@ -4573,7 +4519,7 @@
             <w:noProof/>
             <w:webHidden/>
           </w:rPr>
-          <w:instrText xml:space="preserve"> PAGEREF _Toc239064580 \h </w:instrText>
+          <w:instrText xml:space="preserve"> PAGEREF _Toc239065804 \h </w:instrText>
         </w:r>
         <w:r>
           <w:rPr>
@@ -4615,7 +4561,7 @@
           <w:noProof/>
         </w:rPr>
       </w:pPr>
-      <w:hyperlink w:anchor="_Toc239064581" w:history="1">
+      <w:hyperlink w:anchor="_Toc239065805" w:history="1">
         <w:r>
           <w:rPr>
             <w:rStyle w:val="Collegamentoipertestuale"/>
@@ -4642,7 +4588,7 @@
             <w:noProof/>
             <w:webHidden/>
           </w:rPr>
-          <w:instrText xml:space="preserve"> PAGEREF _Toc239064581 \h </w:instrText>
+          <w:instrText xml:space="preserve"> PAGEREF _Toc239065805 \h </w:instrText>
         </w:r>
         <w:r>
           <w:rPr>
@@ -4684,7 +4630,7 @@
           <w:noProof/>
         </w:rPr>
       </w:pPr>
-      <w:hyperlink w:anchor="_Toc239064582" w:history="1">
+      <w:hyperlink w:anchor="_Toc239065806" w:history="1">
         <w:r>
           <w:rPr>
             <w:rStyle w:val="Collegamentoipertestuale"/>
@@ -4711,7 +4657,7 @@
             <w:noProof/>
             <w:webHidden/>
           </w:rPr>
-          <w:instrText xml:space="preserve"> PAGEREF _Toc239064582 \h </w:instrText>
+          <w:instrText xml:space="preserve"> PAGEREF _Toc239065806 \h </w:instrText>
         </w:r>
         <w:r>
           <w:rPr>
@@ -4753,7 +4699,7 @@
           <w:noProof/>
         </w:rPr>
       </w:pPr>
-      <w:hyperlink w:anchor="_Toc239064583" w:history="1">
+      <w:hyperlink w:anchor="_Toc239065807" w:history="1">
         <w:r>
           <w:rPr>
             <w:rStyle w:val="Collegamentoipertestuale"/>
@@ -4780,7 +4726,7 @@
             <w:noProof/>
             <w:webHidden/>
           </w:rPr>
-          <w:instrText xml:space="preserve"> PAGEREF _Toc239064583 \h </w:instrText>
+          <w:instrText xml:space="preserve"> PAGEREF _Toc239065807 \h </w:instrText>
         </w:r>
         <w:r>
           <w:rPr>
@@ -4822,7 +4768,7 @@
           <w:noProof/>
         </w:rPr>
       </w:pPr>
-      <w:hyperlink w:anchor="_Toc239064584" w:history="1">
+      <w:hyperlink w:anchor="_Toc239065808" w:history="1">
         <w:r>
           <w:rPr>
             <w:rStyle w:val="Collegamentoipertestuale"/>
@@ -4849,7 +4795,7 @@
             <w:noProof/>
             <w:webHidden/>
           </w:rPr>
-          <w:instrText xml:space="preserve"> PAGEREF _Toc239064584 \h </w:instrText>
+          <w:instrText xml:space="preserve"> PAGEREF _Toc239065808 \h </w:instrText>
         </w:r>
         <w:r>
           <w:rPr>
@@ -4891,7 +4837,7 @@
           <w:noProof/>
         </w:rPr>
       </w:pPr>
-      <w:hyperlink w:anchor="_Toc239064585" w:history="1">
+      <w:hyperlink w:anchor="_Toc239065809" w:history="1">
         <w:r>
           <w:rPr>
             <w:rStyle w:val="Collegamentoipertestuale"/>
@@ -4918,7 +4864,7 @@
             <w:noProof/>
             <w:webHidden/>
           </w:rPr>
-          <w:instrText xml:space="preserve"> PAGEREF _Toc239064585 \h </w:instrText>
+          <w:instrText xml:space="preserve"> PAGEREF _Toc239065809 \h </w:instrText>
         </w:r>
         <w:r>
           <w:rPr>
@@ -4960,7 +4906,7 @@
           <w:noProof/>
         </w:rPr>
       </w:pPr>
-      <w:hyperlink w:anchor="_Toc239064586" w:history="1">
+      <w:hyperlink w:anchor="_Toc239065810" w:history="1">
         <w:r>
           <w:rPr>
             <w:rStyle w:val="Collegamentoipertestuale"/>
@@ -4987,7 +4933,7 @@
             <w:noProof/>
             <w:webHidden/>
           </w:rPr>
-          <w:instrText xml:space="preserve"> PAGEREF _Toc239064586 \h </w:instrText>
+          <w:instrText xml:space="preserve"> PAGEREF _Toc239065810 \h </w:instrText>
         </w:r>
         <w:r>
           <w:rPr>
@@ -5029,7 +4975,7 @@
           <w:noProof/>
         </w:rPr>
       </w:pPr>
-      <w:hyperlink w:anchor="_Toc239064587" w:history="1">
+      <w:hyperlink w:anchor="_Toc239065811" w:history="1">
         <w:r>
           <w:rPr>
             <w:rStyle w:val="Collegamentoipertestuale"/>
@@ -5056,7 +5002,7 @@
             <w:noProof/>
             <w:webHidden/>
           </w:rPr>
-          <w:instrText xml:space="preserve"> PAGEREF _Toc239064587 \h </w:instrText>
+          <w:instrText xml:space="preserve"> PAGEREF _Toc239065811 \h </w:instrText>
         </w:r>
         <w:r>
           <w:rPr>
@@ -5098,7 +5044,7 @@
           <w:noProof/>
         </w:rPr>
       </w:pPr>
-      <w:hyperlink w:anchor="_Toc239064588" w:history="1">
+      <w:hyperlink w:anchor="_Toc239065812" w:history="1">
         <w:r>
           <w:rPr>
             <w:rStyle w:val="Collegamentoipertestuale"/>
@@ -5125,7 +5071,7 @@
             <w:noProof/>
             <w:webHidden/>
           </w:rPr>
-          <w:instrText xml:space="preserve"> PAGEREF _Toc239064588 \h </w:instrText>
+          <w:instrText xml:space="preserve"> PAGEREF _Toc239065812 \h </w:instrText>
         </w:r>
         <w:r>
           <w:rPr>
@@ -5171,7 +5117,7 @@
       <w:r>
         <w:br w:type="page"/>
       </w:r>
-      <w:bookmarkStart w:id="1" w:name="_Toc239064523"/>
+      <w:bookmarkStart w:id="1" w:name="_Toc239065747"/>
       <w:r>
         <w:lastRenderedPageBreak/>
         <w:t>Elenco delle tabelle</w:t>
@@ -5198,7 +5144,7 @@
       <w:r>
         <w:fldChar w:fldCharType="separate"/>
       </w:r>
-      <w:hyperlink w:anchor="_Toc239064589" w:history="1">
+      <w:hyperlink w:anchor="_Toc239065813" w:history="1">
         <w:r>
           <w:rPr>
             <w:rStyle w:val="Collegamentoipertestuale"/>
@@ -5225,7 +5171,7 @@
             <w:noProof/>
             <w:webHidden/>
           </w:rPr>
-          <w:instrText xml:space="preserve"> PAGEREF _Toc239064589 \h </w:instrText>
+          <w:instrText xml:space="preserve"> PAGEREF _Toc239065813 \h </w:instrText>
         </w:r>
         <w:r>
           <w:rPr>
@@ -5267,7 +5213,7 @@
           <w:noProof/>
         </w:rPr>
       </w:pPr>
-      <w:hyperlink w:anchor="_Toc239064590" w:history="1">
+      <w:hyperlink w:anchor="_Toc239065814" w:history="1">
         <w:r>
           <w:rPr>
             <w:rStyle w:val="Collegamentoipertestuale"/>
@@ -5294,7 +5240,7 @@
             <w:noProof/>
             <w:webHidden/>
           </w:rPr>
-          <w:instrText xml:space="preserve"> PAGEREF _Toc239064590 \h </w:instrText>
+          <w:instrText xml:space="preserve"> PAGEREF _Toc239065814 \h </w:instrText>
         </w:r>
         <w:r>
           <w:rPr>
@@ -5355,7 +5301,7 @@
       <w:pPr>
         <w:pStyle w:val="Titolo1"/>
       </w:pPr>
-      <w:bookmarkStart w:id="2" w:name="_Toc239064524"/>
+      <w:bookmarkStart w:id="2" w:name="_Toc239065748"/>
       <w:r>
         <w:lastRenderedPageBreak/>
         <w:t>Capitolo 1 - Introduzione</w:t>
@@ -5366,7 +5312,7 @@
       <w:pPr>
         <w:pStyle w:val="Titolo2"/>
       </w:pPr>
-      <w:bookmarkStart w:id="3" w:name="_Toc239064525"/>
+      <w:bookmarkStart w:id="3" w:name="_Toc239065749"/>
       <w:r>
         <w:t>1.1 Contesto dei sistemi Internet of Things</w:t>
       </w:r>
@@ -5397,7 +5343,7 @@
       <w:pPr>
         <w:pStyle w:val="Titolo2"/>
       </w:pPr>
-      <w:bookmarkStart w:id="4" w:name="_Toc239064526"/>
+      <w:bookmarkStart w:id="4" w:name="_Toc239065750"/>
       <w:r>
         <w:t xml:space="preserve">1.2 </w:t>
       </w:r>
@@ -5440,20 +5386,14 @@
     </w:p>
     <w:p>
       <w:r>
-        <w:t>Questo porta a una crescita delle superfici di pressione non solo in termini quantitativi, ma anche qualitativi. Un dispositivo IoT compromesso può fungere da trampolino di lancio per un attaccante per muoversi lateralmente nella rete, agire come nodo di botnet</w:t>
-      </w:r>
-      <w:r>
-        <w:t xml:space="preserve">, </w:t>
-      </w:r>
-      <w:r>
-        <w:t>generando traffico reciproco dannoso o diventando uno strumento per manomettere dati fisici. In sistemi industriali, ciò significherebbe continuità operativa compromessa; in sistemi sanitari, riservatezza e sicurezza del paziente compromesse; in contesti di infrastrutture cittadine, servizi pubblici compromessi.</w:t>
+        <w:t>Di conseguenza, la superficie di attacco cresce non solo per il numero di dispositivi coinvolti, ma anche per la varietà delle possibili vulnerabilità. Un dispositivo IoT compromesso può consentire a un attaccante di muoversi lateralmente nella rete, partecipare a una botnet, generare traffico dannoso o alterare dati provenienti dal mondo fisico. In ambito industriale ciò può compromettere la continuità operativa; in ambito sanitario può incidere sulla riservatezza dei dati e sulla sicurezza del paziente; nelle infrastrutture urbane può influire sulla disponibilità dei servizi pubblici.</w:t>
       </w:r>
     </w:p>
     <w:p>
       <w:pPr>
         <w:pStyle w:val="Titolo2"/>
       </w:pPr>
-      <w:bookmarkStart w:id="5" w:name="_Toc239064527"/>
+      <w:bookmarkStart w:id="5" w:name="_Toc239065751"/>
       <w:r>
         <w:t>1.3 Problema della sicurezza IoT</w:t>
       </w:r>
@@ -5479,7 +5419,7 @@
       <w:pPr>
         <w:pStyle w:val="Titolo2"/>
       </w:pPr>
-      <w:bookmarkStart w:id="6" w:name="_Toc239064528"/>
+      <w:bookmarkStart w:id="6" w:name="_Toc239065752"/>
       <w:r>
         <w:t>1.4 Obiettivo e contributo della tesi</w:t>
       </w:r>
@@ -5487,67 +5427,19 @@
     </w:p>
     <w:p>
       <w:r>
-        <w:t xml:space="preserve">Lo scopo della tesi è creare, applicare e documentare una pipeline sperimentale per l’uso di modelli di machine learning nell’intrusion detection in ambienti IoT. Inizia analizzando la struttura del repository di riferimento </w:t>
-      </w:r>
-      <w:r>
-        <w:t>indicata dal relatore</w:t>
-      </w:r>
-      <w:r>
-        <w:t xml:space="preserve"> e replica la sua pipeline principale, riorganizzando</w:t>
-      </w:r>
-      <w:r>
-        <w:t>ne</w:t>
-      </w:r>
-      <w:r>
-        <w:t xml:space="preserve"> anche il </w:t>
-      </w:r>
-      <w:r>
-        <w:t>codice sorgente</w:t>
-      </w:r>
-      <w:r>
-        <w:t xml:space="preserve"> e la documentazione in modo </w:t>
-      </w:r>
-      <w:r>
-        <w:t>più</w:t>
-      </w:r>
-      <w:r>
-        <w:t xml:space="preserve"> adeguato a un progetto di tesi. Il contributo sperimentale è quindi stratificato. </w:t>
-      </w:r>
-      <w:r>
-        <w:t>Il primo livello riproduce la baseline: elaborazione del dataset TON_IoT, classificazione binaria e multiclasse, addestramento dei modelli principali e generazione delle metriche.</w:t>
-      </w:r>
-      <w:r>
-        <w:t xml:space="preserve"> Il secondo livello aumenta esponenzialmente l’area di lavoro sperimentale definita da alcune estensioni estensive: SMOTE, ottimizzazione degli iperparametri, MLPClassifier e Isolation Forest. L’ultimo livello riguarda l</w:t>
-      </w:r>
-      <w:r>
-        <w:t>’</w:t>
-      </w:r>
-      <w:r>
-        <w:t xml:space="preserve">interpretabilità e la messa in produzione, che include l’importanza delle feature, le misurazioni della latenza, la </w:t>
-      </w:r>
-      <w:r>
-        <w:t>quantizzazione degli artefatti del modello</w:t>
-      </w:r>
-      <w:r>
-        <w:t xml:space="preserve"> e una dimostrazione embedded simulata in Wokwi.</w:t>
-      </w:r>
-    </w:p>
-    <w:p>
-      <w:r>
-        <w:t xml:space="preserve">L’obiettivo non è fornire un IDS pronto all’uso da distribuire </w:t>
-      </w:r>
-      <w:r>
-        <w:t>in una rete reale</w:t>
-      </w:r>
-      <w:r>
-        <w:t xml:space="preserve">, ma piuttosto stabilire un framework sperimentale che possa essere riproducibile e tecnicamente verificabile. Tutte le metriche riportate sono ottenute eseguendo il codice e vengono registrate nei file CSV generati dagli script. </w:t>
+        <w:t>Lo scopo della tesi è creare, applicare e documentare una pipeline sperimentale per l’uso di modelli di machine learning nell’intrusion detection in ambienti IoT. Il lavoro parte dall’analisi del repository di riferimento indicato dal relatore e dalla riproduzione della relativa pipeline principale. Il codice e la documentazione sono stati riorganizzati per adattarli al contesto di una tesi sperimentale. Il contributo è articolato in tre livelli. Il primo riguarda la riproduzione della baseline: elaborazione del dataset TON_IoT, classificazione binaria e multiclasse, addestramento dei modelli principali e generazione delle metriche. Il secondo amplia il confronto tramite SMOTE, ottimizzazione degli iperparametri, MLPClassifier e Isolation Forest. Il terzo riguarda interpretabilità e portabilità, includendo importanza delle feature, misure di latenza, quantizzazione del modello e un dimostratore embedded simulato in Wokwi.</w:t>
+      </w:r>
+    </w:p>
+    <w:p>
+      <w:r>
+        <w:t>L’obiettivo non è realizzare un IDS pronto per il deployment in una rete reale, ma costruire un framework sperimentale riproducibile e verificabile dal punto di vista tecnico. Tutte le metriche riportate sono ottenute eseguendo il codice e vengono registrate nei file CSV generati dagli script.</w:t>
       </w:r>
     </w:p>
     <w:p>
       <w:pPr>
         <w:pStyle w:val="Titolo2"/>
       </w:pPr>
-      <w:bookmarkStart w:id="7" w:name="_Toc239064529"/>
+      <w:bookmarkStart w:id="7" w:name="_Toc239065753"/>
       <w:r>
         <w:t>1.5 Struttura dell'elaborato</w:t>
       </w:r>
@@ -5563,7 +5455,7 @@
         <w:pStyle w:val="Titolo1"/>
         <w:pageBreakBefore/>
       </w:pPr>
-      <w:bookmarkStart w:id="8" w:name="_Toc239064530"/>
+      <w:bookmarkStart w:id="8" w:name="_Toc239065754"/>
       <w:r>
         <w:lastRenderedPageBreak/>
         <w:t>Capitolo 2 - Stato dell'arte</w:t>
@@ -5574,7 +5466,7 @@
       <w:pPr>
         <w:pStyle w:val="Titolo2"/>
       </w:pPr>
-      <w:bookmarkStart w:id="9" w:name="_Toc239064531"/>
+      <w:bookmarkStart w:id="9" w:name="_Toc239065755"/>
       <w:r>
         <w:t>2.1 Architetture IoT</w:t>
       </w:r>
@@ -5656,7 +5548,7 @@
       <w:pPr>
         <w:pStyle w:val="Titolo2"/>
       </w:pPr>
-      <w:bookmarkStart w:id="10" w:name="_Toc239064532"/>
+      <w:bookmarkStart w:id="10" w:name="_Toc239065756"/>
       <w:r>
         <w:t>2.2 Protocolli e comunicazione</w:t>
       </w:r>
@@ -5664,7 +5556,7 @@
     </w:p>
     <w:p>
       <w:r>
-        <w:t>I sistemi IoT possono utilizzare protocolli diversi a seconda dei requisiti di consumo energetico, portata, latenza e affidabilità. Wi-Fi ed Ethernet sono comuni in ambienti domestici e industriali; Bluetooth Low Energy è usato per dispositivi a corto raggio; Zigbee e Thread sono diffusi in reti mesh; LoRaWAN è adatto a comunicazioni a lunga distanza con basso consumo; MQTT è ampiamente usato come protocollo applicativo publish/subscribe.</w:t>
+        <w:t>I sistemi IoT utilizzano protocolli diversi in base ai requisiti di consumo energetico, portata, latenza e affidabilità. Wi-Fi ed Ethernet sono comuni negli ambienti domestici e industriali; Bluetooth Low Energy è adatto alle comunicazioni a corto raggio; Zigbee e Thread sono diffusi nelle reti mesh; LoRaWAN consente comunicazioni a lunga distanza con basso consumo energetico; MQTT è ampiamente utilizzato come protocollo applicativo basato sul modello publish/subscribe.</w:t>
       </w:r>
     </w:p>
     <w:p>
@@ -5686,7 +5578,7 @@
       <w:pPr>
         <w:pStyle w:val="Titolo2"/>
       </w:pPr>
-      <w:bookmarkStart w:id="11" w:name="_Toc239064533"/>
+      <w:bookmarkStart w:id="11" w:name="_Toc239065757"/>
       <w:r>
         <w:t>2.3 Vulnerabilità tipiche</w:t>
       </w:r>
@@ -5694,119 +5586,14 @@
     </w:p>
     <w:p>
       <w:r>
-        <w:t>Scarse</w:t>
-      </w:r>
-      <w:r>
-        <w:t>“</w:t>
-      </w:r>
-      <w:r>
-        <w:t>scarse</w:t>
-      </w:r>
-      <w:r>
-        <w:t>”</w:t>
-      </w:r>
-      <w:r>
-        <w:t xml:space="preserve"> (deboli </w:t>
-      </w:r>
-      <w:r>
-        <w:t>o</w:t>
-      </w:r>
-      <w:r>
-        <w:t xml:space="preserve"> predefinite) </w:t>
-      </w:r>
-      <w:r>
-        <w:t>sono</w:t>
-      </w:r>
-      <w:r>
-        <w:t xml:space="preserve"> una delle cause </w:t>
-      </w:r>
-      <w:r>
-        <w:t>più</w:t>
-      </w:r>
-      <w:r>
-        <w:t xml:space="preserve"> comuni di vulnerabilità in un sistema IoT</w:t>
-      </w:r>
-      <w:r>
-        <w:t xml:space="preserve"> insieme a:</w:t>
-      </w:r>
-      <w:r>
-        <w:t xml:space="preserve"> s</w:t>
-      </w:r>
-      <w:r>
-        <w:t>ervizi non necessari abilitati</w:t>
-      </w:r>
-      <w:r>
-        <w:t>,</w:t>
-      </w:r>
-      <w:r>
-        <w:t xml:space="preserve"> </w:t>
-      </w:r>
-      <w:r>
-        <w:t>f</w:t>
-      </w:r>
-      <w:r>
-        <w:t>irmware obsoleto</w:t>
-      </w:r>
-      <w:r>
-        <w:t>,</w:t>
-      </w:r>
-      <w:r>
-        <w:t xml:space="preserve"> </w:t>
-      </w:r>
-      <w:r>
-        <w:t>l’assenza di cifratura</w:t>
-      </w:r>
-      <w:r>
-        <w:t>, una g</w:t>
-      </w:r>
-      <w:r>
-        <w:t>estione delle chiavi inadeguata</w:t>
-      </w:r>
-      <w:r>
-        <w:t xml:space="preserve">, </w:t>
-      </w:r>
-      <w:r>
-        <w:t>API non protette</w:t>
-      </w:r>
-      <w:r>
-        <w:t xml:space="preserve"> e una</w:t>
-      </w:r>
-      <w:r>
-        <w:t xml:space="preserve"> </w:t>
-      </w:r>
-      <w:r>
-        <w:t>c</w:t>
-      </w:r>
-      <w:r>
-        <w:t xml:space="preserve">onfigurazione cloud </w:t>
-      </w:r>
-      <w:r>
-        <w:t xml:space="preserve">insufficiente. </w:t>
-      </w:r>
-      <w:r>
-        <w:t xml:space="preserve">Queste vulnerabilità non esistono in modo isolato: spesso si combinano tra loro per formare vettori di attacco [3], [15], [17]. </w:t>
-      </w:r>
-      <w:r>
-        <w:t xml:space="preserve">Un esempio comune </w:t>
-      </w:r>
-      <w:r>
-        <w:t>È</w:t>
-      </w:r>
-      <w:r>
-        <w:t xml:space="preserve"> un dispositivo esposto alla rete con nomi utente e password predefiniti. Dopo l’accesso, l’attaccante può modificare le impostazioni, caricare malware o usare il dispositivo per generare traffico verso altre vittime. Una volta che un attaccante ottiene un punto d’appoggio nella rete, quel dispositivo compromesso può fungere da </w:t>
-      </w:r>
-      <w:r>
-        <w:t>punto di accesso</w:t>
-      </w:r>
-      <w:r>
-        <w:t xml:space="preserve"> verso i sistemi principali se la rete non è segmentata. Senza registrazione centralizzata, questo attacco può passare inosservato. Il firmware obsoleto è un altro rischio. Molti dispositivi restano senza patch per vari motivi, anche quando il produttore pubblica e corregge una vulnerabilità, a causa dell’assenza di procedure automatiche, della paura di interruzioni del servizio o perché non viene eseguita alcuna manutenzione. A volte, in contesti industriali possono esserci preoccupazioni di continuità operativa che limitano la possibilità di applicare rapidamente le patch.</w:t>
+        <w:t>Le credenziali deboli o predefinite rappresentano una delle cause più comuni di vulnerabilità nei sistemi IoT, insieme a servizi non necessari abilitati, firmware obsoleto, assenza di cifratura, gestione inadeguata delle chiavi, API non protette e configurazioni cloud insufficienti. Queste vulnerabilità non agiscono in modo isolato, ma possono combinarsi tra loro e creare vettori di attacco [3], [15], [17]. Un caso frequente riguarda un dispositivo esposto in rete con credenziali predefinite. Dopo aver ottenuto l’accesso, un attaccante può modificare la configurazione, installare malware oppure utilizzare il dispositivo per generare traffico verso altri sistemi. Se la rete non è segmentata, il dispositivo compromesso può diventare un punto di accesso ai sistemi principali. In assenza di registrazione centralizzata degli eventi, l’attacco può rimanere inosservato. Il firmware obsoleto costituisce un ulteriore rischio: molti dispositivi restano senza patch anche dopo la pubblicazione di correzioni da parte del produttore, a causa dell’assenza di procedure automatiche, del timore di interruzioni del servizio o della mancanza di manutenzione. In ambito industriale, esigenze di continuità operativa possono inoltre ritardare l’applicazione delle patch.</w:t>
       </w:r>
     </w:p>
     <w:p>
       <w:pPr>
         <w:pStyle w:val="Titolo2"/>
       </w:pPr>
-      <w:bookmarkStart w:id="12" w:name="_Toc239064534"/>
+      <w:bookmarkStart w:id="12" w:name="_Toc239065758"/>
       <w:r>
         <w:t xml:space="preserve">2.4 </w:t>
       </w:r>
@@ -5839,7 +5626,7 @@
       <w:pPr>
         <w:pStyle w:val="Titolo2"/>
       </w:pPr>
-      <w:bookmarkStart w:id="13" w:name="_Toc239064535"/>
+      <w:bookmarkStart w:id="13" w:name="_Toc239065759"/>
       <w:r>
         <w:lastRenderedPageBreak/>
         <w:t xml:space="preserve">2.5 </w:t>
@@ -5870,7 +5657,7 @@
       <w:pPr>
         <w:pStyle w:val="Titolo2"/>
       </w:pPr>
-      <w:bookmarkStart w:id="14" w:name="_Toc239064536"/>
+      <w:bookmarkStart w:id="14" w:name="_Toc239065760"/>
       <w:r>
         <w:t>2.6 Machine learning applicato agli IDS</w:t>
       </w:r>
@@ -5951,7 +5738,7 @@
       <w:pPr>
         <w:pStyle w:val="Titolo2"/>
       </w:pPr>
-      <w:bookmarkStart w:id="15" w:name="_Toc239064537"/>
+      <w:bookmarkStart w:id="15" w:name="_Toc239065761"/>
       <w:r>
         <w:lastRenderedPageBreak/>
         <w:t>2.7 Requisiti di sicurezza in un ambiente IoT</w:t>
@@ -6011,7 +5798,7 @@
       <w:pPr>
         <w:pStyle w:val="Titolo2"/>
       </w:pPr>
-      <w:bookmarkStart w:id="16" w:name="_Toc239064538"/>
+      <w:bookmarkStart w:id="16" w:name="_Toc239065762"/>
       <w:r>
         <w:t>2.8 IDS in architetture edge e cloud</w:t>
       </w:r>
@@ -6070,7 +5857,7 @@
       <w:pPr>
         <w:pStyle w:val="Titolo2"/>
       </w:pPr>
-      <w:bookmarkStart w:id="17" w:name="_Toc239064539"/>
+      <w:bookmarkStart w:id="17" w:name="_Toc239065763"/>
       <w:r>
         <w:t>2.9 Difficoltà specifiche del machine learning per la sicurezza</w:t>
       </w:r>
@@ -6108,7 +5895,7 @@
         <w:pStyle w:val="Titolo1"/>
         <w:pageBreakBefore/>
       </w:pPr>
-      <w:bookmarkStart w:id="18" w:name="_Toc239064540"/>
+      <w:bookmarkStart w:id="18" w:name="_Toc239065764"/>
       <w:r>
         <w:lastRenderedPageBreak/>
         <w:t>Capitolo 3 - Metodologia</w:t>
@@ -6119,7 +5906,7 @@
       <w:pPr>
         <w:pStyle w:val="Titolo2"/>
       </w:pPr>
-      <w:bookmarkStart w:id="19" w:name="_Toc239064541"/>
+      <w:bookmarkStart w:id="19" w:name="_Toc239065765"/>
       <w:r>
         <w:t>3.1 Organizzazione del repository</w:t>
       </w:r>
@@ -6127,185 +5914,167 @@
     </w:p>
     <w:p>
       <w:r>
-        <w:t xml:space="preserve">Non solo questi esperimenti possono essere riprodotti, ma sono stati documentati e organizzati in questo repository in modo che i risultati siano facilmente verificabili. Questo ne organizza le configurazioni, i dati, il codice sorgente, </w:t>
-      </w:r>
-      <w:r>
-        <w:t>gli script</w:t>
-      </w:r>
-      <w:r>
-        <w:t xml:space="preserve">, la documentazione dei risultati, della tesi e infine la dimostrazione Wokwi. Questa separazione rende </w:t>
+        <w:t>Il repository organizza configurazioni, dati, codice sorgente, script, documentazione dei risultati, tesi e dimostratore Wokwi. Questa separazione evita la confusione tra dati grezzi, artefatti generati e codice. La cartella config/ contiene il file YAML con percorsi e parametri sperimentali; data/raw/ ospita il dataset scaricato manualmente, mentre data/processed/ può contenere dati trasformati. La directory src/ include i moduli Python per caricamento dei dati, preprocessing, addestramento, valutazione, visualizzazione, esperimenti e simulazione. La directory results/ raccoglie metriche, grafici, modelli e log. La documentazione accademica in italiano è contenuta in thesis/.</w:t>
+      </w:r>
+    </w:p>
+    <w:p>
+      <w:r>
+        <w:t>Questa configurazione evita l’uso di percorsi assoluti e consente di eseguire gli script dalla directory principale del repository. I file di grandi dimensioni e gli artefatti non adatti al versionamento sono esclusi tramite .gitignore.</w:t>
+      </w:r>
+    </w:p>
+    <w:p>
+      <w:pPr>
+        <w:pStyle w:val="Titolo2"/>
+      </w:pPr>
+      <w:bookmarkStart w:id="20" w:name="_Toc239065766"/>
+      <w:r>
+        <w:t>3.2 Dataset utilizzato</w:t>
+      </w:r>
+      <w:bookmarkEnd w:id="20"/>
+      <w:r>
+        <w:tab/>
+      </w:r>
+    </w:p>
+    <w:p>
+      <w:r>
+        <w:t>‎Il dataset utilizzato è TON_IoT/UNSW, nella componente di rete [1], [2], [13], [14]. Il file atteso dalla pipeline è data/raw/train_test_network.csv. La colonna label viene utilizzata come target per la classificazione binaria, mentre la colonna type viene utilizzata come target per la classificazione multiclasse.</w:t>
+      </w:r>
+    </w:p>
+    <w:p>
+      <w:r>
+        <w:t xml:space="preserve">La classificazione binaria è progettata per separare traffico normale da traffico di attacco. D’altra parte, la classificazione multiclass è in grado di differenziare tra </w:t>
       </w:r>
       <w:r>
         <w:t>più</w:t>
       </w:r>
       <w:r>
-        <w:t xml:space="preserve"> difficile che i dati grezzi vengano confusi, siano essi artefatti generati o codice. La cartella config/ è dove viene impostata la configurazione attraverso il file yaml, in cui sono centralizzati tutti i percorsi e i parametri sperimentali. La directory data/raw/ memorizza il dataset scaricato manualmente mentre data/processed/ può contenere eventuali dati trasformati. src/ include i moduli Python usati per il caricamento dei dati, il </w:t>
+        <w:t xml:space="preserve"> categorie di traffico come classi normali e diversi tipi di attacchi. Il secondo compito è </w:t>
+      </w:r>
+      <w:r>
+        <w:t>più</w:t>
+      </w:r>
+      <w:r>
+        <w:t xml:space="preserve"> difficile perché non dev</w:t>
+      </w:r>
+      <w:r>
+        <w:t>e</w:t>
+      </w:r>
+      <w:r>
+        <w:t xml:space="preserve"> solo rilevare l’esistenza di una minaccia, ma anche che tipo di minaccia sia.</w:t>
+      </w:r>
+    </w:p>
+    <w:p>
+      <w:r>
+        <w:t>Questo dataset non esiste nel repository</w:t>
+      </w:r>
+      <w:r>
+        <w:t xml:space="preserve">, è stata </w:t>
+      </w:r>
+      <w:r>
+        <w:t>pres</w:t>
+      </w:r>
+      <w:r>
+        <w:t>a</w:t>
+      </w:r>
+      <w:r>
+        <w:t xml:space="preserve"> questa decisione sia per evitare il versioning di file pesanti sia per mantenere il progetto aggiornato con le migliori pratiche di gestione dei dati. Gli script controllano se il file è presente e, se il dataset non esiste, l’esecuzione si interrompe con un messaggio chiaro senza produrre artefatti sperimentali.</w:t>
+      </w:r>
+    </w:p>
+    <w:p>
+      <w:pPr>
+        <w:pStyle w:val="Titolo2"/>
+      </w:pPr>
+      <w:bookmarkStart w:id="21" w:name="_Toc239065767"/>
+      <w:r>
+        <w:t>3.3 Validazione dei dati</w:t>
+      </w:r>
+      <w:bookmarkEnd w:id="21"/>
+    </w:p>
+    <w:p>
+      <w:r>
+        <w:t xml:space="preserve">La pipeline verifica che il file atteso sia presente e che le colonne target richieste siano disponibili prima del </w:t>
       </w:r>
       <w:r>
         <w:t>preprocessing</w:t>
       </w:r>
       <w:r>
-        <w:t>, l’addestramento, la valutazione, la visualizzazione, gli esperimenti e la simulazione. La directory results/ raccoglie metriche, grafici, modelli e log. Infine, tutta la documentazione accademica in italiano si trova nella directory thesis/.</w:t>
-      </w:r>
-    </w:p>
-    <w:p>
-      <w:r>
-        <w:t>Questo impedisce l’uso di percorsi assoluti e consente di eseguire gli script dalla root del repository. I file di grandi dimensioni e gli artefatti non adatti al versionamento sono esclusi tramite .gitignore.</w:t>
+        <w:t xml:space="preserve">. In caso contrario, se si verifica un errore, indica </w:t>
+      </w:r>
+      <w:r>
+        <w:lastRenderedPageBreak/>
+        <w:t>quale percorso del dataset è stato utilizzato e come</w:t>
+      </w:r>
+      <w:r>
+        <w:t xml:space="preserve"> procedere</w:t>
+      </w:r>
+      <w:r>
+        <w:t xml:space="preserve">. Questo è un comportamento positivo perché evita messaggi poco chiari come le eccezioni pandas o un KeyError, che non hanno </w:t>
+      </w:r>
+      <w:r>
+        <w:t>molto valore</w:t>
+      </w:r>
+      <w:r>
+        <w:t xml:space="preserve"> per chi </w:t>
+      </w:r>
+      <w:r>
+        <w:t xml:space="preserve">intende </w:t>
+      </w:r>
+      <w:r>
+        <w:t>eseguire il progetto per la prima volta.</w:t>
+      </w:r>
+    </w:p>
+    <w:p>
+      <w:r>
+        <w:t>La validazione de</w:t>
+      </w:r>
+      <w:r>
+        <w:t>i</w:t>
+      </w:r>
+      <w:r>
+        <w:t xml:space="preserve"> target è importante perché i Dataset scaricati da fonti diverse potrebbero avere nomi o colonne differenti. Questo è </w:t>
+      </w:r>
+      <w:r>
+        <w:t>implicito</w:t>
+      </w:r>
+      <w:r>
+        <w:t xml:space="preserve"> nella configurazione del progetto</w:t>
+      </w:r>
+      <w:r>
+        <w:t xml:space="preserve"> che </w:t>
+      </w:r>
+      <w:r>
+        <w:t xml:space="preserve">mostra un’etichetta per la classificazione binaria e type per la classificazione multiclass. </w:t>
+      </w:r>
+      <w:r>
+        <w:t>Nel caso in cui l’</w:t>
+      </w:r>
+      <w:r>
+        <w:t xml:space="preserve">esecuzione della pipeline si </w:t>
+      </w:r>
+      <w:r>
+        <w:t>ferma</w:t>
+      </w:r>
+      <w:r>
+        <w:t>sse,</w:t>
+      </w:r>
+      <w:r>
+        <w:t xml:space="preserve"> viene </w:t>
+      </w:r>
+      <w:r>
+        <w:t>indicat</w:t>
+      </w:r>
+      <w:r>
+        <w:t>a la mancanza di queste colonne.</w:t>
+      </w:r>
+      <w:r>
+        <w:t xml:space="preserve"> </w:t>
       </w:r>
     </w:p>
     <w:p>
       <w:pPr>
         <w:pStyle w:val="Titolo2"/>
       </w:pPr>
-      <w:bookmarkStart w:id="20" w:name="_Toc239064542"/>
-      <w:r>
-        <w:t>3.2 Dataset utilizzato</w:t>
-      </w:r>
-      <w:bookmarkEnd w:id="20"/>
-      <w:r>
-        <w:tab/>
-      </w:r>
-    </w:p>
-    <w:p>
-      <w:r>
-        <w:t>‎Il dataset utilizzato è TON_IoT/UNSW, nella componente di rete [1], [2], [13], [14]. Il file atteso dalla pipeline è data/raw/train_test_network.csv. La colonna label viene utilizzata come target per la classificazione binaria, mentre la colonna type viene utilizzata come target per la classificazione multiclasse.</w:t>
-      </w:r>
-    </w:p>
-    <w:p>
-      <w:r>
-        <w:t xml:space="preserve">La classificazione binaria è progettata per separare traffico normale da traffico di attacco. D’altra parte, la classificazione multiclass è in grado di differenziare tra </w:t>
-      </w:r>
-      <w:r>
-        <w:t>più</w:t>
-      </w:r>
-      <w:r>
-        <w:t xml:space="preserve"> categorie di traffico come classi normali e diversi tipi di attacchi. Il secondo compito è </w:t>
-      </w:r>
-      <w:r>
-        <w:t>più</w:t>
-      </w:r>
-      <w:r>
-        <w:t xml:space="preserve"> difficile perché non dev</w:t>
-      </w:r>
-      <w:r>
-        <w:t>e</w:t>
-      </w:r>
-      <w:r>
-        <w:t xml:space="preserve"> solo rilevare l’esistenza di una minaccia, ma anche che tipo di minaccia sia.</w:t>
-      </w:r>
-    </w:p>
-    <w:p>
-      <w:r>
-        <w:t>Questo dataset non esiste nel repository</w:t>
-      </w:r>
-      <w:r>
-        <w:t xml:space="preserve">, è stata </w:t>
-      </w:r>
-      <w:r>
-        <w:t>pres</w:t>
-      </w:r>
-      <w:r>
-        <w:t>a</w:t>
-      </w:r>
-      <w:r>
-        <w:t xml:space="preserve"> questa decisione sia per evitare il versioning di file pesanti sia per mantenere il progetto aggiornato con le migliori pratiche di gestione dei dati. Gli script controllano se il file è presente e, se il dataset </w:t>
-      </w:r>
-      <w:r>
-        <w:lastRenderedPageBreak/>
-        <w:t>non esiste, l’esecuzione si interrompe con un messaggio chiaro senza produrre artefatti sperimentali.</w:t>
-      </w:r>
-    </w:p>
-    <w:p>
-      <w:pPr>
-        <w:pStyle w:val="Titolo2"/>
-      </w:pPr>
-      <w:bookmarkStart w:id="21" w:name="_Toc239064543"/>
-      <w:r>
-        <w:t>3.3 Validazione dei dati</w:t>
-      </w:r>
-      <w:bookmarkEnd w:id="21"/>
-    </w:p>
-    <w:p>
-      <w:r>
-        <w:t xml:space="preserve">La pipeline verifica che il file atteso sia presente e che le colonne target richieste siano disponibili prima del </w:t>
-      </w:r>
-      <w:r>
-        <w:t>preprocessing</w:t>
-      </w:r>
-      <w:r>
-        <w:t>. In caso contrario, se si verifica un errore, indica quale percorso del dataset è stato utilizzato e come</w:t>
-      </w:r>
-      <w:r>
-        <w:t xml:space="preserve"> procedere</w:t>
-      </w:r>
-      <w:r>
-        <w:t xml:space="preserve">. Questo è un comportamento positivo perché evita messaggi poco chiari come le eccezioni pandas o un KeyError, che non hanno </w:t>
-      </w:r>
-      <w:r>
-        <w:t>molto valore</w:t>
-      </w:r>
-      <w:r>
-        <w:t xml:space="preserve"> per chi </w:t>
-      </w:r>
-      <w:r>
-        <w:t xml:space="preserve">intende </w:t>
-      </w:r>
-      <w:r>
-        <w:t>eseguire il progetto per la prima volta.</w:t>
-      </w:r>
-    </w:p>
-    <w:p>
-      <w:r>
-        <w:t>La validazione de</w:t>
-      </w:r>
-      <w:r>
-        <w:t>i</w:t>
-      </w:r>
-      <w:r>
-        <w:t xml:space="preserve"> target è importante perché i Dataset scaricati da fonti diverse potrebbero avere nomi o colonne differenti. Questo è </w:t>
-      </w:r>
-      <w:r>
-        <w:t>implicito</w:t>
-      </w:r>
-      <w:r>
-        <w:t xml:space="preserve"> nella configurazione del progetto</w:t>
-      </w:r>
-      <w:r>
-        <w:t xml:space="preserve"> che </w:t>
-      </w:r>
-      <w:r>
-        <w:t xml:space="preserve">mostra un’etichetta per la classificazione binaria e type per la classificazione multiclass. </w:t>
-      </w:r>
-      <w:r>
-        <w:t>Nel caso in cui l’</w:t>
-      </w:r>
-      <w:r>
-        <w:t xml:space="preserve">esecuzione della pipeline si </w:t>
-      </w:r>
-      <w:r>
-        <w:t>ferma</w:t>
-      </w:r>
-      <w:r>
-        <w:t>sse,</w:t>
-      </w:r>
-      <w:r>
-        <w:t xml:space="preserve"> viene </w:t>
-      </w:r>
-      <w:r>
-        <w:t>indicat</w:t>
-      </w:r>
-      <w:r>
-        <w:t>a la mancanza di queste colonne.</w:t>
-      </w:r>
-      <w:r>
-        <w:t xml:space="preserve"> </w:t>
-      </w:r>
-    </w:p>
-    <w:p>
-      <w:pPr>
-        <w:pStyle w:val="Titolo2"/>
-      </w:pPr>
-      <w:bookmarkStart w:id="22" w:name="_Toc239064544"/>
+      <w:bookmarkStart w:id="22" w:name="_Toc239065768"/>
       <w:r>
         <w:t>3.4 Preprocessing e prevenzione del data leakage</w:t>
       </w:r>
@@ -6439,7 +6208,7 @@
       <w:r>
         <w:instrText xml:space="preserve"> TC "</w:instrText>
       </w:r>
-      <w:bookmarkStart w:id="23" w:name="_Toc239064575"/>
+      <w:bookmarkStart w:id="23" w:name="_Toc239065799"/>
       <w:r>
         <w:instrText>Figura 1 - Distribuzione delle classi binarie prima del preprocessing</w:instrText>
       </w:r>
@@ -6513,7 +6282,7 @@
       <w:r>
         <w:instrText xml:space="preserve"> TC "</w:instrText>
       </w:r>
-      <w:bookmarkStart w:id="24" w:name="_Toc239064576"/>
+      <w:bookmarkStart w:id="24" w:name="_Toc239065800"/>
       <w:r>
         <w:instrText>Figura 2 - Distribuzione delle classi binarie dopo il preprocessing</w:instrText>
       </w:r>
@@ -6529,7 +6298,7 @@
       <w:pPr>
         <w:pStyle w:val="Titolo2"/>
       </w:pPr>
-      <w:bookmarkStart w:id="25" w:name="_Toc239064545"/>
+      <w:bookmarkStart w:id="25" w:name="_Toc239065769"/>
       <w:r>
         <w:lastRenderedPageBreak/>
         <w:t>3.5 Split sperimentale</w:t>
@@ -6556,7 +6325,7 @@
       <w:pPr>
         <w:pStyle w:val="Titolo2"/>
       </w:pPr>
-      <w:bookmarkStart w:id="26" w:name="_Toc239064546"/>
+      <w:bookmarkStart w:id="26" w:name="_Toc239065770"/>
       <w:r>
         <w:t>3.6 Modelli baseline</w:t>
       </w:r>
@@ -6613,7 +6382,7 @@
       <w:pPr>
         <w:pStyle w:val="Titolo2"/>
       </w:pPr>
-      <w:bookmarkStart w:id="27" w:name="_Toc239064547"/>
+      <w:bookmarkStart w:id="27" w:name="_Toc239065771"/>
       <w:r>
         <w:t>3.7 Esperimenti estesi</w:t>
       </w:r>
@@ -6654,7 +6423,7 @@
       <w:pPr>
         <w:pStyle w:val="Titolo2"/>
       </w:pPr>
-      <w:bookmarkStart w:id="28" w:name="_Toc239064548"/>
+      <w:bookmarkStart w:id="28" w:name="_Toc239065772"/>
       <w:r>
         <w:t>3.8 Metriche di valutazione</w:t>
       </w:r>
@@ -6694,7 +6463,7 @@
       <w:pPr>
         <w:pStyle w:val="Titolo2"/>
       </w:pPr>
-      <w:bookmarkStart w:id="29" w:name="_Toc239064549"/>
+      <w:bookmarkStart w:id="29" w:name="_Toc239065773"/>
       <w:r>
         <w:t>3.9 Protocollo di esecuzione</w:t>
       </w:r>
@@ -6728,7 +6497,7 @@
       <w:pPr>
         <w:pStyle w:val="Titolo2"/>
       </w:pPr>
-      <w:bookmarkStart w:id="30" w:name="_Toc239064550"/>
+      <w:bookmarkStart w:id="30" w:name="_Toc239065774"/>
       <w:r>
         <w:t>3.10 Gestione degli artefatti</w:t>
       </w:r>
@@ -6761,7 +6530,7 @@
       <w:pPr>
         <w:pStyle w:val="Titolo2"/>
       </w:pPr>
-      <w:bookmarkStart w:id="31" w:name="_Toc239064551"/>
+      <w:bookmarkStart w:id="31" w:name="_Toc239065775"/>
       <w:r>
         <w:t>3.11 Simulazione IoT e dimostrazione embedded</w:t>
       </w:r>
@@ -6828,7 +6597,7 @@
         <w:pStyle w:val="Titolo1"/>
         <w:pageBreakBefore/>
       </w:pPr>
-      <w:bookmarkStart w:id="32" w:name="_Toc239064552"/>
+      <w:bookmarkStart w:id="32" w:name="_Toc239065776"/>
       <w:r>
         <w:lastRenderedPageBreak/>
         <w:t>Capitolo 4 - Risultati sperimentali</w:t>
@@ -6839,7 +6608,7 @@
       <w:pPr>
         <w:pStyle w:val="Titolo2"/>
       </w:pPr>
-      <w:bookmarkStart w:id="33" w:name="_Toc239064553"/>
+      <w:bookmarkStart w:id="33" w:name="_Toc239065777"/>
       <w:r>
         <w:t>4.1 Premessa sui risultati</w:t>
       </w:r>
@@ -6859,7 +6628,7 @@
       <w:pPr>
         <w:pStyle w:val="Titolo2"/>
       </w:pPr>
-      <w:bookmarkStart w:id="34" w:name="_Toc239064554"/>
+      <w:bookmarkStart w:id="34" w:name="_Toc239065778"/>
       <w:r>
         <w:t>4.2 Risultati baseline nella classificazione binaria</w:t>
       </w:r>
@@ -6880,7 +6649,7 @@
       <w:r>
         <w:instrText xml:space="preserve"> TC "</w:instrText>
       </w:r>
-      <w:bookmarkStart w:id="35" w:name="_Toc239064589"/>
+      <w:bookmarkStart w:id="35" w:name="_Toc239065813"/>
       <w:r>
         <w:instrText>Tabella 1 - Prestazioni dei modelli baseline nella classificazione binaria</w:instrText>
       </w:r>
@@ -7638,7 +7407,7 @@
       <w:r>
         <w:instrText xml:space="preserve"> TC "</w:instrText>
       </w:r>
-      <w:bookmarkStart w:id="36" w:name="_Toc239064577"/>
+      <w:bookmarkStart w:id="36" w:name="_Toc239065801"/>
       <w:r>
         <w:instrText>Figura 3 - Confronto dell'accuracy dei modelli baseline nella classificazione binaria</w:instrText>
       </w:r>
@@ -7712,7 +7481,7 @@
       <w:r>
         <w:instrText xml:space="preserve"> TC "</w:instrText>
       </w:r>
-      <w:bookmarkStart w:id="37" w:name="_Toc239064578"/>
+      <w:bookmarkStart w:id="37" w:name="_Toc239065802"/>
       <w:r>
         <w:instrText>Figura 4 - Confronto del Macro F1 dei modelli baseline nella classificazione binaria</w:instrText>
       </w:r>
@@ -7787,7 +7556,7 @@
       <w:r>
         <w:instrText xml:space="preserve"> TC "</w:instrText>
       </w:r>
-      <w:bookmarkStart w:id="38" w:name="_Toc239064579"/>
+      <w:bookmarkStart w:id="38" w:name="_Toc239065803"/>
       <w:r>
         <w:instrText>Figura 5 - Matrice di confusione LightGBM nella classificazione binaria</w:instrText>
       </w:r>
@@ -7803,7 +7572,7 @@
       <w:pPr>
         <w:pStyle w:val="Titolo2"/>
       </w:pPr>
-      <w:bookmarkStart w:id="39" w:name="_Toc239064555"/>
+      <w:bookmarkStart w:id="39" w:name="_Toc239065779"/>
       <w:r>
         <w:t>4.3 Risultati baseline nella classificazione multiclasse</w:t>
       </w:r>
@@ -7824,7 +7593,7 @@
       <w:r>
         <w:instrText xml:space="preserve"> TC "</w:instrText>
       </w:r>
-      <w:bookmarkStart w:id="40" w:name="_Toc239064590"/>
+      <w:bookmarkStart w:id="40" w:name="_Toc239065814"/>
       <w:r>
         <w:instrText>Tabella 2 - Prestazioni dei modelli baseline nella classificazione multiclasse</w:instrText>
       </w:r>
@@ -8511,59 +8280,17 @@
     </w:tbl>
     <w:p>
       <w:r>
-        <w:t>Nella situazione multiclasse, i nostri primi risulta</w:t>
-      </w:r>
-      <w:r>
-        <w:t>mostra</w:t>
-      </w:r>
-      <w:r>
-        <w:t xml:space="preserve">no che LightGBM ottiene la migliore accuratezza di base e il valore </w:t>
-      </w:r>
-      <w:r>
-        <w:t>Macro F1</w:t>
-      </w:r>
-      <w:r>
-        <w:t xml:space="preserve">. I risultati per XGBoost e Random Forest continuano a essere competitivi, mentre quelli per la Regressione Logistica mostrano limiti </w:t>
-      </w:r>
-      <w:r>
-        <w:t>più</w:t>
-      </w:r>
-      <w:r>
-        <w:t xml:space="preserve"> evidenti. Il calo della Regressione Logistica è coerente con la </w:t>
+        <w:t xml:space="preserve">Nella situazione multiclasse, i nostri primi </w:t>
+      </w:r>
+      <w:r>
+        <w:t>risultati mostrano</w:t>
+      </w:r>
+      <w:r>
+        <w:t xml:space="preserve"> che LightGBM ottiene la migliore accuratezza di base e il valore Macro F1. XGBoost e Random Forest mantengono risultati competitivi, mentre Logistic Regression mostra limiti più evidenti. Tale differenza è coerente con la maggiore complessità della classificazione multiclasse: </w:t>
       </w:r>
       <w:r>
         <w:lastRenderedPageBreak/>
-        <w:t xml:space="preserve">maggiore complessità del problema multiclasse, poiché distinguere gli attacchi all’interno delle categorie richiede confini decisionali </w:t>
-      </w:r>
-      <w:r>
-        <w:t>più</w:t>
-      </w:r>
-      <w:r>
-        <w:t xml:space="preserve"> articolati rispetto alla separazione singola normale/attacco. Il Macro F1 è </w:t>
-      </w:r>
-      <w:r>
-        <w:t>più</w:t>
-      </w:r>
-      <w:r>
-        <w:t xml:space="preserve"> rilevante nella valutazione multiclasse, perché assegna un peso uguale a tutte le classi. Un modello può fornire risultati altamente accurati classificando bene le classi </w:t>
-      </w:r>
-      <w:r>
-        <w:t>più</w:t>
-      </w:r>
-      <w:r>
-        <w:t xml:space="preserve"> prevalenti, pur faticando con le classi minoritarie. Il fatto che LightGBM raggiunga anche il Macro F1 </w:t>
-      </w:r>
-      <w:r>
-        <w:t>più</w:t>
-      </w:r>
-      <w:r>
-        <w:t xml:space="preserve"> alto indica una capacità </w:t>
-      </w:r>
-      <w:r>
-        <w:t>più</w:t>
-      </w:r>
-      <w:r>
-        <w:t xml:space="preserve"> equilibrata di discriminare tra le diverse classi.</w:t>
+        <w:t>distinguere tra diverse tipologie di attacco richiede confini decisionali più articolati rispetto alla sola separazione tra traffico normale e traffico malevolo. In questo contesto il Macro F1 è particolarmente utile, perché attribuisce lo stesso peso a tutte le classi. Un modello può fornire risultati altamente accurati classificando bene le classi più prevalenti, pur faticando con le classi minoritarie. Il fatto che LightGBM raggiunga anche il Macro F1 più alto indica una capacità più equilibrata di discriminare tra le diverse classi.</w:t>
       </w:r>
     </w:p>
     <w:p/>
@@ -8629,7 +8356,7 @@
       <w:r>
         <w:instrText xml:space="preserve"> TC "</w:instrText>
       </w:r>
-      <w:bookmarkStart w:id="41" w:name="_Toc239064580"/>
+      <w:bookmarkStart w:id="41" w:name="_Toc239065804"/>
       <w:r>
         <w:instrText>Figura 6 - Confronto dell'accuracy dei modelli baseline nella classificazione multiclasse</w:instrText>
       </w:r>
@@ -8704,7 +8431,7 @@
       <w:r>
         <w:instrText xml:space="preserve"> TC "</w:instrText>
       </w:r>
-      <w:bookmarkStart w:id="42" w:name="_Toc239064581"/>
+      <w:bookmarkStart w:id="42" w:name="_Toc239065805"/>
       <w:r>
         <w:instrText>Figura 7 - Confronto del Macro F1 dei modelli baseline nella classificazione multiclasse</w:instrText>
       </w:r>
@@ -8779,7 +8506,7 @@
       <w:r>
         <w:instrText xml:space="preserve"> TC "</w:instrText>
       </w:r>
-      <w:bookmarkStart w:id="43" w:name="_Toc239064582"/>
+      <w:bookmarkStart w:id="43" w:name="_Toc239065806"/>
       <w:r>
         <w:instrText>Figura 8 - Matrice di confusione LightGBM nella classificazione multiclasse</w:instrText>
       </w:r>
@@ -8795,7 +8522,7 @@
       <w:pPr>
         <w:pStyle w:val="Titolo2"/>
       </w:pPr>
-      <w:bookmarkStart w:id="44" w:name="_Toc239064556"/>
+      <w:bookmarkStart w:id="44" w:name="_Toc239065780"/>
       <w:r>
         <w:t>4.4 Effetto del bilanciamento tramite SMOTE</w:t>
       </w:r>
@@ -8878,7 +8605,7 @@
       <w:r>
         <w:instrText xml:space="preserve"> TC "</w:instrText>
       </w:r>
-      <w:bookmarkStart w:id="45" w:name="_Toc239064583"/>
+      <w:bookmarkStart w:id="45" w:name="_Toc239065807"/>
       <w:r>
         <w:instrText>Figura 9 - Confronto Macro F1 con e senza SMOTE</w:instrText>
       </w:r>
@@ -8894,7 +8621,7 @@
       <w:pPr>
         <w:pStyle w:val="Titolo2"/>
       </w:pPr>
-      <w:bookmarkStart w:id="46" w:name="_Toc239064557"/>
+      <w:bookmarkStart w:id="46" w:name="_Toc239065781"/>
       <w:r>
         <w:t>4.5 Tuning iperparametrico</w:t>
       </w:r>
@@ -9001,7 +8728,7 @@
       <w:r>
         <w:instrText xml:space="preserve"> TC "</w:instrText>
       </w:r>
-      <w:bookmarkStart w:id="47" w:name="_Toc239064584"/>
+      <w:bookmarkStart w:id="47" w:name="_Toc239065808"/>
       <w:r>
         <w:instrText>Figura 10 - Confronto Macro F1 dei modelli sottoposti a tuning binario</w:instrText>
       </w:r>
@@ -9017,7 +8744,7 @@
       <w:pPr>
         <w:pStyle w:val="Titolo2"/>
       </w:pPr>
-      <w:bookmarkStart w:id="48" w:name="_Toc239064558"/>
+      <w:bookmarkStart w:id="48" w:name="_Toc239065782"/>
       <w:r>
         <w:t>4.6 Modelli aggiuntivi: MLPClassifier e Isolation Forest</w:t>
       </w:r>
@@ -9111,7 +8838,7 @@
       <w:r>
         <w:instrText xml:space="preserve"> TC "</w:instrText>
       </w:r>
-      <w:bookmarkStart w:id="49" w:name="_Toc239064585"/>
+      <w:bookmarkStart w:id="49" w:name="_Toc239065809"/>
       <w:r>
         <w:instrText>Figura 11 - Confronto Macro F1 degli esperimenti estesi binari</w:instrText>
       </w:r>
@@ -9186,7 +8913,7 @@
       <w:r>
         <w:instrText xml:space="preserve"> TC "</w:instrText>
       </w:r>
-      <w:bookmarkStart w:id="50" w:name="_Toc239064586"/>
+      <w:bookmarkStart w:id="50" w:name="_Toc239065810"/>
       <w:r>
         <w:instrText>Figura 12 - Confronto Macro F1 degli esperimenti estesi multiclasse</w:instrText>
       </w:r>
@@ -9202,7 +8929,7 @@
       <w:pPr>
         <w:pStyle w:val="Titolo2"/>
       </w:pPr>
-      <w:bookmarkStart w:id="51" w:name="_Toc239064559"/>
+      <w:bookmarkStart w:id="51" w:name="_Toc239065783"/>
       <w:r>
         <w:t>4.7 Interpretabilità dei modelli</w:t>
       </w:r>
@@ -9289,7 +9016,7 @@
       <w:r>
         <w:instrText xml:space="preserve"> TC "</w:instrText>
       </w:r>
-      <w:bookmarkStart w:id="52" w:name="_Toc239064587"/>
+      <w:bookmarkStart w:id="52" w:name="_Toc239065811"/>
       <w:r>
         <w:instrText>Figura 13 - Importanza delle feature nel modello LightGBM binario</w:instrText>
       </w:r>
@@ -9364,7 +9091,7 @@
       <w:r>
         <w:instrText xml:space="preserve"> TC "</w:instrText>
       </w:r>
-      <w:bookmarkStart w:id="53" w:name="_Toc239064588"/>
+      <w:bookmarkStart w:id="53" w:name="_Toc239065812"/>
       <w:r>
         <w:instrText>Figura 14 - Importanza delle feature nel modello LightGBM multiclasse</w:instrText>
       </w:r>
@@ -9380,7 +9107,7 @@
       <w:pPr>
         <w:pStyle w:val="Titolo2"/>
       </w:pPr>
-      <w:bookmarkStart w:id="54" w:name="_Toc239064560"/>
+      <w:bookmarkStart w:id="54" w:name="_Toc239065784"/>
       <w:r>
         <w:t>4.8 Latenza, dimensione e compressione</w:t>
       </w:r>
@@ -9428,7 +9155,7 @@
       <w:pPr>
         <w:pStyle w:val="Titolo2"/>
       </w:pPr>
-      <w:bookmarkStart w:id="55" w:name="_Toc239064561"/>
+      <w:bookmarkStart w:id="55" w:name="_Toc239065785"/>
       <w:r>
         <w:t>4.9 Dimostratore embedded con Wokwi</w:t>
       </w:r>
@@ -9566,7 +9293,7 @@
       <w:pPr>
         <w:pStyle w:val="Titolo2"/>
       </w:pPr>
-      <w:bookmarkStart w:id="56" w:name="_Toc239064562"/>
+      <w:bookmarkStart w:id="56" w:name="_Toc239065786"/>
       <w:r>
         <w:t>4.10 Sintesi degli artefatti prodotti</w:t>
       </w:r>
@@ -9602,7 +9329,7 @@
       <w:pPr>
         <w:pStyle w:val="Titolo2"/>
       </w:pPr>
-      <w:bookmarkStart w:id="57" w:name="_Toc239064563"/>
+      <w:bookmarkStart w:id="57" w:name="_Toc239065787"/>
       <w:r>
         <w:t>4.11 Lettura critica dei risultati</w:t>
       </w:r>
@@ -9647,7 +9374,7 @@
         <w:pStyle w:val="Titolo1"/>
         <w:pageBreakBefore/>
       </w:pPr>
-      <w:bookmarkStart w:id="58" w:name="_Toc239064564"/>
+      <w:bookmarkStart w:id="58" w:name="_Toc239065788"/>
       <w:r>
         <w:t>Capitolo 5 - Discussione e strategie di mitigazione</w:t>
       </w:r>
@@ -9657,7 +9384,7 @@
       <w:pPr>
         <w:pStyle w:val="Titolo2"/>
       </w:pPr>
-      <w:bookmarkStart w:id="59" w:name="_Toc239064565"/>
+      <w:bookmarkStart w:id="59" w:name="_Toc239065789"/>
       <w:r>
         <w:t>5.1 Interpretazione complessiva dei risultati</w:t>
       </w:r>
@@ -9665,13 +9392,13 @@
     </w:p>
     <w:p>
       <w:r>
-        <w:t>I risulta</w:t>
-      </w:r>
-      <w:r>
-        <w:t>mostra</w:t>
-      </w:r>
-      <w:r>
-        <w:t xml:space="preserve">no che i modelli di ensemble hanno successo in modo specifico sul dataset TON_IoT. LightGBM: accuratezza </w:t>
+        <w:t xml:space="preserve">I </w:t>
+      </w:r>
+      <w:r>
+        <w:t>risultati mostrano</w:t>
+      </w:r>
+      <w:r>
+        <w:t xml:space="preserve"> che i modelli di ensemble hanno successo in modo specifico sul dataset TON_IoT. LightGBM: accuratezza </w:t>
       </w:r>
       <w:r>
         <w:t>più</w:t>
@@ -9731,7 +9458,7 @@
       <w:pPr>
         <w:pStyle w:val="Titolo2"/>
       </w:pPr>
-      <w:bookmarkStart w:id="60" w:name="_Toc239064566"/>
+      <w:bookmarkStart w:id="60" w:name="_Toc239065790"/>
       <w:r>
         <w:t>5.2 Interpretabilità contro prestazioni</w:t>
       </w:r>
@@ -9782,7 +9509,7 @@
       <w:pPr>
         <w:pStyle w:val="Titolo2"/>
       </w:pPr>
-      <w:bookmarkStart w:id="61" w:name="_Toc239064567"/>
+      <w:bookmarkStart w:id="61" w:name="_Toc239065791"/>
       <w:r>
         <w:t>5.3 Limiti del dataset statico</w:t>
       </w:r>
@@ -9808,7 +9535,7 @@
       <w:pPr>
         <w:pStyle w:val="Titolo2"/>
       </w:pPr>
-      <w:bookmarkStart w:id="62" w:name="_Toc239064568"/>
+      <w:bookmarkStart w:id="62" w:name="_Toc239065792"/>
       <w:r>
         <w:t>5.4 Limiti della simulazione Wokwi</w:t>
       </w:r>
@@ -9847,7 +9574,7 @@
       <w:pPr>
         <w:pStyle w:val="Titolo2"/>
       </w:pPr>
-      <w:bookmarkStart w:id="63" w:name="_Toc239064569"/>
+      <w:bookmarkStart w:id="63" w:name="_Toc239065793"/>
       <w:r>
         <w:t>5.5 Strategie di mitigazione</w:t>
       </w:r>
@@ -9882,7 +9609,7 @@
       <w:pPr>
         <w:pStyle w:val="Titolo2"/>
       </w:pPr>
-      <w:bookmarkStart w:id="64" w:name="_Toc239064570"/>
+      <w:bookmarkStart w:id="64" w:name="_Toc239065794"/>
       <w:r>
         <w:t>5.6 Possibile percorso verso una validazione su hardware reale</w:t>
       </w:r>
@@ -9913,7 +9640,7 @@
       <w:pPr>
         <w:pStyle w:val="Titolo2"/>
       </w:pPr>
-      <w:bookmarkStart w:id="65" w:name="_Toc239064571"/>
+      <w:bookmarkStart w:id="65" w:name="_Toc239065795"/>
       <w:r>
         <w:t>5.7 Indicazioni operative per un IDS IoT</w:t>
       </w:r>
@@ -9955,7 +9682,7 @@
       <w:pPr>
         <w:pStyle w:val="Titolo2"/>
       </w:pPr>
-      <w:bookmarkStart w:id="66" w:name="_Toc239064572"/>
+      <w:bookmarkStart w:id="66" w:name="_Toc239065796"/>
       <w:r>
         <w:t>5.8 Considerazioni etiche e di gestione dei dati</w:t>
       </w:r>
@@ -9983,7 +9710,7 @@
         <w:pStyle w:val="Titolo1"/>
         <w:pageBreakBefore/>
       </w:pPr>
-      <w:bookmarkStart w:id="67" w:name="_Toc239064573"/>
+      <w:bookmarkStart w:id="67" w:name="_Toc239065797"/>
       <w:r>
         <w:t>Capitolo 6 - Conclusioni</w:t>
       </w:r>
@@ -10059,7 +9786,7 @@
           <w:lang w:val="en-US"/>
         </w:rPr>
       </w:pPr>
-      <w:bookmarkStart w:id="68" w:name="_Toc239064574"/>
+      <w:bookmarkStart w:id="68" w:name="_Toc239065798"/>
       <w:r>
         <w:rPr>
           <w:lang w:val="en-US"/>

</xml_diff>

<commit_message>
Remove blank page after contents
</commit_message>
<xml_diff>
--- a/thesis/final_thesis.docx
+++ b/thesis/final_thesis.docx
@@ -452,7 +452,7 @@
         </w:rPr>
         <w:fldChar w:fldCharType="separate"/>
       </w:r>
-      <w:hyperlink w:anchor="_Toc239065746" w:history="1">
+      <w:hyperlink w:anchor="_Toc239066175" w:history="1">
         <w:r>
           <w:rPr>
             <w:rStyle w:val="Collegamentoipertestuale"/>
@@ -479,7 +479,7 @@
             <w:noProof/>
             <w:webHidden/>
           </w:rPr>
-          <w:instrText xml:space="preserve"> PAGEREF _Toc239065746 \h </w:instrText>
+          <w:instrText xml:space="preserve"> PAGEREF _Toc239066175 \h </w:instrText>
         </w:r>
         <w:r>
           <w:rPr>
@@ -499,7 +499,7 @@
             <w:noProof/>
             <w:webHidden/>
           </w:rPr>
-          <w:t>vii</w:t>
+          <w:t>vi</w:t>
         </w:r>
         <w:r>
           <w:rPr>
@@ -521,7 +521,7 @@
           <w:noProof/>
         </w:rPr>
       </w:pPr>
-      <w:hyperlink w:anchor="_Toc239065747" w:history="1">
+      <w:hyperlink w:anchor="_Toc239066176" w:history="1">
         <w:r>
           <w:rPr>
             <w:rStyle w:val="Collegamentoipertestuale"/>
@@ -548,7 +548,7 @@
             <w:noProof/>
             <w:webHidden/>
           </w:rPr>
-          <w:instrText xml:space="preserve"> PAGEREF _Toc239065747 \h </w:instrText>
+          <w:instrText xml:space="preserve"> PAGEREF _Toc239066176 \h </w:instrText>
         </w:r>
         <w:r>
           <w:rPr>
@@ -568,7 +568,7 @@
             <w:noProof/>
             <w:webHidden/>
           </w:rPr>
-          <w:t>viii</w:t>
+          <w:t>vii</w:t>
         </w:r>
         <w:r>
           <w:rPr>
@@ -590,7 +590,7 @@
           <w:noProof/>
         </w:rPr>
       </w:pPr>
-      <w:hyperlink w:anchor="_Toc239065748" w:history="1">
+      <w:hyperlink w:anchor="_Toc239066177" w:history="1">
         <w:r>
           <w:rPr>
             <w:rStyle w:val="Collegamentoipertestuale"/>
@@ -617,7 +617,7 @@
             <w:noProof/>
             <w:webHidden/>
           </w:rPr>
-          <w:instrText xml:space="preserve"> PAGEREF _Toc239065748 \h </w:instrText>
+          <w:instrText xml:space="preserve"> PAGEREF _Toc239066177 \h </w:instrText>
         </w:r>
         <w:r>
           <w:rPr>
@@ -659,7 +659,7 @@
           <w:noProof/>
         </w:rPr>
       </w:pPr>
-      <w:hyperlink w:anchor="_Toc239065749" w:history="1">
+      <w:hyperlink w:anchor="_Toc239066178" w:history="1">
         <w:r>
           <w:rPr>
             <w:rStyle w:val="Collegamentoipertestuale"/>
@@ -686,7 +686,7 @@
             <w:noProof/>
             <w:webHidden/>
           </w:rPr>
-          <w:instrText xml:space="preserve"> PAGEREF _Toc239065749 \h </w:instrText>
+          <w:instrText xml:space="preserve"> PAGEREF _Toc239066178 \h </w:instrText>
         </w:r>
         <w:r>
           <w:rPr>
@@ -728,7 +728,7 @@
           <w:noProof/>
         </w:rPr>
       </w:pPr>
-      <w:hyperlink w:anchor="_Toc239065750" w:history="1">
+      <w:hyperlink w:anchor="_Toc239066179" w:history="1">
         <w:r>
           <w:rPr>
             <w:rStyle w:val="Collegamentoipertestuale"/>
@@ -755,7 +755,7 @@
             <w:noProof/>
             <w:webHidden/>
           </w:rPr>
-          <w:instrText xml:space="preserve"> PAGEREF _Toc239065750 \h </w:instrText>
+          <w:instrText xml:space="preserve"> PAGEREF _Toc239066179 \h </w:instrText>
         </w:r>
         <w:r>
           <w:rPr>
@@ -797,7 +797,7 @@
           <w:noProof/>
         </w:rPr>
       </w:pPr>
-      <w:hyperlink w:anchor="_Toc239065751" w:history="1">
+      <w:hyperlink w:anchor="_Toc239066180" w:history="1">
         <w:r>
           <w:rPr>
             <w:rStyle w:val="Collegamentoipertestuale"/>
@@ -824,7 +824,7 @@
             <w:noProof/>
             <w:webHidden/>
           </w:rPr>
-          <w:instrText xml:space="preserve"> PAGEREF _Toc239065751 \h </w:instrText>
+          <w:instrText xml:space="preserve"> PAGEREF _Toc239066180 \h </w:instrText>
         </w:r>
         <w:r>
           <w:rPr>
@@ -866,7 +866,7 @@
           <w:noProof/>
         </w:rPr>
       </w:pPr>
-      <w:hyperlink w:anchor="_Toc239065752" w:history="1">
+      <w:hyperlink w:anchor="_Toc239066181" w:history="1">
         <w:r>
           <w:rPr>
             <w:rStyle w:val="Collegamentoipertestuale"/>
@@ -893,7 +893,7 @@
             <w:noProof/>
             <w:webHidden/>
           </w:rPr>
-          <w:instrText xml:space="preserve"> PAGEREF _Toc239065752 \h </w:instrText>
+          <w:instrText xml:space="preserve"> PAGEREF _Toc239066181 \h </w:instrText>
         </w:r>
         <w:r>
           <w:rPr>
@@ -935,7 +935,7 @@
           <w:noProof/>
         </w:rPr>
       </w:pPr>
-      <w:hyperlink w:anchor="_Toc239065753" w:history="1">
+      <w:hyperlink w:anchor="_Toc239066182" w:history="1">
         <w:r>
           <w:rPr>
             <w:rStyle w:val="Collegamentoipertestuale"/>
@@ -962,7 +962,7 @@
             <w:noProof/>
             <w:webHidden/>
           </w:rPr>
-          <w:instrText xml:space="preserve"> PAGEREF _Toc239065753 \h </w:instrText>
+          <w:instrText xml:space="preserve"> PAGEREF _Toc239066182 \h </w:instrText>
         </w:r>
         <w:r>
           <w:rPr>
@@ -1004,7 +1004,7 @@
           <w:noProof/>
         </w:rPr>
       </w:pPr>
-      <w:hyperlink w:anchor="_Toc239065754" w:history="1">
+      <w:hyperlink w:anchor="_Toc239066183" w:history="1">
         <w:r>
           <w:rPr>
             <w:rStyle w:val="Collegamentoipertestuale"/>
@@ -1031,7 +1031,7 @@
             <w:noProof/>
             <w:webHidden/>
           </w:rPr>
-          <w:instrText xml:space="preserve"> PAGEREF _Toc239065754 \h </w:instrText>
+          <w:instrText xml:space="preserve"> PAGEREF _Toc239066183 \h </w:instrText>
         </w:r>
         <w:r>
           <w:rPr>
@@ -1073,7 +1073,7 @@
           <w:noProof/>
         </w:rPr>
       </w:pPr>
-      <w:hyperlink w:anchor="_Toc239065755" w:history="1">
+      <w:hyperlink w:anchor="_Toc239066184" w:history="1">
         <w:r>
           <w:rPr>
             <w:rStyle w:val="Collegamentoipertestuale"/>
@@ -1100,7 +1100,7 @@
             <w:noProof/>
             <w:webHidden/>
           </w:rPr>
-          <w:instrText xml:space="preserve"> PAGEREF _Toc239065755 \h </w:instrText>
+          <w:instrText xml:space="preserve"> PAGEREF _Toc239066184 \h </w:instrText>
         </w:r>
         <w:r>
           <w:rPr>
@@ -1142,7 +1142,7 @@
           <w:noProof/>
         </w:rPr>
       </w:pPr>
-      <w:hyperlink w:anchor="_Toc239065756" w:history="1">
+      <w:hyperlink w:anchor="_Toc239066185" w:history="1">
         <w:r>
           <w:rPr>
             <w:rStyle w:val="Collegamentoipertestuale"/>
@@ -1169,7 +1169,7 @@
             <w:noProof/>
             <w:webHidden/>
           </w:rPr>
-          <w:instrText xml:space="preserve"> PAGEREF _Toc239065756 \h </w:instrText>
+          <w:instrText xml:space="preserve"> PAGEREF _Toc239066185 \h </w:instrText>
         </w:r>
         <w:r>
           <w:rPr>
@@ -1211,7 +1211,7 @@
           <w:noProof/>
         </w:rPr>
       </w:pPr>
-      <w:hyperlink w:anchor="_Toc239065757" w:history="1">
+      <w:hyperlink w:anchor="_Toc239066186" w:history="1">
         <w:r>
           <w:rPr>
             <w:rStyle w:val="Collegamentoipertestuale"/>
@@ -1238,7 +1238,7 @@
             <w:noProof/>
             <w:webHidden/>
           </w:rPr>
-          <w:instrText xml:space="preserve"> PAGEREF _Toc239065757 \h </w:instrText>
+          <w:instrText xml:space="preserve"> PAGEREF _Toc239066186 \h </w:instrText>
         </w:r>
         <w:r>
           <w:rPr>
@@ -1280,7 +1280,7 @@
           <w:noProof/>
         </w:rPr>
       </w:pPr>
-      <w:hyperlink w:anchor="_Toc239065758" w:history="1">
+      <w:hyperlink w:anchor="_Toc239066187" w:history="1">
         <w:r>
           <w:rPr>
             <w:rStyle w:val="Collegamentoipertestuale"/>
@@ -1307,7 +1307,7 @@
             <w:noProof/>
             <w:webHidden/>
           </w:rPr>
-          <w:instrText xml:space="preserve"> PAGEREF _Toc239065758 \h </w:instrText>
+          <w:instrText xml:space="preserve"> PAGEREF _Toc239066187 \h </w:instrText>
         </w:r>
         <w:r>
           <w:rPr>
@@ -1349,7 +1349,7 @@
           <w:noProof/>
         </w:rPr>
       </w:pPr>
-      <w:hyperlink w:anchor="_Toc239065759" w:history="1">
+      <w:hyperlink w:anchor="_Toc239066188" w:history="1">
         <w:r>
           <w:rPr>
             <w:rStyle w:val="Collegamentoipertestuale"/>
@@ -1376,7 +1376,7 @@
             <w:noProof/>
             <w:webHidden/>
           </w:rPr>
-          <w:instrText xml:space="preserve"> PAGEREF _Toc239065759 \h </w:instrText>
+          <w:instrText xml:space="preserve"> PAGEREF _Toc239066188 \h </w:instrText>
         </w:r>
         <w:r>
           <w:rPr>
@@ -1418,7 +1418,7 @@
           <w:noProof/>
         </w:rPr>
       </w:pPr>
-      <w:hyperlink w:anchor="_Toc239065760" w:history="1">
+      <w:hyperlink w:anchor="_Toc239066189" w:history="1">
         <w:r>
           <w:rPr>
             <w:rStyle w:val="Collegamentoipertestuale"/>
@@ -1445,7 +1445,7 @@
             <w:noProof/>
             <w:webHidden/>
           </w:rPr>
-          <w:instrText xml:space="preserve"> PAGEREF _Toc239065760 \h </w:instrText>
+          <w:instrText xml:space="preserve"> PAGEREF _Toc239066189 \h </w:instrText>
         </w:r>
         <w:r>
           <w:rPr>
@@ -1487,7 +1487,7 @@
           <w:noProof/>
         </w:rPr>
       </w:pPr>
-      <w:hyperlink w:anchor="_Toc239065761" w:history="1">
+      <w:hyperlink w:anchor="_Toc239066190" w:history="1">
         <w:r>
           <w:rPr>
             <w:rStyle w:val="Collegamentoipertestuale"/>
@@ -1514,7 +1514,7 @@
             <w:noProof/>
             <w:webHidden/>
           </w:rPr>
-          <w:instrText xml:space="preserve"> PAGEREF _Toc239065761 \h </w:instrText>
+          <w:instrText xml:space="preserve"> PAGEREF _Toc239066190 \h </w:instrText>
         </w:r>
         <w:r>
           <w:rPr>
@@ -1556,7 +1556,7 @@
           <w:noProof/>
         </w:rPr>
       </w:pPr>
-      <w:hyperlink w:anchor="_Toc239065762" w:history="1">
+      <w:hyperlink w:anchor="_Toc239066191" w:history="1">
         <w:r>
           <w:rPr>
             <w:rStyle w:val="Collegamentoipertestuale"/>
@@ -1583,7 +1583,7 @@
             <w:noProof/>
             <w:webHidden/>
           </w:rPr>
-          <w:instrText xml:space="preserve"> PAGEREF _Toc239065762 \h </w:instrText>
+          <w:instrText xml:space="preserve"> PAGEREF _Toc239066191 \h </w:instrText>
         </w:r>
         <w:r>
           <w:rPr>
@@ -1625,7 +1625,7 @@
           <w:noProof/>
         </w:rPr>
       </w:pPr>
-      <w:hyperlink w:anchor="_Toc239065763" w:history="1">
+      <w:hyperlink w:anchor="_Toc239066192" w:history="1">
         <w:r>
           <w:rPr>
             <w:rStyle w:val="Collegamentoipertestuale"/>
@@ -1652,7 +1652,7 @@
             <w:noProof/>
             <w:webHidden/>
           </w:rPr>
-          <w:instrText xml:space="preserve"> PAGEREF _Toc239065763 \h </w:instrText>
+          <w:instrText xml:space="preserve"> PAGEREF _Toc239066192 \h </w:instrText>
         </w:r>
         <w:r>
           <w:rPr>
@@ -1694,7 +1694,7 @@
           <w:noProof/>
         </w:rPr>
       </w:pPr>
-      <w:hyperlink w:anchor="_Toc239065764" w:history="1">
+      <w:hyperlink w:anchor="_Toc239066193" w:history="1">
         <w:r>
           <w:rPr>
             <w:rStyle w:val="Collegamentoipertestuale"/>
@@ -1721,7 +1721,7 @@
             <w:noProof/>
             <w:webHidden/>
           </w:rPr>
-          <w:instrText xml:space="preserve"> PAGEREF _Toc239065764 \h </w:instrText>
+          <w:instrText xml:space="preserve"> PAGEREF _Toc239066193 \h </w:instrText>
         </w:r>
         <w:r>
           <w:rPr>
@@ -1763,7 +1763,7 @@
           <w:noProof/>
         </w:rPr>
       </w:pPr>
-      <w:hyperlink w:anchor="_Toc239065765" w:history="1">
+      <w:hyperlink w:anchor="_Toc239066194" w:history="1">
         <w:r>
           <w:rPr>
             <w:rStyle w:val="Collegamentoipertestuale"/>
@@ -1790,7 +1790,7 @@
             <w:noProof/>
             <w:webHidden/>
           </w:rPr>
-          <w:instrText xml:space="preserve"> PAGEREF _Toc239065765 \h </w:instrText>
+          <w:instrText xml:space="preserve"> PAGEREF _Toc239066194 \h </w:instrText>
         </w:r>
         <w:r>
           <w:rPr>
@@ -1832,7 +1832,7 @@
           <w:noProof/>
         </w:rPr>
       </w:pPr>
-      <w:hyperlink w:anchor="_Toc239065766" w:history="1">
+      <w:hyperlink w:anchor="_Toc239066195" w:history="1">
         <w:r>
           <w:rPr>
             <w:rStyle w:val="Collegamentoipertestuale"/>
@@ -1859,7 +1859,7 @@
             <w:noProof/>
             <w:webHidden/>
           </w:rPr>
-          <w:instrText xml:space="preserve"> PAGEREF _Toc239065766 \h </w:instrText>
+          <w:instrText xml:space="preserve"> PAGEREF _Toc239066195 \h </w:instrText>
         </w:r>
         <w:r>
           <w:rPr>
@@ -1901,7 +1901,7 @@
           <w:noProof/>
         </w:rPr>
       </w:pPr>
-      <w:hyperlink w:anchor="_Toc239065767" w:history="1">
+      <w:hyperlink w:anchor="_Toc239066196" w:history="1">
         <w:r>
           <w:rPr>
             <w:rStyle w:val="Collegamentoipertestuale"/>
@@ -1928,7 +1928,7 @@
             <w:noProof/>
             <w:webHidden/>
           </w:rPr>
-          <w:instrText xml:space="preserve"> PAGEREF _Toc239065767 \h </w:instrText>
+          <w:instrText xml:space="preserve"> PAGEREF _Toc239066196 \h </w:instrText>
         </w:r>
         <w:r>
           <w:rPr>
@@ -1970,7 +1970,7 @@
           <w:noProof/>
         </w:rPr>
       </w:pPr>
-      <w:hyperlink w:anchor="_Toc239065768" w:history="1">
+      <w:hyperlink w:anchor="_Toc239066266" w:history="1">
         <w:r>
           <w:rPr>
             <w:rStyle w:val="Collegamentoipertestuale"/>
@@ -1997,7 +1997,7 @@
             <w:noProof/>
             <w:webHidden/>
           </w:rPr>
-          <w:instrText xml:space="preserve"> PAGEREF _Toc239065768 \h </w:instrText>
+          <w:instrText xml:space="preserve"> PAGEREF _Toc239066266 \h </w:instrText>
         </w:r>
         <w:r>
           <w:rPr>
@@ -2039,7 +2039,7 @@
           <w:noProof/>
         </w:rPr>
       </w:pPr>
-      <w:hyperlink w:anchor="_Toc239065769" w:history="1">
+      <w:hyperlink w:anchor="_Toc239066267" w:history="1">
         <w:r>
           <w:rPr>
             <w:rStyle w:val="Collegamentoipertestuale"/>
@@ -2066,7 +2066,7 @@
             <w:noProof/>
             <w:webHidden/>
           </w:rPr>
-          <w:instrText xml:space="preserve"> PAGEREF _Toc239065769 \h </w:instrText>
+          <w:instrText xml:space="preserve"> PAGEREF _Toc239066267 \h </w:instrText>
         </w:r>
         <w:r>
           <w:rPr>
@@ -2108,7 +2108,7 @@
           <w:noProof/>
         </w:rPr>
       </w:pPr>
-      <w:hyperlink w:anchor="_Toc239065770" w:history="1">
+      <w:hyperlink w:anchor="_Toc239066268" w:history="1">
         <w:r>
           <w:rPr>
             <w:rStyle w:val="Collegamentoipertestuale"/>
@@ -2135,7 +2135,7 @@
             <w:noProof/>
             <w:webHidden/>
           </w:rPr>
-          <w:instrText xml:space="preserve"> PAGEREF _Toc239065770 \h </w:instrText>
+          <w:instrText xml:space="preserve"> PAGEREF _Toc239066268 \h </w:instrText>
         </w:r>
         <w:r>
           <w:rPr>
@@ -2177,7 +2177,7 @@
           <w:noProof/>
         </w:rPr>
       </w:pPr>
-      <w:hyperlink w:anchor="_Toc239065771" w:history="1">
+      <w:hyperlink w:anchor="_Toc239066269" w:history="1">
         <w:r>
           <w:rPr>
             <w:rStyle w:val="Collegamentoipertestuale"/>
@@ -2204,7 +2204,7 @@
             <w:noProof/>
             <w:webHidden/>
           </w:rPr>
-          <w:instrText xml:space="preserve"> PAGEREF _Toc239065771 \h </w:instrText>
+          <w:instrText xml:space="preserve"> PAGEREF _Toc239066269 \h </w:instrText>
         </w:r>
         <w:r>
           <w:rPr>
@@ -2246,7 +2246,7 @@
           <w:noProof/>
         </w:rPr>
       </w:pPr>
-      <w:hyperlink w:anchor="_Toc239065772" w:history="1">
+      <w:hyperlink w:anchor="_Toc239066270" w:history="1">
         <w:r>
           <w:rPr>
             <w:rStyle w:val="Collegamentoipertestuale"/>
@@ -2273,7 +2273,7 @@
             <w:noProof/>
             <w:webHidden/>
           </w:rPr>
-          <w:instrText xml:space="preserve"> PAGEREF _Toc239065772 \h </w:instrText>
+          <w:instrText xml:space="preserve"> PAGEREF _Toc239066270 \h </w:instrText>
         </w:r>
         <w:r>
           <w:rPr>
@@ -2315,7 +2315,7 @@
           <w:noProof/>
         </w:rPr>
       </w:pPr>
-      <w:hyperlink w:anchor="_Toc239065773" w:history="1">
+      <w:hyperlink w:anchor="_Toc239066271" w:history="1">
         <w:r>
           <w:rPr>
             <w:rStyle w:val="Collegamentoipertestuale"/>
@@ -2342,7 +2342,7 @@
             <w:noProof/>
             <w:webHidden/>
           </w:rPr>
-          <w:instrText xml:space="preserve"> PAGEREF _Toc239065773 \h </w:instrText>
+          <w:instrText xml:space="preserve"> PAGEREF _Toc239066271 \h </w:instrText>
         </w:r>
         <w:r>
           <w:rPr>
@@ -2384,7 +2384,7 @@
           <w:noProof/>
         </w:rPr>
       </w:pPr>
-      <w:hyperlink w:anchor="_Toc239065774" w:history="1">
+      <w:hyperlink w:anchor="_Toc239066272" w:history="1">
         <w:r>
           <w:rPr>
             <w:rStyle w:val="Collegamentoipertestuale"/>
@@ -2411,7 +2411,7 @@
             <w:noProof/>
             <w:webHidden/>
           </w:rPr>
-          <w:instrText xml:space="preserve"> PAGEREF _Toc239065774 \h </w:instrText>
+          <w:instrText xml:space="preserve"> PAGEREF _Toc239066272 \h </w:instrText>
         </w:r>
         <w:r>
           <w:rPr>
@@ -2453,7 +2453,7 @@
           <w:noProof/>
         </w:rPr>
       </w:pPr>
-      <w:hyperlink w:anchor="_Toc239065775" w:history="1">
+      <w:hyperlink w:anchor="_Toc239066273" w:history="1">
         <w:r>
           <w:rPr>
             <w:rStyle w:val="Collegamentoipertestuale"/>
@@ -2480,7 +2480,7 @@
             <w:noProof/>
             <w:webHidden/>
           </w:rPr>
-          <w:instrText xml:space="preserve"> PAGEREF _Toc239065775 \h </w:instrText>
+          <w:instrText xml:space="preserve"> PAGEREF _Toc239066273 \h </w:instrText>
         </w:r>
         <w:r>
           <w:rPr>
@@ -2522,7 +2522,7 @@
           <w:noProof/>
         </w:rPr>
       </w:pPr>
-      <w:hyperlink w:anchor="_Toc239065776" w:history="1">
+      <w:hyperlink w:anchor="_Toc239066274" w:history="1">
         <w:r>
           <w:rPr>
             <w:rStyle w:val="Collegamentoipertestuale"/>
@@ -2549,7 +2549,7 @@
             <w:noProof/>
             <w:webHidden/>
           </w:rPr>
-          <w:instrText xml:space="preserve"> PAGEREF _Toc239065776 \h </w:instrText>
+          <w:instrText xml:space="preserve"> PAGEREF _Toc239066274 \h </w:instrText>
         </w:r>
         <w:r>
           <w:rPr>
@@ -2591,7 +2591,7 @@
           <w:noProof/>
         </w:rPr>
       </w:pPr>
-      <w:hyperlink w:anchor="_Toc239065777" w:history="1">
+      <w:hyperlink w:anchor="_Toc239066275" w:history="1">
         <w:r>
           <w:rPr>
             <w:rStyle w:val="Collegamentoipertestuale"/>
@@ -2618,7 +2618,7 @@
             <w:noProof/>
             <w:webHidden/>
           </w:rPr>
-          <w:instrText xml:space="preserve"> PAGEREF _Toc239065777 \h </w:instrText>
+          <w:instrText xml:space="preserve"> PAGEREF _Toc239066275 \h </w:instrText>
         </w:r>
         <w:r>
           <w:rPr>
@@ -2660,7 +2660,7 @@
           <w:noProof/>
         </w:rPr>
       </w:pPr>
-      <w:hyperlink w:anchor="_Toc239065778" w:history="1">
+      <w:hyperlink w:anchor="_Toc239066276" w:history="1">
         <w:r>
           <w:rPr>
             <w:rStyle w:val="Collegamentoipertestuale"/>
@@ -2687,7 +2687,7 @@
             <w:noProof/>
             <w:webHidden/>
           </w:rPr>
-          <w:instrText xml:space="preserve"> PAGEREF _Toc239065778 \h </w:instrText>
+          <w:instrText xml:space="preserve"> PAGEREF _Toc239066276 \h </w:instrText>
         </w:r>
         <w:r>
           <w:rPr>
@@ -2729,7 +2729,7 @@
           <w:noProof/>
         </w:rPr>
       </w:pPr>
-      <w:hyperlink w:anchor="_Toc239065779" w:history="1">
+      <w:hyperlink w:anchor="_Toc239066277" w:history="1">
         <w:r>
           <w:rPr>
             <w:rStyle w:val="Collegamentoipertestuale"/>
@@ -2756,7 +2756,7 @@
             <w:noProof/>
             <w:webHidden/>
           </w:rPr>
-          <w:instrText xml:space="preserve"> PAGEREF _Toc239065779 \h </w:instrText>
+          <w:instrText xml:space="preserve"> PAGEREF _Toc239066277 \h </w:instrText>
         </w:r>
         <w:r>
           <w:rPr>
@@ -2798,7 +2798,7 @@
           <w:noProof/>
         </w:rPr>
       </w:pPr>
-      <w:hyperlink w:anchor="_Toc239065780" w:history="1">
+      <w:hyperlink w:anchor="_Toc239066278" w:history="1">
         <w:r>
           <w:rPr>
             <w:rStyle w:val="Collegamentoipertestuale"/>
@@ -2825,7 +2825,7 @@
             <w:noProof/>
             <w:webHidden/>
           </w:rPr>
-          <w:instrText xml:space="preserve"> PAGEREF _Toc239065780 \h </w:instrText>
+          <w:instrText xml:space="preserve"> PAGEREF _Toc239066278 \h </w:instrText>
         </w:r>
         <w:r>
           <w:rPr>
@@ -2867,7 +2867,7 @@
           <w:noProof/>
         </w:rPr>
       </w:pPr>
-      <w:hyperlink w:anchor="_Toc239065781" w:history="1">
+      <w:hyperlink w:anchor="_Toc239066279" w:history="1">
         <w:r>
           <w:rPr>
             <w:rStyle w:val="Collegamentoipertestuale"/>
@@ -2894,7 +2894,7 @@
             <w:noProof/>
             <w:webHidden/>
           </w:rPr>
-          <w:instrText xml:space="preserve"> PAGEREF _Toc239065781 \h </w:instrText>
+          <w:instrText xml:space="preserve"> PAGEREF _Toc239066279 \h </w:instrText>
         </w:r>
         <w:r>
           <w:rPr>
@@ -2936,7 +2936,7 @@
           <w:noProof/>
         </w:rPr>
       </w:pPr>
-      <w:hyperlink w:anchor="_Toc239065782" w:history="1">
+      <w:hyperlink w:anchor="_Toc239066280" w:history="1">
         <w:r>
           <w:rPr>
             <w:rStyle w:val="Collegamentoipertestuale"/>
@@ -2963,7 +2963,7 @@
             <w:noProof/>
             <w:webHidden/>
           </w:rPr>
-          <w:instrText xml:space="preserve"> PAGEREF _Toc239065782 \h </w:instrText>
+          <w:instrText xml:space="preserve"> PAGEREF _Toc239066280 \h </w:instrText>
         </w:r>
         <w:r>
           <w:rPr>
@@ -3005,7 +3005,7 @@
           <w:noProof/>
         </w:rPr>
       </w:pPr>
-      <w:hyperlink w:anchor="_Toc239065783" w:history="1">
+      <w:hyperlink w:anchor="_Toc239066281" w:history="1">
         <w:r>
           <w:rPr>
             <w:rStyle w:val="Collegamentoipertestuale"/>
@@ -3032,7 +3032,7 @@
             <w:noProof/>
             <w:webHidden/>
           </w:rPr>
-          <w:instrText xml:space="preserve"> PAGEREF _Toc239065783 \h </w:instrText>
+          <w:instrText xml:space="preserve"> PAGEREF _Toc239066281 \h </w:instrText>
         </w:r>
         <w:r>
           <w:rPr>
@@ -3074,7 +3074,7 @@
           <w:noProof/>
         </w:rPr>
       </w:pPr>
-      <w:hyperlink w:anchor="_Toc239065784" w:history="1">
+      <w:hyperlink w:anchor="_Toc239066282" w:history="1">
         <w:r>
           <w:rPr>
             <w:rStyle w:val="Collegamentoipertestuale"/>
@@ -3101,7 +3101,7 @@
             <w:noProof/>
             <w:webHidden/>
           </w:rPr>
-          <w:instrText xml:space="preserve"> PAGEREF _Toc239065784 \h </w:instrText>
+          <w:instrText xml:space="preserve"> PAGEREF _Toc239066282 \h </w:instrText>
         </w:r>
         <w:r>
           <w:rPr>
@@ -3143,7 +3143,7 @@
           <w:noProof/>
         </w:rPr>
       </w:pPr>
-      <w:hyperlink w:anchor="_Toc239065785" w:history="1">
+      <w:hyperlink w:anchor="_Toc239066283" w:history="1">
         <w:r>
           <w:rPr>
             <w:rStyle w:val="Collegamentoipertestuale"/>
@@ -3170,7 +3170,7 @@
             <w:noProof/>
             <w:webHidden/>
           </w:rPr>
-          <w:instrText xml:space="preserve"> PAGEREF _Toc239065785 \h </w:instrText>
+          <w:instrText xml:space="preserve"> PAGEREF _Toc239066283 \h </w:instrText>
         </w:r>
         <w:r>
           <w:rPr>
@@ -3212,7 +3212,7 @@
           <w:noProof/>
         </w:rPr>
       </w:pPr>
-      <w:hyperlink w:anchor="_Toc239065786" w:history="1">
+      <w:hyperlink w:anchor="_Toc239066284" w:history="1">
         <w:r>
           <w:rPr>
             <w:rStyle w:val="Collegamentoipertestuale"/>
@@ -3239,7 +3239,7 @@
             <w:noProof/>
             <w:webHidden/>
           </w:rPr>
-          <w:instrText xml:space="preserve"> PAGEREF _Toc239065786 \h </w:instrText>
+          <w:instrText xml:space="preserve"> PAGEREF _Toc239066284 \h </w:instrText>
         </w:r>
         <w:r>
           <w:rPr>
@@ -3281,7 +3281,7 @@
           <w:noProof/>
         </w:rPr>
       </w:pPr>
-      <w:hyperlink w:anchor="_Toc239065787" w:history="1">
+      <w:hyperlink w:anchor="_Toc239066285" w:history="1">
         <w:r>
           <w:rPr>
             <w:rStyle w:val="Collegamentoipertestuale"/>
@@ -3308,7 +3308,7 @@
             <w:noProof/>
             <w:webHidden/>
           </w:rPr>
-          <w:instrText xml:space="preserve"> PAGEREF _Toc239065787 \h </w:instrText>
+          <w:instrText xml:space="preserve"> PAGEREF _Toc239066285 \h </w:instrText>
         </w:r>
         <w:r>
           <w:rPr>
@@ -3350,7 +3350,7 @@
           <w:noProof/>
         </w:rPr>
       </w:pPr>
-      <w:hyperlink w:anchor="_Toc239065788" w:history="1">
+      <w:hyperlink w:anchor="_Toc239066286" w:history="1">
         <w:r>
           <w:rPr>
             <w:rStyle w:val="Collegamentoipertestuale"/>
@@ -3377,7 +3377,7 @@
             <w:noProof/>
             <w:webHidden/>
           </w:rPr>
-          <w:instrText xml:space="preserve"> PAGEREF _Toc239065788 \h </w:instrText>
+          <w:instrText xml:space="preserve"> PAGEREF _Toc239066286 \h </w:instrText>
         </w:r>
         <w:r>
           <w:rPr>
@@ -3419,7 +3419,7 @@
           <w:noProof/>
         </w:rPr>
       </w:pPr>
-      <w:hyperlink w:anchor="_Toc239065789" w:history="1">
+      <w:hyperlink w:anchor="_Toc239066287" w:history="1">
         <w:r>
           <w:rPr>
             <w:rStyle w:val="Collegamentoipertestuale"/>
@@ -3446,7 +3446,7 @@
             <w:noProof/>
             <w:webHidden/>
           </w:rPr>
-          <w:instrText xml:space="preserve"> PAGEREF _Toc239065789 \h </w:instrText>
+          <w:instrText xml:space="preserve"> PAGEREF _Toc239066287 \h </w:instrText>
         </w:r>
         <w:r>
           <w:rPr>
@@ -3488,7 +3488,7 @@
           <w:noProof/>
         </w:rPr>
       </w:pPr>
-      <w:hyperlink w:anchor="_Toc239065790" w:history="1">
+      <w:hyperlink w:anchor="_Toc239066288" w:history="1">
         <w:r>
           <w:rPr>
             <w:rStyle w:val="Collegamentoipertestuale"/>
@@ -3515,7 +3515,7 @@
             <w:noProof/>
             <w:webHidden/>
           </w:rPr>
-          <w:instrText xml:space="preserve"> PAGEREF _Toc239065790 \h </w:instrText>
+          <w:instrText xml:space="preserve"> PAGEREF _Toc239066288 \h </w:instrText>
         </w:r>
         <w:r>
           <w:rPr>
@@ -3557,7 +3557,7 @@
           <w:noProof/>
         </w:rPr>
       </w:pPr>
-      <w:hyperlink w:anchor="_Toc239065791" w:history="1">
+      <w:hyperlink w:anchor="_Toc239066289" w:history="1">
         <w:r>
           <w:rPr>
             <w:rStyle w:val="Collegamentoipertestuale"/>
@@ -3584,7 +3584,7 @@
             <w:noProof/>
             <w:webHidden/>
           </w:rPr>
-          <w:instrText xml:space="preserve"> PAGEREF _Toc239065791 \h </w:instrText>
+          <w:instrText xml:space="preserve"> PAGEREF _Toc239066289 \h </w:instrText>
         </w:r>
         <w:r>
           <w:rPr>
@@ -3626,7 +3626,7 @@
           <w:noProof/>
         </w:rPr>
       </w:pPr>
-      <w:hyperlink w:anchor="_Toc239065792" w:history="1">
+      <w:hyperlink w:anchor="_Toc239066290" w:history="1">
         <w:r>
           <w:rPr>
             <w:rStyle w:val="Collegamentoipertestuale"/>
@@ -3653,7 +3653,7 @@
             <w:noProof/>
             <w:webHidden/>
           </w:rPr>
-          <w:instrText xml:space="preserve"> PAGEREF _Toc239065792 \h </w:instrText>
+          <w:instrText xml:space="preserve"> PAGEREF _Toc239066290 \h </w:instrText>
         </w:r>
         <w:r>
           <w:rPr>
@@ -3695,7 +3695,7 @@
           <w:noProof/>
         </w:rPr>
       </w:pPr>
-      <w:hyperlink w:anchor="_Toc239065793" w:history="1">
+      <w:hyperlink w:anchor="_Toc239066291" w:history="1">
         <w:r>
           <w:rPr>
             <w:rStyle w:val="Collegamentoipertestuale"/>
@@ -3722,7 +3722,7 @@
             <w:noProof/>
             <w:webHidden/>
           </w:rPr>
-          <w:instrText xml:space="preserve"> PAGEREF _Toc239065793 \h </w:instrText>
+          <w:instrText xml:space="preserve"> PAGEREF _Toc239066291 \h </w:instrText>
         </w:r>
         <w:r>
           <w:rPr>
@@ -3764,7 +3764,7 @@
           <w:noProof/>
         </w:rPr>
       </w:pPr>
-      <w:hyperlink w:anchor="_Toc239065794" w:history="1">
+      <w:hyperlink w:anchor="_Toc239066292" w:history="1">
         <w:r>
           <w:rPr>
             <w:rStyle w:val="Collegamentoipertestuale"/>
@@ -3791,7 +3791,7 @@
             <w:noProof/>
             <w:webHidden/>
           </w:rPr>
-          <w:instrText xml:space="preserve"> PAGEREF _Toc239065794 \h </w:instrText>
+          <w:instrText xml:space="preserve"> PAGEREF _Toc239066292 \h </w:instrText>
         </w:r>
         <w:r>
           <w:rPr>
@@ -3833,7 +3833,7 @@
           <w:noProof/>
         </w:rPr>
       </w:pPr>
-      <w:hyperlink w:anchor="_Toc239065795" w:history="1">
+      <w:hyperlink w:anchor="_Toc239066293" w:history="1">
         <w:r>
           <w:rPr>
             <w:rStyle w:val="Collegamentoipertestuale"/>
@@ -3860,7 +3860,7 @@
             <w:noProof/>
             <w:webHidden/>
           </w:rPr>
-          <w:instrText xml:space="preserve"> PAGEREF _Toc239065795 \h </w:instrText>
+          <w:instrText xml:space="preserve"> PAGEREF _Toc239066293 \h </w:instrText>
         </w:r>
         <w:r>
           <w:rPr>
@@ -3902,7 +3902,7 @@
           <w:noProof/>
         </w:rPr>
       </w:pPr>
-      <w:hyperlink w:anchor="_Toc239065796" w:history="1">
+      <w:hyperlink w:anchor="_Toc239066294" w:history="1">
         <w:r>
           <w:rPr>
             <w:rStyle w:val="Collegamentoipertestuale"/>
@@ -3929,7 +3929,7 @@
             <w:noProof/>
             <w:webHidden/>
           </w:rPr>
-          <w:instrText xml:space="preserve"> PAGEREF _Toc239065796 \h </w:instrText>
+          <w:instrText xml:space="preserve"> PAGEREF _Toc239066294 \h </w:instrText>
         </w:r>
         <w:r>
           <w:rPr>
@@ -3971,7 +3971,7 @@
           <w:noProof/>
         </w:rPr>
       </w:pPr>
-      <w:hyperlink w:anchor="_Toc239065797" w:history="1">
+      <w:hyperlink w:anchor="_Toc239066295" w:history="1">
         <w:r>
           <w:rPr>
             <w:rStyle w:val="Collegamentoipertestuale"/>
@@ -3998,7 +3998,7 @@
             <w:noProof/>
             <w:webHidden/>
           </w:rPr>
-          <w:instrText xml:space="preserve"> PAGEREF _Toc239065797 \h </w:instrText>
+          <w:instrText xml:space="preserve"> PAGEREF _Toc239066295 \h </w:instrText>
         </w:r>
         <w:r>
           <w:rPr>
@@ -4040,7 +4040,7 @@
           <w:noProof/>
         </w:rPr>
       </w:pPr>
-      <w:hyperlink w:anchor="_Toc239065798" w:history="1">
+      <w:hyperlink w:anchor="_Toc239066296" w:history="1">
         <w:r>
           <w:rPr>
             <w:rStyle w:val="Collegamentoipertestuale"/>
@@ -4068,7 +4068,7 @@
             <w:noProof/>
             <w:webHidden/>
           </w:rPr>
-          <w:instrText xml:space="preserve"> PAGEREF _Toc239065798 \h </w:instrText>
+          <w:instrText xml:space="preserve"> PAGEREF _Toc239066296 \h </w:instrText>
         </w:r>
         <w:r>
           <w:rPr>
@@ -4117,12 +4117,8 @@
       <w:pPr>
         <w:pStyle w:val="Titolo1"/>
       </w:pPr>
-      <w:r>
-        <w:br w:type="page"/>
-      </w:r>
-      <w:bookmarkStart w:id="0" w:name="_Toc239065746"/>
-      <w:r>
-        <w:lastRenderedPageBreak/>
+      <w:bookmarkStart w:id="0" w:name="_Toc239066175"/>
+      <w:r>
         <w:t>Elenco delle figure</w:t>
       </w:r>
       <w:bookmarkEnd w:id="0"/>
@@ -4147,7 +4143,7 @@
       <w:r>
         <w:fldChar w:fldCharType="separate"/>
       </w:r>
-      <w:hyperlink w:anchor="_Toc239065799" w:history="1">
+      <w:hyperlink w:anchor="_Toc239066297" w:history="1">
         <w:r>
           <w:rPr>
             <w:rStyle w:val="Collegamentoipertestuale"/>
@@ -4174,7 +4170,7 @@
             <w:noProof/>
             <w:webHidden/>
           </w:rPr>
-          <w:instrText xml:space="preserve"> PAGEREF _Toc239065799 \h </w:instrText>
+          <w:instrText xml:space="preserve"> PAGEREF _Toc239066297 \h </w:instrText>
         </w:r>
         <w:r>
           <w:rPr>
@@ -4216,7 +4212,7 @@
           <w:noProof/>
         </w:rPr>
       </w:pPr>
-      <w:hyperlink w:anchor="_Toc239065800" w:history="1">
+      <w:hyperlink w:anchor="_Toc239066298" w:history="1">
         <w:r>
           <w:rPr>
             <w:rStyle w:val="Collegamentoipertestuale"/>
@@ -4243,7 +4239,7 @@
             <w:noProof/>
             <w:webHidden/>
           </w:rPr>
-          <w:instrText xml:space="preserve"> PAGEREF _Toc239065800 \h </w:instrText>
+          <w:instrText xml:space="preserve"> PAGEREF _Toc239066298 \h </w:instrText>
         </w:r>
         <w:r>
           <w:rPr>
@@ -4285,7 +4281,7 @@
           <w:noProof/>
         </w:rPr>
       </w:pPr>
-      <w:hyperlink w:anchor="_Toc239065801" w:history="1">
+      <w:hyperlink w:anchor="_Toc239066299" w:history="1">
         <w:r>
           <w:rPr>
             <w:rStyle w:val="Collegamentoipertestuale"/>
@@ -4312,7 +4308,7 @@
             <w:noProof/>
             <w:webHidden/>
           </w:rPr>
-          <w:instrText xml:space="preserve"> PAGEREF _Toc239065801 \h </w:instrText>
+          <w:instrText xml:space="preserve"> PAGEREF _Toc239066299 \h </w:instrText>
         </w:r>
         <w:r>
           <w:rPr>
@@ -4354,7 +4350,7 @@
           <w:noProof/>
         </w:rPr>
       </w:pPr>
-      <w:hyperlink w:anchor="_Toc239065802" w:history="1">
+      <w:hyperlink w:anchor="_Toc239066300" w:history="1">
         <w:r>
           <w:rPr>
             <w:rStyle w:val="Collegamentoipertestuale"/>
@@ -4381,7 +4377,7 @@
             <w:noProof/>
             <w:webHidden/>
           </w:rPr>
-          <w:instrText xml:space="preserve"> PAGEREF _Toc239065802 \h </w:instrText>
+          <w:instrText xml:space="preserve"> PAGEREF _Toc239066300 \h </w:instrText>
         </w:r>
         <w:r>
           <w:rPr>
@@ -4423,7 +4419,7 @@
           <w:noProof/>
         </w:rPr>
       </w:pPr>
-      <w:hyperlink w:anchor="_Toc239065803" w:history="1">
+      <w:hyperlink w:anchor="_Toc239066301" w:history="1">
         <w:r>
           <w:rPr>
             <w:rStyle w:val="Collegamentoipertestuale"/>
@@ -4450,7 +4446,7 @@
             <w:noProof/>
             <w:webHidden/>
           </w:rPr>
-          <w:instrText xml:space="preserve"> PAGEREF _Toc239065803 \h </w:instrText>
+          <w:instrText xml:space="preserve"> PAGEREF _Toc239066301 \h </w:instrText>
         </w:r>
         <w:r>
           <w:rPr>
@@ -4492,7 +4488,7 @@
           <w:noProof/>
         </w:rPr>
       </w:pPr>
-      <w:hyperlink w:anchor="_Toc239065804" w:history="1">
+      <w:hyperlink w:anchor="_Toc239066302" w:history="1">
         <w:r>
           <w:rPr>
             <w:rStyle w:val="Collegamentoipertestuale"/>
@@ -4519,7 +4515,7 @@
             <w:noProof/>
             <w:webHidden/>
           </w:rPr>
-          <w:instrText xml:space="preserve"> PAGEREF _Toc239065804 \h </w:instrText>
+          <w:instrText xml:space="preserve"> PAGEREF _Toc239066302 \h </w:instrText>
         </w:r>
         <w:r>
           <w:rPr>
@@ -4561,7 +4557,7 @@
           <w:noProof/>
         </w:rPr>
       </w:pPr>
-      <w:hyperlink w:anchor="_Toc239065805" w:history="1">
+      <w:hyperlink w:anchor="_Toc239066303" w:history="1">
         <w:r>
           <w:rPr>
             <w:rStyle w:val="Collegamentoipertestuale"/>
@@ -4588,7 +4584,7 @@
             <w:noProof/>
             <w:webHidden/>
           </w:rPr>
-          <w:instrText xml:space="preserve"> PAGEREF _Toc239065805 \h </w:instrText>
+          <w:instrText xml:space="preserve"> PAGEREF _Toc239066303 \h </w:instrText>
         </w:r>
         <w:r>
           <w:rPr>
@@ -4630,7 +4626,7 @@
           <w:noProof/>
         </w:rPr>
       </w:pPr>
-      <w:hyperlink w:anchor="_Toc239065806" w:history="1">
+      <w:hyperlink w:anchor="_Toc239066304" w:history="1">
         <w:r>
           <w:rPr>
             <w:rStyle w:val="Collegamentoipertestuale"/>
@@ -4657,7 +4653,7 @@
             <w:noProof/>
             <w:webHidden/>
           </w:rPr>
-          <w:instrText xml:space="preserve"> PAGEREF _Toc239065806 \h </w:instrText>
+          <w:instrText xml:space="preserve"> PAGEREF _Toc239066304 \h </w:instrText>
         </w:r>
         <w:r>
           <w:rPr>
@@ -4699,7 +4695,7 @@
           <w:noProof/>
         </w:rPr>
       </w:pPr>
-      <w:hyperlink w:anchor="_Toc239065807" w:history="1">
+      <w:hyperlink w:anchor="_Toc239066305" w:history="1">
         <w:r>
           <w:rPr>
             <w:rStyle w:val="Collegamentoipertestuale"/>
@@ -4726,7 +4722,7 @@
             <w:noProof/>
             <w:webHidden/>
           </w:rPr>
-          <w:instrText xml:space="preserve"> PAGEREF _Toc239065807 \h </w:instrText>
+          <w:instrText xml:space="preserve"> PAGEREF _Toc239066305 \h </w:instrText>
         </w:r>
         <w:r>
           <w:rPr>
@@ -4768,7 +4764,7 @@
           <w:noProof/>
         </w:rPr>
       </w:pPr>
-      <w:hyperlink w:anchor="_Toc239065808" w:history="1">
+      <w:hyperlink w:anchor="_Toc239066306" w:history="1">
         <w:r>
           <w:rPr>
             <w:rStyle w:val="Collegamentoipertestuale"/>
@@ -4795,7 +4791,7 @@
             <w:noProof/>
             <w:webHidden/>
           </w:rPr>
-          <w:instrText xml:space="preserve"> PAGEREF _Toc239065808 \h </w:instrText>
+          <w:instrText xml:space="preserve"> PAGEREF _Toc239066306 \h </w:instrText>
         </w:r>
         <w:r>
           <w:rPr>
@@ -4837,7 +4833,7 @@
           <w:noProof/>
         </w:rPr>
       </w:pPr>
-      <w:hyperlink w:anchor="_Toc239065809" w:history="1">
+      <w:hyperlink w:anchor="_Toc239066307" w:history="1">
         <w:r>
           <w:rPr>
             <w:rStyle w:val="Collegamentoipertestuale"/>
@@ -4864,7 +4860,7 @@
             <w:noProof/>
             <w:webHidden/>
           </w:rPr>
-          <w:instrText xml:space="preserve"> PAGEREF _Toc239065809 \h </w:instrText>
+          <w:instrText xml:space="preserve"> PAGEREF _Toc239066307 \h </w:instrText>
         </w:r>
         <w:r>
           <w:rPr>
@@ -4906,7 +4902,7 @@
           <w:noProof/>
         </w:rPr>
       </w:pPr>
-      <w:hyperlink w:anchor="_Toc239065810" w:history="1">
+      <w:hyperlink w:anchor="_Toc239066308" w:history="1">
         <w:r>
           <w:rPr>
             <w:rStyle w:val="Collegamentoipertestuale"/>
@@ -4933,7 +4929,7 @@
             <w:noProof/>
             <w:webHidden/>
           </w:rPr>
-          <w:instrText xml:space="preserve"> PAGEREF _Toc239065810 \h </w:instrText>
+          <w:instrText xml:space="preserve"> PAGEREF _Toc239066308 \h </w:instrText>
         </w:r>
         <w:r>
           <w:rPr>
@@ -4975,7 +4971,7 @@
           <w:noProof/>
         </w:rPr>
       </w:pPr>
-      <w:hyperlink w:anchor="_Toc239065811" w:history="1">
+      <w:hyperlink w:anchor="_Toc239066309" w:history="1">
         <w:r>
           <w:rPr>
             <w:rStyle w:val="Collegamentoipertestuale"/>
@@ -5002,7 +4998,7 @@
             <w:noProof/>
             <w:webHidden/>
           </w:rPr>
-          <w:instrText xml:space="preserve"> PAGEREF _Toc239065811 \h </w:instrText>
+          <w:instrText xml:space="preserve"> PAGEREF _Toc239066309 \h </w:instrText>
         </w:r>
         <w:r>
           <w:rPr>
@@ -5044,7 +5040,7 @@
           <w:noProof/>
         </w:rPr>
       </w:pPr>
-      <w:hyperlink w:anchor="_Toc239065812" w:history="1">
+      <w:hyperlink w:anchor="_Toc239066310" w:history="1">
         <w:r>
           <w:rPr>
             <w:rStyle w:val="Collegamentoipertestuale"/>
@@ -5071,7 +5067,7 @@
             <w:noProof/>
             <w:webHidden/>
           </w:rPr>
-          <w:instrText xml:space="preserve"> PAGEREF _Toc239065812 \h </w:instrText>
+          <w:instrText xml:space="preserve"> PAGEREF _Toc239066310 \h </w:instrText>
         </w:r>
         <w:r>
           <w:rPr>
@@ -5117,7 +5113,7 @@
       <w:r>
         <w:br w:type="page"/>
       </w:r>
-      <w:bookmarkStart w:id="1" w:name="_Toc239065747"/>
+      <w:bookmarkStart w:id="1" w:name="_Toc239066176"/>
       <w:r>
         <w:lastRenderedPageBreak/>
         <w:t>Elenco delle tabelle</w:t>
@@ -5144,7 +5140,7 @@
       <w:r>
         <w:fldChar w:fldCharType="separate"/>
       </w:r>
-      <w:hyperlink w:anchor="_Toc239065813" w:history="1">
+      <w:hyperlink w:anchor="_Toc239066311" w:history="1">
         <w:r>
           <w:rPr>
             <w:rStyle w:val="Collegamentoipertestuale"/>
@@ -5171,7 +5167,7 @@
             <w:noProof/>
             <w:webHidden/>
           </w:rPr>
-          <w:instrText xml:space="preserve"> PAGEREF _Toc239065813 \h </w:instrText>
+          <w:instrText xml:space="preserve"> PAGEREF _Toc239066311 \h </w:instrText>
         </w:r>
         <w:r>
           <w:rPr>
@@ -5213,7 +5209,7 @@
           <w:noProof/>
         </w:rPr>
       </w:pPr>
-      <w:hyperlink w:anchor="_Toc239065814" w:history="1">
+      <w:hyperlink w:anchor="_Toc239066312" w:history="1">
         <w:r>
           <w:rPr>
             <w:rStyle w:val="Collegamentoipertestuale"/>
@@ -5240,7 +5236,7 @@
             <w:noProof/>
             <w:webHidden/>
           </w:rPr>
-          <w:instrText xml:space="preserve"> PAGEREF _Toc239065814 \h </w:instrText>
+          <w:instrText xml:space="preserve"> PAGEREF _Toc239066312 \h </w:instrText>
         </w:r>
         <w:r>
           <w:rPr>
@@ -5301,7 +5297,7 @@
       <w:pPr>
         <w:pStyle w:val="Titolo1"/>
       </w:pPr>
-      <w:bookmarkStart w:id="2" w:name="_Toc239065748"/>
+      <w:bookmarkStart w:id="2" w:name="_Toc239066177"/>
       <w:r>
         <w:lastRenderedPageBreak/>
         <w:t>Capitolo 1 - Introduzione</w:t>
@@ -5312,7 +5308,7 @@
       <w:pPr>
         <w:pStyle w:val="Titolo2"/>
       </w:pPr>
-      <w:bookmarkStart w:id="3" w:name="_Toc239065749"/>
+      <w:bookmarkStart w:id="3" w:name="_Toc239066178"/>
       <w:r>
         <w:t>1.1 Contesto dei sistemi Internet of Things</w:t>
       </w:r>
@@ -5343,7 +5339,7 @@
       <w:pPr>
         <w:pStyle w:val="Titolo2"/>
       </w:pPr>
-      <w:bookmarkStart w:id="4" w:name="_Toc239065750"/>
+      <w:bookmarkStart w:id="4" w:name="_Toc239066179"/>
       <w:r>
         <w:t xml:space="preserve">1.2 </w:t>
       </w:r>
@@ -5393,7 +5389,7 @@
       <w:pPr>
         <w:pStyle w:val="Titolo2"/>
       </w:pPr>
-      <w:bookmarkStart w:id="5" w:name="_Toc239065751"/>
+      <w:bookmarkStart w:id="5" w:name="_Toc239066180"/>
       <w:r>
         <w:t>1.3 Problema della sicurezza IoT</w:t>
       </w:r>
@@ -5419,7 +5415,7 @@
       <w:pPr>
         <w:pStyle w:val="Titolo2"/>
       </w:pPr>
-      <w:bookmarkStart w:id="6" w:name="_Toc239065752"/>
+      <w:bookmarkStart w:id="6" w:name="_Toc239066181"/>
       <w:r>
         <w:t>1.4 Obiettivo e contributo della tesi</w:t>
       </w:r>
@@ -5439,7 +5435,7 @@
       <w:pPr>
         <w:pStyle w:val="Titolo2"/>
       </w:pPr>
-      <w:bookmarkStart w:id="7" w:name="_Toc239065753"/>
+      <w:bookmarkStart w:id="7" w:name="_Toc239066182"/>
       <w:r>
         <w:t>1.5 Struttura dell'elaborato</w:t>
       </w:r>
@@ -5455,7 +5451,7 @@
         <w:pStyle w:val="Titolo1"/>
         <w:pageBreakBefore/>
       </w:pPr>
-      <w:bookmarkStart w:id="8" w:name="_Toc239065754"/>
+      <w:bookmarkStart w:id="8" w:name="_Toc239066183"/>
       <w:r>
         <w:lastRenderedPageBreak/>
         <w:t>Capitolo 2 - Stato dell'arte</w:t>
@@ -5466,7 +5462,7 @@
       <w:pPr>
         <w:pStyle w:val="Titolo2"/>
       </w:pPr>
-      <w:bookmarkStart w:id="9" w:name="_Toc239065755"/>
+      <w:bookmarkStart w:id="9" w:name="_Toc239066184"/>
       <w:r>
         <w:t>2.1 Architetture IoT</w:t>
       </w:r>
@@ -5548,7 +5544,7 @@
       <w:pPr>
         <w:pStyle w:val="Titolo2"/>
       </w:pPr>
-      <w:bookmarkStart w:id="10" w:name="_Toc239065756"/>
+      <w:bookmarkStart w:id="10" w:name="_Toc239066185"/>
       <w:r>
         <w:t>2.2 Protocolli e comunicazione</w:t>
       </w:r>
@@ -5578,7 +5574,7 @@
       <w:pPr>
         <w:pStyle w:val="Titolo2"/>
       </w:pPr>
-      <w:bookmarkStart w:id="11" w:name="_Toc239065757"/>
+      <w:bookmarkStart w:id="11" w:name="_Toc239066186"/>
       <w:r>
         <w:t>2.3 Vulnerabilità tipiche</w:t>
       </w:r>
@@ -5593,7 +5589,7 @@
       <w:pPr>
         <w:pStyle w:val="Titolo2"/>
       </w:pPr>
-      <w:bookmarkStart w:id="12" w:name="_Toc239065758"/>
+      <w:bookmarkStart w:id="12" w:name="_Toc239066187"/>
       <w:r>
         <w:t xml:space="preserve">2.4 </w:t>
       </w:r>
@@ -5626,7 +5622,7 @@
       <w:pPr>
         <w:pStyle w:val="Titolo2"/>
       </w:pPr>
-      <w:bookmarkStart w:id="13" w:name="_Toc239065759"/>
+      <w:bookmarkStart w:id="13" w:name="_Toc239066188"/>
       <w:r>
         <w:lastRenderedPageBreak/>
         <w:t xml:space="preserve">2.5 </w:t>
@@ -5657,7 +5653,7 @@
       <w:pPr>
         <w:pStyle w:val="Titolo2"/>
       </w:pPr>
-      <w:bookmarkStart w:id="14" w:name="_Toc239065760"/>
+      <w:bookmarkStart w:id="14" w:name="_Toc239066189"/>
       <w:r>
         <w:t>2.6 Machine learning applicato agli IDS</w:t>
       </w:r>
@@ -5738,7 +5734,7 @@
       <w:pPr>
         <w:pStyle w:val="Titolo2"/>
       </w:pPr>
-      <w:bookmarkStart w:id="15" w:name="_Toc239065761"/>
+      <w:bookmarkStart w:id="15" w:name="_Toc239066190"/>
       <w:r>
         <w:lastRenderedPageBreak/>
         <w:t>2.7 Requisiti di sicurezza in un ambiente IoT</w:t>
@@ -5798,7 +5794,7 @@
       <w:pPr>
         <w:pStyle w:val="Titolo2"/>
       </w:pPr>
-      <w:bookmarkStart w:id="16" w:name="_Toc239065762"/>
+      <w:bookmarkStart w:id="16" w:name="_Toc239066191"/>
       <w:r>
         <w:t>2.8 IDS in architetture edge e cloud</w:t>
       </w:r>
@@ -5857,7 +5853,7 @@
       <w:pPr>
         <w:pStyle w:val="Titolo2"/>
       </w:pPr>
-      <w:bookmarkStart w:id="17" w:name="_Toc239065763"/>
+      <w:bookmarkStart w:id="17" w:name="_Toc239066192"/>
       <w:r>
         <w:t>2.9 Difficoltà specifiche del machine learning per la sicurezza</w:t>
       </w:r>
@@ -5895,7 +5891,7 @@
         <w:pStyle w:val="Titolo1"/>
         <w:pageBreakBefore/>
       </w:pPr>
-      <w:bookmarkStart w:id="18" w:name="_Toc239065764"/>
+      <w:bookmarkStart w:id="18" w:name="_Toc239066193"/>
       <w:r>
         <w:lastRenderedPageBreak/>
         <w:t>Capitolo 3 - Metodologia</w:t>
@@ -5906,7 +5902,7 @@
       <w:pPr>
         <w:pStyle w:val="Titolo2"/>
       </w:pPr>
-      <w:bookmarkStart w:id="19" w:name="_Toc239065765"/>
+      <w:bookmarkStart w:id="19" w:name="_Toc239066194"/>
       <w:r>
         <w:t>3.1 Organizzazione del repository</w:t>
       </w:r>
@@ -5926,7 +5922,7 @@
       <w:pPr>
         <w:pStyle w:val="Titolo2"/>
       </w:pPr>
-      <w:bookmarkStart w:id="20" w:name="_Toc239065766"/>
+      <w:bookmarkStart w:id="20" w:name="_Toc239066195"/>
       <w:r>
         <w:t>3.2 Dataset utilizzato</w:t>
       </w:r>
@@ -5984,7 +5980,7 @@
       <w:pPr>
         <w:pStyle w:val="Titolo2"/>
       </w:pPr>
-      <w:bookmarkStart w:id="21" w:name="_Toc239065767"/>
+      <w:bookmarkStart w:id="21" w:name="_Toc239066196"/>
       <w:r>
         <w:t>3.3 Validazione dei dati</w:t>
       </w:r>
@@ -6074,7 +6070,7 @@
       <w:pPr>
         <w:pStyle w:val="Titolo2"/>
       </w:pPr>
-      <w:bookmarkStart w:id="22" w:name="_Toc239065768"/>
+      <w:bookmarkStart w:id="22" w:name="_Toc239066266"/>
       <w:r>
         <w:t>3.4 Preprocessing e prevenzione del data leakage</w:t>
       </w:r>
@@ -6208,7 +6204,7 @@
       <w:r>
         <w:instrText xml:space="preserve"> TC "</w:instrText>
       </w:r>
-      <w:bookmarkStart w:id="23" w:name="_Toc239065799"/>
+      <w:bookmarkStart w:id="23" w:name="_Toc239066297"/>
       <w:r>
         <w:instrText>Figura 1 - Distribuzione delle classi binarie prima del preprocessing</w:instrText>
       </w:r>
@@ -6282,7 +6278,7 @@
       <w:r>
         <w:instrText xml:space="preserve"> TC "</w:instrText>
       </w:r>
-      <w:bookmarkStart w:id="24" w:name="_Toc239065800"/>
+      <w:bookmarkStart w:id="24" w:name="_Toc239066298"/>
       <w:r>
         <w:instrText>Figura 2 - Distribuzione delle classi binarie dopo il preprocessing</w:instrText>
       </w:r>
@@ -6298,7 +6294,7 @@
       <w:pPr>
         <w:pStyle w:val="Titolo2"/>
       </w:pPr>
-      <w:bookmarkStart w:id="25" w:name="_Toc239065769"/>
+      <w:bookmarkStart w:id="25" w:name="_Toc239066267"/>
       <w:r>
         <w:lastRenderedPageBreak/>
         <w:t>3.5 Split sperimentale</w:t>
@@ -6325,7 +6321,7 @@
       <w:pPr>
         <w:pStyle w:val="Titolo2"/>
       </w:pPr>
-      <w:bookmarkStart w:id="26" w:name="_Toc239065770"/>
+      <w:bookmarkStart w:id="26" w:name="_Toc239066268"/>
       <w:r>
         <w:t>3.6 Modelli baseline</w:t>
       </w:r>
@@ -6382,7 +6378,7 @@
       <w:pPr>
         <w:pStyle w:val="Titolo2"/>
       </w:pPr>
-      <w:bookmarkStart w:id="27" w:name="_Toc239065771"/>
+      <w:bookmarkStart w:id="27" w:name="_Toc239066269"/>
       <w:r>
         <w:t>3.7 Esperimenti estesi</w:t>
       </w:r>
@@ -6423,7 +6419,7 @@
       <w:pPr>
         <w:pStyle w:val="Titolo2"/>
       </w:pPr>
-      <w:bookmarkStart w:id="28" w:name="_Toc239065772"/>
+      <w:bookmarkStart w:id="28" w:name="_Toc239066270"/>
       <w:r>
         <w:t>3.8 Metriche di valutazione</w:t>
       </w:r>
@@ -6463,7 +6459,7 @@
       <w:pPr>
         <w:pStyle w:val="Titolo2"/>
       </w:pPr>
-      <w:bookmarkStart w:id="29" w:name="_Toc239065773"/>
+      <w:bookmarkStart w:id="29" w:name="_Toc239066271"/>
       <w:r>
         <w:t>3.9 Protocollo di esecuzione</w:t>
       </w:r>
@@ -6497,7 +6493,7 @@
       <w:pPr>
         <w:pStyle w:val="Titolo2"/>
       </w:pPr>
-      <w:bookmarkStart w:id="30" w:name="_Toc239065774"/>
+      <w:bookmarkStart w:id="30" w:name="_Toc239066272"/>
       <w:r>
         <w:t>3.10 Gestione degli artefatti</w:t>
       </w:r>
@@ -6530,7 +6526,7 @@
       <w:pPr>
         <w:pStyle w:val="Titolo2"/>
       </w:pPr>
-      <w:bookmarkStart w:id="31" w:name="_Toc239065775"/>
+      <w:bookmarkStart w:id="31" w:name="_Toc239066273"/>
       <w:r>
         <w:t>3.11 Simulazione IoT e dimostrazione embedded</w:t>
       </w:r>
@@ -6597,7 +6593,7 @@
         <w:pStyle w:val="Titolo1"/>
         <w:pageBreakBefore/>
       </w:pPr>
-      <w:bookmarkStart w:id="32" w:name="_Toc239065776"/>
+      <w:bookmarkStart w:id="32" w:name="_Toc239066274"/>
       <w:r>
         <w:lastRenderedPageBreak/>
         <w:t>Capitolo 4 - Risultati sperimentali</w:t>
@@ -6608,7 +6604,7 @@
       <w:pPr>
         <w:pStyle w:val="Titolo2"/>
       </w:pPr>
-      <w:bookmarkStart w:id="33" w:name="_Toc239065777"/>
+      <w:bookmarkStart w:id="33" w:name="_Toc239066275"/>
       <w:r>
         <w:t>4.1 Premessa sui risultati</w:t>
       </w:r>
@@ -6628,7 +6624,7 @@
       <w:pPr>
         <w:pStyle w:val="Titolo2"/>
       </w:pPr>
-      <w:bookmarkStart w:id="34" w:name="_Toc239065778"/>
+      <w:bookmarkStart w:id="34" w:name="_Toc239066276"/>
       <w:r>
         <w:t>4.2 Risultati baseline nella classificazione binaria</w:t>
       </w:r>
@@ -6649,7 +6645,7 @@
       <w:r>
         <w:instrText xml:space="preserve"> TC "</w:instrText>
       </w:r>
-      <w:bookmarkStart w:id="35" w:name="_Toc239065813"/>
+      <w:bookmarkStart w:id="35" w:name="_Toc239066311"/>
       <w:r>
         <w:instrText>Tabella 1 - Prestazioni dei modelli baseline nella classificazione binaria</w:instrText>
       </w:r>
@@ -7407,7 +7403,7 @@
       <w:r>
         <w:instrText xml:space="preserve"> TC "</w:instrText>
       </w:r>
-      <w:bookmarkStart w:id="36" w:name="_Toc239065801"/>
+      <w:bookmarkStart w:id="36" w:name="_Toc239066299"/>
       <w:r>
         <w:instrText>Figura 3 - Confronto dell'accuracy dei modelli baseline nella classificazione binaria</w:instrText>
       </w:r>
@@ -7481,7 +7477,7 @@
       <w:r>
         <w:instrText xml:space="preserve"> TC "</w:instrText>
       </w:r>
-      <w:bookmarkStart w:id="37" w:name="_Toc239065802"/>
+      <w:bookmarkStart w:id="37" w:name="_Toc239066300"/>
       <w:r>
         <w:instrText>Figura 4 - Confronto del Macro F1 dei modelli baseline nella classificazione binaria</w:instrText>
       </w:r>
@@ -7556,7 +7552,7 @@
       <w:r>
         <w:instrText xml:space="preserve"> TC "</w:instrText>
       </w:r>
-      <w:bookmarkStart w:id="38" w:name="_Toc239065803"/>
+      <w:bookmarkStart w:id="38" w:name="_Toc239066301"/>
       <w:r>
         <w:instrText>Figura 5 - Matrice di confusione LightGBM nella classificazione binaria</w:instrText>
       </w:r>
@@ -7572,7 +7568,7 @@
       <w:pPr>
         <w:pStyle w:val="Titolo2"/>
       </w:pPr>
-      <w:bookmarkStart w:id="39" w:name="_Toc239065779"/>
+      <w:bookmarkStart w:id="39" w:name="_Toc239066277"/>
       <w:r>
         <w:t>4.3 Risultati baseline nella classificazione multiclasse</w:t>
       </w:r>
@@ -7593,7 +7589,7 @@
       <w:r>
         <w:instrText xml:space="preserve"> TC "</w:instrText>
       </w:r>
-      <w:bookmarkStart w:id="40" w:name="_Toc239065814"/>
+      <w:bookmarkStart w:id="40" w:name="_Toc239066312"/>
       <w:r>
         <w:instrText>Tabella 2 - Prestazioni dei modelli baseline nella classificazione multiclasse</w:instrText>
       </w:r>
@@ -8356,7 +8352,7 @@
       <w:r>
         <w:instrText xml:space="preserve"> TC "</w:instrText>
       </w:r>
-      <w:bookmarkStart w:id="41" w:name="_Toc239065804"/>
+      <w:bookmarkStart w:id="41" w:name="_Toc239066302"/>
       <w:r>
         <w:instrText>Figura 6 - Confronto dell'accuracy dei modelli baseline nella classificazione multiclasse</w:instrText>
       </w:r>
@@ -8431,7 +8427,7 @@
       <w:r>
         <w:instrText xml:space="preserve"> TC "</w:instrText>
       </w:r>
-      <w:bookmarkStart w:id="42" w:name="_Toc239065805"/>
+      <w:bookmarkStart w:id="42" w:name="_Toc239066303"/>
       <w:r>
         <w:instrText>Figura 7 - Confronto del Macro F1 dei modelli baseline nella classificazione multiclasse</w:instrText>
       </w:r>
@@ -8506,7 +8502,7 @@
       <w:r>
         <w:instrText xml:space="preserve"> TC "</w:instrText>
       </w:r>
-      <w:bookmarkStart w:id="43" w:name="_Toc239065806"/>
+      <w:bookmarkStart w:id="43" w:name="_Toc239066304"/>
       <w:r>
         <w:instrText>Figura 8 - Matrice di confusione LightGBM nella classificazione multiclasse</w:instrText>
       </w:r>
@@ -8522,7 +8518,7 @@
       <w:pPr>
         <w:pStyle w:val="Titolo2"/>
       </w:pPr>
-      <w:bookmarkStart w:id="44" w:name="_Toc239065780"/>
+      <w:bookmarkStart w:id="44" w:name="_Toc239066278"/>
       <w:r>
         <w:t>4.4 Effetto del bilanciamento tramite SMOTE</w:t>
       </w:r>
@@ -8605,7 +8601,7 @@
       <w:r>
         <w:instrText xml:space="preserve"> TC "</w:instrText>
       </w:r>
-      <w:bookmarkStart w:id="45" w:name="_Toc239065807"/>
+      <w:bookmarkStart w:id="45" w:name="_Toc239066305"/>
       <w:r>
         <w:instrText>Figura 9 - Confronto Macro F1 con e senza SMOTE</w:instrText>
       </w:r>
@@ -8621,7 +8617,7 @@
       <w:pPr>
         <w:pStyle w:val="Titolo2"/>
       </w:pPr>
-      <w:bookmarkStart w:id="46" w:name="_Toc239065781"/>
+      <w:bookmarkStart w:id="46" w:name="_Toc239066279"/>
       <w:r>
         <w:t>4.5 Tuning iperparametrico</w:t>
       </w:r>
@@ -8728,7 +8724,7 @@
       <w:r>
         <w:instrText xml:space="preserve"> TC "</w:instrText>
       </w:r>
-      <w:bookmarkStart w:id="47" w:name="_Toc239065808"/>
+      <w:bookmarkStart w:id="47" w:name="_Toc239066306"/>
       <w:r>
         <w:instrText>Figura 10 - Confronto Macro F1 dei modelli sottoposti a tuning binario</w:instrText>
       </w:r>
@@ -8744,7 +8740,7 @@
       <w:pPr>
         <w:pStyle w:val="Titolo2"/>
       </w:pPr>
-      <w:bookmarkStart w:id="48" w:name="_Toc239065782"/>
+      <w:bookmarkStart w:id="48" w:name="_Toc239066280"/>
       <w:r>
         <w:t>4.6 Modelli aggiuntivi: MLPClassifier e Isolation Forest</w:t>
       </w:r>
@@ -8838,7 +8834,7 @@
       <w:r>
         <w:instrText xml:space="preserve"> TC "</w:instrText>
       </w:r>
-      <w:bookmarkStart w:id="49" w:name="_Toc239065809"/>
+      <w:bookmarkStart w:id="49" w:name="_Toc239066307"/>
       <w:r>
         <w:instrText>Figura 11 - Confronto Macro F1 degli esperimenti estesi binari</w:instrText>
       </w:r>
@@ -8913,7 +8909,7 @@
       <w:r>
         <w:instrText xml:space="preserve"> TC "</w:instrText>
       </w:r>
-      <w:bookmarkStart w:id="50" w:name="_Toc239065810"/>
+      <w:bookmarkStart w:id="50" w:name="_Toc239066308"/>
       <w:r>
         <w:instrText>Figura 12 - Confronto Macro F1 degli esperimenti estesi multiclasse</w:instrText>
       </w:r>
@@ -8929,7 +8925,7 @@
       <w:pPr>
         <w:pStyle w:val="Titolo2"/>
       </w:pPr>
-      <w:bookmarkStart w:id="51" w:name="_Toc239065783"/>
+      <w:bookmarkStart w:id="51" w:name="_Toc239066281"/>
       <w:r>
         <w:t>4.7 Interpretabilità dei modelli</w:t>
       </w:r>
@@ -9016,7 +9012,7 @@
       <w:r>
         <w:instrText xml:space="preserve"> TC "</w:instrText>
       </w:r>
-      <w:bookmarkStart w:id="52" w:name="_Toc239065811"/>
+      <w:bookmarkStart w:id="52" w:name="_Toc239066309"/>
       <w:r>
         <w:instrText>Figura 13 - Importanza delle feature nel modello LightGBM binario</w:instrText>
       </w:r>
@@ -9091,7 +9087,7 @@
       <w:r>
         <w:instrText xml:space="preserve"> TC "</w:instrText>
       </w:r>
-      <w:bookmarkStart w:id="53" w:name="_Toc239065812"/>
+      <w:bookmarkStart w:id="53" w:name="_Toc239066310"/>
       <w:r>
         <w:instrText>Figura 14 - Importanza delle feature nel modello LightGBM multiclasse</w:instrText>
       </w:r>
@@ -9107,7 +9103,7 @@
       <w:pPr>
         <w:pStyle w:val="Titolo2"/>
       </w:pPr>
-      <w:bookmarkStart w:id="54" w:name="_Toc239065784"/>
+      <w:bookmarkStart w:id="54" w:name="_Toc239066282"/>
       <w:r>
         <w:t>4.8 Latenza, dimensione e compressione</w:t>
       </w:r>
@@ -9155,7 +9151,7 @@
       <w:pPr>
         <w:pStyle w:val="Titolo2"/>
       </w:pPr>
-      <w:bookmarkStart w:id="55" w:name="_Toc239065785"/>
+      <w:bookmarkStart w:id="55" w:name="_Toc239066283"/>
       <w:r>
         <w:t>4.9 Dimostratore embedded con Wokwi</w:t>
       </w:r>
@@ -9293,7 +9289,7 @@
       <w:pPr>
         <w:pStyle w:val="Titolo2"/>
       </w:pPr>
-      <w:bookmarkStart w:id="56" w:name="_Toc239065786"/>
+      <w:bookmarkStart w:id="56" w:name="_Toc239066284"/>
       <w:r>
         <w:t>4.10 Sintesi degli artefatti prodotti</w:t>
       </w:r>
@@ -9329,7 +9325,7 @@
       <w:pPr>
         <w:pStyle w:val="Titolo2"/>
       </w:pPr>
-      <w:bookmarkStart w:id="57" w:name="_Toc239065787"/>
+      <w:bookmarkStart w:id="57" w:name="_Toc239066285"/>
       <w:r>
         <w:t>4.11 Lettura critica dei risultati</w:t>
       </w:r>
@@ -9374,7 +9370,7 @@
         <w:pStyle w:val="Titolo1"/>
         <w:pageBreakBefore/>
       </w:pPr>
-      <w:bookmarkStart w:id="58" w:name="_Toc239065788"/>
+      <w:bookmarkStart w:id="58" w:name="_Toc239066286"/>
       <w:r>
         <w:t>Capitolo 5 - Discussione e strategie di mitigazione</w:t>
       </w:r>
@@ -9384,7 +9380,7 @@
       <w:pPr>
         <w:pStyle w:val="Titolo2"/>
       </w:pPr>
-      <w:bookmarkStart w:id="59" w:name="_Toc239065789"/>
+      <w:bookmarkStart w:id="59" w:name="_Toc239066287"/>
       <w:r>
         <w:t>5.1 Interpretazione complessiva dei risultati</w:t>
       </w:r>
@@ -9458,7 +9454,7 @@
       <w:pPr>
         <w:pStyle w:val="Titolo2"/>
       </w:pPr>
-      <w:bookmarkStart w:id="60" w:name="_Toc239065790"/>
+      <w:bookmarkStart w:id="60" w:name="_Toc239066288"/>
       <w:r>
         <w:t>5.2 Interpretabilità contro prestazioni</w:t>
       </w:r>
@@ -9509,7 +9505,7 @@
       <w:pPr>
         <w:pStyle w:val="Titolo2"/>
       </w:pPr>
-      <w:bookmarkStart w:id="61" w:name="_Toc239065791"/>
+      <w:bookmarkStart w:id="61" w:name="_Toc239066289"/>
       <w:r>
         <w:t>5.3 Limiti del dataset statico</w:t>
       </w:r>
@@ -9535,7 +9531,7 @@
       <w:pPr>
         <w:pStyle w:val="Titolo2"/>
       </w:pPr>
-      <w:bookmarkStart w:id="62" w:name="_Toc239065792"/>
+      <w:bookmarkStart w:id="62" w:name="_Toc239066290"/>
       <w:r>
         <w:t>5.4 Limiti della simulazione Wokwi</w:t>
       </w:r>
@@ -9574,7 +9570,7 @@
       <w:pPr>
         <w:pStyle w:val="Titolo2"/>
       </w:pPr>
-      <w:bookmarkStart w:id="63" w:name="_Toc239065793"/>
+      <w:bookmarkStart w:id="63" w:name="_Toc239066291"/>
       <w:r>
         <w:t>5.5 Strategie di mitigazione</w:t>
       </w:r>
@@ -9609,7 +9605,7 @@
       <w:pPr>
         <w:pStyle w:val="Titolo2"/>
       </w:pPr>
-      <w:bookmarkStart w:id="64" w:name="_Toc239065794"/>
+      <w:bookmarkStart w:id="64" w:name="_Toc239066292"/>
       <w:r>
         <w:t>5.6 Possibile percorso verso una validazione su hardware reale</w:t>
       </w:r>
@@ -9640,7 +9636,7 @@
       <w:pPr>
         <w:pStyle w:val="Titolo2"/>
       </w:pPr>
-      <w:bookmarkStart w:id="65" w:name="_Toc239065795"/>
+      <w:bookmarkStart w:id="65" w:name="_Toc239066293"/>
       <w:r>
         <w:t>5.7 Indicazioni operative per un IDS IoT</w:t>
       </w:r>
@@ -9682,7 +9678,7 @@
       <w:pPr>
         <w:pStyle w:val="Titolo2"/>
       </w:pPr>
-      <w:bookmarkStart w:id="66" w:name="_Toc239065796"/>
+      <w:bookmarkStart w:id="66" w:name="_Toc239066294"/>
       <w:r>
         <w:t>5.8 Considerazioni etiche e di gestione dei dati</w:t>
       </w:r>
@@ -9710,7 +9706,7 @@
         <w:pStyle w:val="Titolo1"/>
         <w:pageBreakBefore/>
       </w:pPr>
-      <w:bookmarkStart w:id="67" w:name="_Toc239065797"/>
+      <w:bookmarkStart w:id="67" w:name="_Toc239066295"/>
       <w:r>
         <w:t>Capitolo 6 - Conclusioni</w:t>
       </w:r>
@@ -9786,7 +9782,7 @@
           <w:lang w:val="en-US"/>
         </w:rPr>
       </w:pPr>
-      <w:bookmarkStart w:id="68" w:name="_Toc239065798"/>
+      <w:bookmarkStart w:id="68" w:name="_Toc239066296"/>
       <w:r>
         <w:rPr>
           <w:lang w:val="en-US"/>

</xml_diff>

<commit_message>
Update final thesis documents
</commit_message>
<xml_diff>
--- a/thesis/final_thesis.docx
+++ b/thesis/final_thesis.docx
@@ -9264,25 +9264,7 @@
     </w:p>
     <w:p>
       <w:r>
-        <w:t xml:space="preserve">Possiamo vedere nell’output seriale del simulatore che effettua comunque previsioni corrette e presenta errori. La significatività di questo è che mostra che la sequenza altrimenti molto artificiale non rappresenta un adattamento perfetto del dimostratore, come ci si aspetterebbe </w:t>
-      </w:r>
-      <w:r>
-        <w:t>più</w:t>
-      </w:r>
-      <w:r>
-        <w:t xml:space="preserve"> strettamente che la performance di un ensemble (baseline) sia superiormente </w:t>
-      </w:r>
-      <w:r>
-        <w:t>più</w:t>
-      </w:r>
-      <w:r>
-        <w:t xml:space="preserve"> alta rispetto a quando abbiamo usato un modello </w:t>
-      </w:r>
-      <w:r>
-        <w:t>più</w:t>
-      </w:r>
-      <w:r>
-        <w:t xml:space="preserve"> compresso o con prestazioni inferiori per le inferenze finali a partire dall’input.</w:t>
+        <w:t>L’output seriale mostra previsioni generalmente corrette, pur con alcuni errori, indicando che il modello non si adatta perfettamente ai dati e che la baseline ensemble può ottenere prestazioni migliori del modello più complesso.</w:t>
       </w:r>
     </w:p>
     <w:p>
@@ -9308,7 +9290,19 @@
         <w:rPr>
           <w:lang w:val="en-US"/>
         </w:rPr>
-        <w:t>I principali file di metriche sono binary_baseline_metrics.csv, multiclass_baseline_metrics.csv, binary_extended_metrics.csv, multiclass_extended_metrics.csv, smote_comparison.csv, hyperparameter_tuning_results.csv, latency_summary.csv, deployment_analysis.csv ed embedded_logistic_regression_metrics.csv.</w:t>
+        <w:t>I principali file di metriche sono binary_baseline_metrics.csv, multiclass_baseline_metrics.csv, binary_extended_metrics.csv, multiclass_extended_metrics.csv,</w:t>
+      </w:r>
+      <w:r>
+        <w:rPr>
+          <w:lang w:val="en-US"/>
+        </w:rPr>
+        <w:t xml:space="preserve"> </w:t>
+      </w:r>
+      <w:r>
+        <w:rPr>
+          <w:lang w:val="en-US"/>
+        </w:rPr>
+        <w:t>smote_comparison.csv, hyperparameter_tuning_results.csv, latency_summary.csv, deployment_analysis.csv ed embedded_logistic_regression_metrics.csv.</w:t>
       </w:r>
     </w:p>
     <w:p>
@@ -9351,18 +9345,13 @@
         <w:t>e per finire dalla</w:t>
       </w:r>
       <w:r>
-        <w:t xml:space="preserve"> loro somiglianza tra i set di addestramento e di test. È esattamente per questo che il lavoro non afferma che un modello addestrato su TON_IoT possa essere utilizzato così com’è per difendere reti live. Mostra che la pipeline è effettivamente valida e che i modelli apprendono dal dataset considerato attraverso un risultato sperimentale. Per essere convalidato in ambienti reali, sarebbe necessario raccogliere e testare ulteriori dati lungo l’intero ciclo di vita delle implementazioni su </w:t>
-      </w:r>
-      <w:r>
-        <w:t>traffico reale</w:t>
-      </w:r>
-      <w:r>
-        <w:t xml:space="preserve"> e su concetti al di fuori dello spazio delle classi presenti nel training.</w:t>
-      </w:r>
-    </w:p>
-    <w:p>
-      <w:r>
-        <w:t xml:space="preserve">Un altro componente chiave è la prestazione predittiva rispetto all’operatività. Un IDS ad alta accuratezza può comunque presentare importanti falsi positivi o falsi negativi. </w:t>
+        <w:t xml:space="preserve"> loro somiglianza tra i set di addestramento e di test. È esattamente per questo che il lavoro non afferma che un modello addestrato su TON_IoT possa essere utilizzato così com’è per difendere reti live. Mostra che la pipeline è effettivamente valida e che i modelli apprendono dal dataset considerato attraverso un risultato sperimentale. Per </w:t>
+      </w:r>
+      <w:r>
+        <w:t>validare il modello in scenari reali, servirebbero ulteriori test su traffico reale</w:t>
+      </w:r>
+      <w:r>
+        <w:t>.</w:t>
       </w:r>
     </w:p>
     <w:p>

</xml_diff>

<commit_message>
Correct final thesis language and terminology
</commit_message>
<xml_diff>
--- a/thesis/final_thesis.docx
+++ b/thesis/final_thesis.docx
@@ -452,7 +452,7 @@
         </w:rPr>
         <w:fldChar w:fldCharType="separate"/>
       </w:r>
-      <w:hyperlink w:anchor="_Toc239066175" w:history="1">
+      <w:hyperlink w:anchor="_Toc239067758" w:history="1">
         <w:r>
           <w:rPr>
             <w:rStyle w:val="Collegamentoipertestuale"/>
@@ -479,7 +479,7 @@
             <w:noProof/>
             <w:webHidden/>
           </w:rPr>
-          <w:instrText xml:space="preserve"> PAGEREF _Toc239066175 \h </w:instrText>
+          <w:instrText xml:space="preserve"> PAGEREF _Toc239067758 \h </w:instrText>
         </w:r>
         <w:r>
           <w:rPr>
@@ -521,7 +521,7 @@
           <w:noProof/>
         </w:rPr>
       </w:pPr>
-      <w:hyperlink w:anchor="_Toc239066176" w:history="1">
+      <w:hyperlink w:anchor="_Toc239067759" w:history="1">
         <w:r>
           <w:rPr>
             <w:rStyle w:val="Collegamentoipertestuale"/>
@@ -548,7 +548,7 @@
             <w:noProof/>
             <w:webHidden/>
           </w:rPr>
-          <w:instrText xml:space="preserve"> PAGEREF _Toc239066176 \h </w:instrText>
+          <w:instrText xml:space="preserve"> PAGEREF _Toc239067759 \h </w:instrText>
         </w:r>
         <w:r>
           <w:rPr>
@@ -590,7 +590,7 @@
           <w:noProof/>
         </w:rPr>
       </w:pPr>
-      <w:hyperlink w:anchor="_Toc239066177" w:history="1">
+      <w:hyperlink w:anchor="_Toc239067760" w:history="1">
         <w:r>
           <w:rPr>
             <w:rStyle w:val="Collegamentoipertestuale"/>
@@ -617,7 +617,7 @@
             <w:noProof/>
             <w:webHidden/>
           </w:rPr>
-          <w:instrText xml:space="preserve"> PAGEREF _Toc239066177 \h </w:instrText>
+          <w:instrText xml:space="preserve"> PAGEREF _Toc239067760 \h </w:instrText>
         </w:r>
         <w:r>
           <w:rPr>
@@ -659,7 +659,7 @@
           <w:noProof/>
         </w:rPr>
       </w:pPr>
-      <w:hyperlink w:anchor="_Toc239066178" w:history="1">
+      <w:hyperlink w:anchor="_Toc239067761" w:history="1">
         <w:r>
           <w:rPr>
             <w:rStyle w:val="Collegamentoipertestuale"/>
@@ -686,7 +686,7 @@
             <w:noProof/>
             <w:webHidden/>
           </w:rPr>
-          <w:instrText xml:space="preserve"> PAGEREF _Toc239066178 \h </w:instrText>
+          <w:instrText xml:space="preserve"> PAGEREF _Toc239067761 \h </w:instrText>
         </w:r>
         <w:r>
           <w:rPr>
@@ -728,7 +728,7 @@
           <w:noProof/>
         </w:rPr>
       </w:pPr>
-      <w:hyperlink w:anchor="_Toc239066179" w:history="1">
+      <w:hyperlink w:anchor="_Toc239067762" w:history="1">
         <w:r>
           <w:rPr>
             <w:rStyle w:val="Collegamentoipertestuale"/>
@@ -755,7 +755,7 @@
             <w:noProof/>
             <w:webHidden/>
           </w:rPr>
-          <w:instrText xml:space="preserve"> PAGEREF _Toc239066179 \h </w:instrText>
+          <w:instrText xml:space="preserve"> PAGEREF _Toc239067762 \h </w:instrText>
         </w:r>
         <w:r>
           <w:rPr>
@@ -797,7 +797,7 @@
           <w:noProof/>
         </w:rPr>
       </w:pPr>
-      <w:hyperlink w:anchor="_Toc239066180" w:history="1">
+      <w:hyperlink w:anchor="_Toc239067763" w:history="1">
         <w:r>
           <w:rPr>
             <w:rStyle w:val="Collegamentoipertestuale"/>
@@ -824,7 +824,7 @@
             <w:noProof/>
             <w:webHidden/>
           </w:rPr>
-          <w:instrText xml:space="preserve"> PAGEREF _Toc239066180 \h </w:instrText>
+          <w:instrText xml:space="preserve"> PAGEREF _Toc239067763 \h </w:instrText>
         </w:r>
         <w:r>
           <w:rPr>
@@ -866,7 +866,7 @@
           <w:noProof/>
         </w:rPr>
       </w:pPr>
-      <w:hyperlink w:anchor="_Toc239066181" w:history="1">
+      <w:hyperlink w:anchor="_Toc239067764" w:history="1">
         <w:r>
           <w:rPr>
             <w:rStyle w:val="Collegamentoipertestuale"/>
@@ -893,7 +893,7 @@
             <w:noProof/>
             <w:webHidden/>
           </w:rPr>
-          <w:instrText xml:space="preserve"> PAGEREF _Toc239066181 \h </w:instrText>
+          <w:instrText xml:space="preserve"> PAGEREF _Toc239067764 \h </w:instrText>
         </w:r>
         <w:r>
           <w:rPr>
@@ -935,7 +935,7 @@
           <w:noProof/>
         </w:rPr>
       </w:pPr>
-      <w:hyperlink w:anchor="_Toc239066182" w:history="1">
+      <w:hyperlink w:anchor="_Toc239067765" w:history="1">
         <w:r>
           <w:rPr>
             <w:rStyle w:val="Collegamentoipertestuale"/>
@@ -962,7 +962,7 @@
             <w:noProof/>
             <w:webHidden/>
           </w:rPr>
-          <w:instrText xml:space="preserve"> PAGEREF _Toc239066182 \h </w:instrText>
+          <w:instrText xml:space="preserve"> PAGEREF _Toc239067765 \h </w:instrText>
         </w:r>
         <w:r>
           <w:rPr>
@@ -1004,7 +1004,7 @@
           <w:noProof/>
         </w:rPr>
       </w:pPr>
-      <w:hyperlink w:anchor="_Toc239066183" w:history="1">
+      <w:hyperlink w:anchor="_Toc239067766" w:history="1">
         <w:r>
           <w:rPr>
             <w:rStyle w:val="Collegamentoipertestuale"/>
@@ -1031,7 +1031,7 @@
             <w:noProof/>
             <w:webHidden/>
           </w:rPr>
-          <w:instrText xml:space="preserve"> PAGEREF _Toc239066183 \h </w:instrText>
+          <w:instrText xml:space="preserve"> PAGEREF _Toc239067766 \h </w:instrText>
         </w:r>
         <w:r>
           <w:rPr>
@@ -1073,7 +1073,7 @@
           <w:noProof/>
         </w:rPr>
       </w:pPr>
-      <w:hyperlink w:anchor="_Toc239066184" w:history="1">
+      <w:hyperlink w:anchor="_Toc239067767" w:history="1">
         <w:r>
           <w:rPr>
             <w:rStyle w:val="Collegamentoipertestuale"/>
@@ -1100,7 +1100,7 @@
             <w:noProof/>
             <w:webHidden/>
           </w:rPr>
-          <w:instrText xml:space="preserve"> PAGEREF _Toc239066184 \h </w:instrText>
+          <w:instrText xml:space="preserve"> PAGEREF _Toc239067767 \h </w:instrText>
         </w:r>
         <w:r>
           <w:rPr>
@@ -1142,7 +1142,7 @@
           <w:noProof/>
         </w:rPr>
       </w:pPr>
-      <w:hyperlink w:anchor="_Toc239066185" w:history="1">
+      <w:hyperlink w:anchor="_Toc239067768" w:history="1">
         <w:r>
           <w:rPr>
             <w:rStyle w:val="Collegamentoipertestuale"/>
@@ -1169,7 +1169,7 @@
             <w:noProof/>
             <w:webHidden/>
           </w:rPr>
-          <w:instrText xml:space="preserve"> PAGEREF _Toc239066185 \h </w:instrText>
+          <w:instrText xml:space="preserve"> PAGEREF _Toc239067768 \h </w:instrText>
         </w:r>
         <w:r>
           <w:rPr>
@@ -1211,7 +1211,7 @@
           <w:noProof/>
         </w:rPr>
       </w:pPr>
-      <w:hyperlink w:anchor="_Toc239066186" w:history="1">
+      <w:hyperlink w:anchor="_Toc239067769" w:history="1">
         <w:r>
           <w:rPr>
             <w:rStyle w:val="Collegamentoipertestuale"/>
@@ -1238,7 +1238,7 @@
             <w:noProof/>
             <w:webHidden/>
           </w:rPr>
-          <w:instrText xml:space="preserve"> PAGEREF _Toc239066186 \h </w:instrText>
+          <w:instrText xml:space="preserve"> PAGEREF _Toc239067769 \h </w:instrText>
         </w:r>
         <w:r>
           <w:rPr>
@@ -1280,7 +1280,7 @@
           <w:noProof/>
         </w:rPr>
       </w:pPr>
-      <w:hyperlink w:anchor="_Toc239066187" w:history="1">
+      <w:hyperlink w:anchor="_Toc239067770" w:history="1">
         <w:r>
           <w:rPr>
             <w:rStyle w:val="Collegamentoipertestuale"/>
@@ -1307,7 +1307,7 @@
             <w:noProof/>
             <w:webHidden/>
           </w:rPr>
-          <w:instrText xml:space="preserve"> PAGEREF _Toc239066187 \h </w:instrText>
+          <w:instrText xml:space="preserve"> PAGEREF _Toc239067770 \h </w:instrText>
         </w:r>
         <w:r>
           <w:rPr>
@@ -1349,7 +1349,7 @@
           <w:noProof/>
         </w:rPr>
       </w:pPr>
-      <w:hyperlink w:anchor="_Toc239066188" w:history="1">
+      <w:hyperlink w:anchor="_Toc239067771" w:history="1">
         <w:r>
           <w:rPr>
             <w:rStyle w:val="Collegamentoipertestuale"/>
@@ -1376,7 +1376,7 @@
             <w:noProof/>
             <w:webHidden/>
           </w:rPr>
-          <w:instrText xml:space="preserve"> PAGEREF _Toc239066188 \h </w:instrText>
+          <w:instrText xml:space="preserve"> PAGEREF _Toc239067771 \h </w:instrText>
         </w:r>
         <w:r>
           <w:rPr>
@@ -1418,7 +1418,7 @@
           <w:noProof/>
         </w:rPr>
       </w:pPr>
-      <w:hyperlink w:anchor="_Toc239066189" w:history="1">
+      <w:hyperlink w:anchor="_Toc239067772" w:history="1">
         <w:r>
           <w:rPr>
             <w:rStyle w:val="Collegamentoipertestuale"/>
@@ -1445,7 +1445,7 @@
             <w:noProof/>
             <w:webHidden/>
           </w:rPr>
-          <w:instrText xml:space="preserve"> PAGEREF _Toc239066189 \h </w:instrText>
+          <w:instrText xml:space="preserve"> PAGEREF _Toc239067772 \h </w:instrText>
         </w:r>
         <w:r>
           <w:rPr>
@@ -1487,7 +1487,7 @@
           <w:noProof/>
         </w:rPr>
       </w:pPr>
-      <w:hyperlink w:anchor="_Toc239066190" w:history="1">
+      <w:hyperlink w:anchor="_Toc239067773" w:history="1">
         <w:r>
           <w:rPr>
             <w:rStyle w:val="Collegamentoipertestuale"/>
@@ -1514,7 +1514,7 @@
             <w:noProof/>
             <w:webHidden/>
           </w:rPr>
-          <w:instrText xml:space="preserve"> PAGEREF _Toc239066190 \h </w:instrText>
+          <w:instrText xml:space="preserve"> PAGEREF _Toc239067773 \h </w:instrText>
         </w:r>
         <w:r>
           <w:rPr>
@@ -1556,7 +1556,7 @@
           <w:noProof/>
         </w:rPr>
       </w:pPr>
-      <w:hyperlink w:anchor="_Toc239066191" w:history="1">
+      <w:hyperlink w:anchor="_Toc239067774" w:history="1">
         <w:r>
           <w:rPr>
             <w:rStyle w:val="Collegamentoipertestuale"/>
@@ -1583,7 +1583,7 @@
             <w:noProof/>
             <w:webHidden/>
           </w:rPr>
-          <w:instrText xml:space="preserve"> PAGEREF _Toc239066191 \h </w:instrText>
+          <w:instrText xml:space="preserve"> PAGEREF _Toc239067774 \h </w:instrText>
         </w:r>
         <w:r>
           <w:rPr>
@@ -1625,7 +1625,7 @@
           <w:noProof/>
         </w:rPr>
       </w:pPr>
-      <w:hyperlink w:anchor="_Toc239066192" w:history="1">
+      <w:hyperlink w:anchor="_Toc239067775" w:history="1">
         <w:r>
           <w:rPr>
             <w:rStyle w:val="Collegamentoipertestuale"/>
@@ -1652,7 +1652,7 @@
             <w:noProof/>
             <w:webHidden/>
           </w:rPr>
-          <w:instrText xml:space="preserve"> PAGEREF _Toc239066192 \h </w:instrText>
+          <w:instrText xml:space="preserve"> PAGEREF _Toc239067775 \h </w:instrText>
         </w:r>
         <w:r>
           <w:rPr>
@@ -1694,7 +1694,7 @@
           <w:noProof/>
         </w:rPr>
       </w:pPr>
-      <w:hyperlink w:anchor="_Toc239066193" w:history="1">
+      <w:hyperlink w:anchor="_Toc239067776" w:history="1">
         <w:r>
           <w:rPr>
             <w:rStyle w:val="Collegamentoipertestuale"/>
@@ -1721,7 +1721,7 @@
             <w:noProof/>
             <w:webHidden/>
           </w:rPr>
-          <w:instrText xml:space="preserve"> PAGEREF _Toc239066193 \h </w:instrText>
+          <w:instrText xml:space="preserve"> PAGEREF _Toc239067776 \h </w:instrText>
         </w:r>
         <w:r>
           <w:rPr>
@@ -1763,7 +1763,7 @@
           <w:noProof/>
         </w:rPr>
       </w:pPr>
-      <w:hyperlink w:anchor="_Toc239066194" w:history="1">
+      <w:hyperlink w:anchor="_Toc239067777" w:history="1">
         <w:r>
           <w:rPr>
             <w:rStyle w:val="Collegamentoipertestuale"/>
@@ -1790,7 +1790,7 @@
             <w:noProof/>
             <w:webHidden/>
           </w:rPr>
-          <w:instrText xml:space="preserve"> PAGEREF _Toc239066194 \h </w:instrText>
+          <w:instrText xml:space="preserve"> PAGEREF _Toc239067777 \h </w:instrText>
         </w:r>
         <w:r>
           <w:rPr>
@@ -1832,7 +1832,7 @@
           <w:noProof/>
         </w:rPr>
       </w:pPr>
-      <w:hyperlink w:anchor="_Toc239066195" w:history="1">
+      <w:hyperlink w:anchor="_Toc239067778" w:history="1">
         <w:r>
           <w:rPr>
             <w:rStyle w:val="Collegamentoipertestuale"/>
@@ -1859,7 +1859,7 @@
             <w:noProof/>
             <w:webHidden/>
           </w:rPr>
-          <w:instrText xml:space="preserve"> PAGEREF _Toc239066195 \h </w:instrText>
+          <w:instrText xml:space="preserve"> PAGEREF _Toc239067778 \h </w:instrText>
         </w:r>
         <w:r>
           <w:rPr>
@@ -1901,7 +1901,7 @@
           <w:noProof/>
         </w:rPr>
       </w:pPr>
-      <w:hyperlink w:anchor="_Toc239066196" w:history="1">
+      <w:hyperlink w:anchor="_Toc239067779" w:history="1">
         <w:r>
           <w:rPr>
             <w:rStyle w:val="Collegamentoipertestuale"/>
@@ -1928,7 +1928,7 @@
             <w:noProof/>
             <w:webHidden/>
           </w:rPr>
-          <w:instrText xml:space="preserve"> PAGEREF _Toc239066196 \h </w:instrText>
+          <w:instrText xml:space="preserve"> PAGEREF _Toc239067779 \h </w:instrText>
         </w:r>
         <w:r>
           <w:rPr>
@@ -1970,7 +1970,7 @@
           <w:noProof/>
         </w:rPr>
       </w:pPr>
-      <w:hyperlink w:anchor="_Toc239066266" w:history="1">
+      <w:hyperlink w:anchor="_Toc239067780" w:history="1">
         <w:r>
           <w:rPr>
             <w:rStyle w:val="Collegamentoipertestuale"/>
@@ -1997,7 +1997,7 @@
             <w:noProof/>
             <w:webHidden/>
           </w:rPr>
-          <w:instrText xml:space="preserve"> PAGEREF _Toc239066266 \h </w:instrText>
+          <w:instrText xml:space="preserve"> PAGEREF _Toc239067780 \h </w:instrText>
         </w:r>
         <w:r>
           <w:rPr>
@@ -2039,7 +2039,7 @@
           <w:noProof/>
         </w:rPr>
       </w:pPr>
-      <w:hyperlink w:anchor="_Toc239066267" w:history="1">
+      <w:hyperlink w:anchor="_Toc239067781" w:history="1">
         <w:r>
           <w:rPr>
             <w:rStyle w:val="Collegamentoipertestuale"/>
@@ -2066,7 +2066,7 @@
             <w:noProof/>
             <w:webHidden/>
           </w:rPr>
-          <w:instrText xml:space="preserve"> PAGEREF _Toc239066267 \h </w:instrText>
+          <w:instrText xml:space="preserve"> PAGEREF _Toc239067781 \h </w:instrText>
         </w:r>
         <w:r>
           <w:rPr>
@@ -2108,7 +2108,7 @@
           <w:noProof/>
         </w:rPr>
       </w:pPr>
-      <w:hyperlink w:anchor="_Toc239066268" w:history="1">
+      <w:hyperlink w:anchor="_Toc239067782" w:history="1">
         <w:r>
           <w:rPr>
             <w:rStyle w:val="Collegamentoipertestuale"/>
@@ -2135,7 +2135,7 @@
             <w:noProof/>
             <w:webHidden/>
           </w:rPr>
-          <w:instrText xml:space="preserve"> PAGEREF _Toc239066268 \h </w:instrText>
+          <w:instrText xml:space="preserve"> PAGEREF _Toc239067782 \h </w:instrText>
         </w:r>
         <w:r>
           <w:rPr>
@@ -2177,7 +2177,7 @@
           <w:noProof/>
         </w:rPr>
       </w:pPr>
-      <w:hyperlink w:anchor="_Toc239066269" w:history="1">
+      <w:hyperlink w:anchor="_Toc239067783" w:history="1">
         <w:r>
           <w:rPr>
             <w:rStyle w:val="Collegamentoipertestuale"/>
@@ -2204,7 +2204,7 @@
             <w:noProof/>
             <w:webHidden/>
           </w:rPr>
-          <w:instrText xml:space="preserve"> PAGEREF _Toc239066269 \h </w:instrText>
+          <w:instrText xml:space="preserve"> PAGEREF _Toc239067783 \h </w:instrText>
         </w:r>
         <w:r>
           <w:rPr>
@@ -2246,7 +2246,7 @@
           <w:noProof/>
         </w:rPr>
       </w:pPr>
-      <w:hyperlink w:anchor="_Toc239066270" w:history="1">
+      <w:hyperlink w:anchor="_Toc239067784" w:history="1">
         <w:r>
           <w:rPr>
             <w:rStyle w:val="Collegamentoipertestuale"/>
@@ -2273,7 +2273,7 @@
             <w:noProof/>
             <w:webHidden/>
           </w:rPr>
-          <w:instrText xml:space="preserve"> PAGEREF _Toc239066270 \h </w:instrText>
+          <w:instrText xml:space="preserve"> PAGEREF _Toc239067784 \h </w:instrText>
         </w:r>
         <w:r>
           <w:rPr>
@@ -2315,7 +2315,7 @@
           <w:noProof/>
         </w:rPr>
       </w:pPr>
-      <w:hyperlink w:anchor="_Toc239066271" w:history="1">
+      <w:hyperlink w:anchor="_Toc239067785" w:history="1">
         <w:r>
           <w:rPr>
             <w:rStyle w:val="Collegamentoipertestuale"/>
@@ -2342,7 +2342,7 @@
             <w:noProof/>
             <w:webHidden/>
           </w:rPr>
-          <w:instrText xml:space="preserve"> PAGEREF _Toc239066271 \h </w:instrText>
+          <w:instrText xml:space="preserve"> PAGEREF _Toc239067785 \h </w:instrText>
         </w:r>
         <w:r>
           <w:rPr>
@@ -2384,7 +2384,7 @@
           <w:noProof/>
         </w:rPr>
       </w:pPr>
-      <w:hyperlink w:anchor="_Toc239066272" w:history="1">
+      <w:hyperlink w:anchor="_Toc239067786" w:history="1">
         <w:r>
           <w:rPr>
             <w:rStyle w:val="Collegamentoipertestuale"/>
@@ -2411,7 +2411,7 @@
             <w:noProof/>
             <w:webHidden/>
           </w:rPr>
-          <w:instrText xml:space="preserve"> PAGEREF _Toc239066272 \h </w:instrText>
+          <w:instrText xml:space="preserve"> PAGEREF _Toc239067786 \h </w:instrText>
         </w:r>
         <w:r>
           <w:rPr>
@@ -2453,7 +2453,7 @@
           <w:noProof/>
         </w:rPr>
       </w:pPr>
-      <w:hyperlink w:anchor="_Toc239066273" w:history="1">
+      <w:hyperlink w:anchor="_Toc239067787" w:history="1">
         <w:r>
           <w:rPr>
             <w:rStyle w:val="Collegamentoipertestuale"/>
@@ -2480,7 +2480,7 @@
             <w:noProof/>
             <w:webHidden/>
           </w:rPr>
-          <w:instrText xml:space="preserve"> PAGEREF _Toc239066273 \h </w:instrText>
+          <w:instrText xml:space="preserve"> PAGEREF _Toc239067787 \h </w:instrText>
         </w:r>
         <w:r>
           <w:rPr>
@@ -2522,7 +2522,7 @@
           <w:noProof/>
         </w:rPr>
       </w:pPr>
-      <w:hyperlink w:anchor="_Toc239066274" w:history="1">
+      <w:hyperlink w:anchor="_Toc239067788" w:history="1">
         <w:r>
           <w:rPr>
             <w:rStyle w:val="Collegamentoipertestuale"/>
@@ -2549,7 +2549,7 @@
             <w:noProof/>
             <w:webHidden/>
           </w:rPr>
-          <w:instrText xml:space="preserve"> PAGEREF _Toc239066274 \h </w:instrText>
+          <w:instrText xml:space="preserve"> PAGEREF _Toc239067788 \h </w:instrText>
         </w:r>
         <w:r>
           <w:rPr>
@@ -2591,7 +2591,7 @@
           <w:noProof/>
         </w:rPr>
       </w:pPr>
-      <w:hyperlink w:anchor="_Toc239066275" w:history="1">
+      <w:hyperlink w:anchor="_Toc239067789" w:history="1">
         <w:r>
           <w:rPr>
             <w:rStyle w:val="Collegamentoipertestuale"/>
@@ -2618,7 +2618,7 @@
             <w:noProof/>
             <w:webHidden/>
           </w:rPr>
-          <w:instrText xml:space="preserve"> PAGEREF _Toc239066275 \h </w:instrText>
+          <w:instrText xml:space="preserve"> PAGEREF _Toc239067789 \h </w:instrText>
         </w:r>
         <w:r>
           <w:rPr>
@@ -2660,7 +2660,7 @@
           <w:noProof/>
         </w:rPr>
       </w:pPr>
-      <w:hyperlink w:anchor="_Toc239066276" w:history="1">
+      <w:hyperlink w:anchor="_Toc239067790" w:history="1">
         <w:r>
           <w:rPr>
             <w:rStyle w:val="Collegamentoipertestuale"/>
@@ -2687,7 +2687,7 @@
             <w:noProof/>
             <w:webHidden/>
           </w:rPr>
-          <w:instrText xml:space="preserve"> PAGEREF _Toc239066276 \h </w:instrText>
+          <w:instrText xml:space="preserve"> PAGEREF _Toc239067790 \h </w:instrText>
         </w:r>
         <w:r>
           <w:rPr>
@@ -2729,7 +2729,7 @@
           <w:noProof/>
         </w:rPr>
       </w:pPr>
-      <w:hyperlink w:anchor="_Toc239066277" w:history="1">
+      <w:hyperlink w:anchor="_Toc239067791" w:history="1">
         <w:r>
           <w:rPr>
             <w:rStyle w:val="Collegamentoipertestuale"/>
@@ -2756,7 +2756,7 @@
             <w:noProof/>
             <w:webHidden/>
           </w:rPr>
-          <w:instrText xml:space="preserve"> PAGEREF _Toc239066277 \h </w:instrText>
+          <w:instrText xml:space="preserve"> PAGEREF _Toc239067791 \h </w:instrText>
         </w:r>
         <w:r>
           <w:rPr>
@@ -2798,7 +2798,7 @@
           <w:noProof/>
         </w:rPr>
       </w:pPr>
-      <w:hyperlink w:anchor="_Toc239066278" w:history="1">
+      <w:hyperlink w:anchor="_Toc239067792" w:history="1">
         <w:r>
           <w:rPr>
             <w:rStyle w:val="Collegamentoipertestuale"/>
@@ -2825,7 +2825,7 @@
             <w:noProof/>
             <w:webHidden/>
           </w:rPr>
-          <w:instrText xml:space="preserve"> PAGEREF _Toc239066278 \h </w:instrText>
+          <w:instrText xml:space="preserve"> PAGEREF _Toc239067792 \h </w:instrText>
         </w:r>
         <w:r>
           <w:rPr>
@@ -2867,7 +2867,7 @@
           <w:noProof/>
         </w:rPr>
       </w:pPr>
-      <w:hyperlink w:anchor="_Toc239066279" w:history="1">
+      <w:hyperlink w:anchor="_Toc239067793" w:history="1">
         <w:r>
           <w:rPr>
             <w:rStyle w:val="Collegamentoipertestuale"/>
@@ -2894,7 +2894,7 @@
             <w:noProof/>
             <w:webHidden/>
           </w:rPr>
-          <w:instrText xml:space="preserve"> PAGEREF _Toc239066279 \h </w:instrText>
+          <w:instrText xml:space="preserve"> PAGEREF _Toc239067793 \h </w:instrText>
         </w:r>
         <w:r>
           <w:rPr>
@@ -2936,7 +2936,7 @@
           <w:noProof/>
         </w:rPr>
       </w:pPr>
-      <w:hyperlink w:anchor="_Toc239066280" w:history="1">
+      <w:hyperlink w:anchor="_Toc239067794" w:history="1">
         <w:r>
           <w:rPr>
             <w:rStyle w:val="Collegamentoipertestuale"/>
@@ -2963,7 +2963,7 @@
             <w:noProof/>
             <w:webHidden/>
           </w:rPr>
-          <w:instrText xml:space="preserve"> PAGEREF _Toc239066280 \h </w:instrText>
+          <w:instrText xml:space="preserve"> PAGEREF _Toc239067794 \h </w:instrText>
         </w:r>
         <w:r>
           <w:rPr>
@@ -3005,7 +3005,7 @@
           <w:noProof/>
         </w:rPr>
       </w:pPr>
-      <w:hyperlink w:anchor="_Toc239066281" w:history="1">
+      <w:hyperlink w:anchor="_Toc239067795" w:history="1">
         <w:r>
           <w:rPr>
             <w:rStyle w:val="Collegamentoipertestuale"/>
@@ -3032,7 +3032,7 @@
             <w:noProof/>
             <w:webHidden/>
           </w:rPr>
-          <w:instrText xml:space="preserve"> PAGEREF _Toc239066281 \h </w:instrText>
+          <w:instrText xml:space="preserve"> PAGEREF _Toc239067795 \h </w:instrText>
         </w:r>
         <w:r>
           <w:rPr>
@@ -3074,7 +3074,7 @@
           <w:noProof/>
         </w:rPr>
       </w:pPr>
-      <w:hyperlink w:anchor="_Toc239066282" w:history="1">
+      <w:hyperlink w:anchor="_Toc239067796" w:history="1">
         <w:r>
           <w:rPr>
             <w:rStyle w:val="Collegamentoipertestuale"/>
@@ -3101,7 +3101,7 @@
             <w:noProof/>
             <w:webHidden/>
           </w:rPr>
-          <w:instrText xml:space="preserve"> PAGEREF _Toc239066282 \h </w:instrText>
+          <w:instrText xml:space="preserve"> PAGEREF _Toc239067796 \h </w:instrText>
         </w:r>
         <w:r>
           <w:rPr>
@@ -3143,7 +3143,7 @@
           <w:noProof/>
         </w:rPr>
       </w:pPr>
-      <w:hyperlink w:anchor="_Toc239066283" w:history="1">
+      <w:hyperlink w:anchor="_Toc239067797" w:history="1">
         <w:r>
           <w:rPr>
             <w:rStyle w:val="Collegamentoipertestuale"/>
@@ -3170,7 +3170,7 @@
             <w:noProof/>
             <w:webHidden/>
           </w:rPr>
-          <w:instrText xml:space="preserve"> PAGEREF _Toc239066283 \h </w:instrText>
+          <w:instrText xml:space="preserve"> PAGEREF _Toc239067797 \h </w:instrText>
         </w:r>
         <w:r>
           <w:rPr>
@@ -3212,7 +3212,7 @@
           <w:noProof/>
         </w:rPr>
       </w:pPr>
-      <w:hyperlink w:anchor="_Toc239066284" w:history="1">
+      <w:hyperlink w:anchor="_Toc239067798" w:history="1">
         <w:r>
           <w:rPr>
             <w:rStyle w:val="Collegamentoipertestuale"/>
@@ -3239,7 +3239,7 @@
             <w:noProof/>
             <w:webHidden/>
           </w:rPr>
-          <w:instrText xml:space="preserve"> PAGEREF _Toc239066284 \h </w:instrText>
+          <w:instrText xml:space="preserve"> PAGEREF _Toc239067798 \h </w:instrText>
         </w:r>
         <w:r>
           <w:rPr>
@@ -3281,7 +3281,7 @@
           <w:noProof/>
         </w:rPr>
       </w:pPr>
-      <w:hyperlink w:anchor="_Toc239066285" w:history="1">
+      <w:hyperlink w:anchor="_Toc239067799" w:history="1">
         <w:r>
           <w:rPr>
             <w:rStyle w:val="Collegamentoipertestuale"/>
@@ -3308,7 +3308,7 @@
             <w:noProof/>
             <w:webHidden/>
           </w:rPr>
-          <w:instrText xml:space="preserve"> PAGEREF _Toc239066285 \h </w:instrText>
+          <w:instrText xml:space="preserve"> PAGEREF _Toc239067799 \h </w:instrText>
         </w:r>
         <w:r>
           <w:rPr>
@@ -3350,7 +3350,7 @@
           <w:noProof/>
         </w:rPr>
       </w:pPr>
-      <w:hyperlink w:anchor="_Toc239066286" w:history="1">
+      <w:hyperlink w:anchor="_Toc239067800" w:history="1">
         <w:r>
           <w:rPr>
             <w:rStyle w:val="Collegamentoipertestuale"/>
@@ -3377,7 +3377,7 @@
             <w:noProof/>
             <w:webHidden/>
           </w:rPr>
-          <w:instrText xml:space="preserve"> PAGEREF _Toc239066286 \h </w:instrText>
+          <w:instrText xml:space="preserve"> PAGEREF _Toc239067800 \h </w:instrText>
         </w:r>
         <w:r>
           <w:rPr>
@@ -3397,7 +3397,7 @@
             <w:noProof/>
             <w:webHidden/>
           </w:rPr>
-          <w:t>30</w:t>
+          <w:t>29</w:t>
         </w:r>
         <w:r>
           <w:rPr>
@@ -3419,7 +3419,7 @@
           <w:noProof/>
         </w:rPr>
       </w:pPr>
-      <w:hyperlink w:anchor="_Toc239066287" w:history="1">
+      <w:hyperlink w:anchor="_Toc239067801" w:history="1">
         <w:r>
           <w:rPr>
             <w:rStyle w:val="Collegamentoipertestuale"/>
@@ -3446,7 +3446,7 @@
             <w:noProof/>
             <w:webHidden/>
           </w:rPr>
-          <w:instrText xml:space="preserve"> PAGEREF _Toc239066287 \h </w:instrText>
+          <w:instrText xml:space="preserve"> PAGEREF _Toc239067801 \h </w:instrText>
         </w:r>
         <w:r>
           <w:rPr>
@@ -3466,7 +3466,7 @@
             <w:noProof/>
             <w:webHidden/>
           </w:rPr>
-          <w:t>30</w:t>
+          <w:t>29</w:t>
         </w:r>
         <w:r>
           <w:rPr>
@@ -3488,7 +3488,7 @@
           <w:noProof/>
         </w:rPr>
       </w:pPr>
-      <w:hyperlink w:anchor="_Toc239066288" w:history="1">
+      <w:hyperlink w:anchor="_Toc239067802" w:history="1">
         <w:r>
           <w:rPr>
             <w:rStyle w:val="Collegamentoipertestuale"/>
@@ -3515,7 +3515,7 @@
             <w:noProof/>
             <w:webHidden/>
           </w:rPr>
-          <w:instrText xml:space="preserve"> PAGEREF _Toc239066288 \h </w:instrText>
+          <w:instrText xml:space="preserve"> PAGEREF _Toc239067802 \h </w:instrText>
         </w:r>
         <w:r>
           <w:rPr>
@@ -3535,7 +3535,7 @@
             <w:noProof/>
             <w:webHidden/>
           </w:rPr>
-          <w:t>30</w:t>
+          <w:t>29</w:t>
         </w:r>
         <w:r>
           <w:rPr>
@@ -3557,7 +3557,7 @@
           <w:noProof/>
         </w:rPr>
       </w:pPr>
-      <w:hyperlink w:anchor="_Toc239066289" w:history="1">
+      <w:hyperlink w:anchor="_Toc239067803" w:history="1">
         <w:r>
           <w:rPr>
             <w:rStyle w:val="Collegamentoipertestuale"/>
@@ -3584,7 +3584,7 @@
             <w:noProof/>
             <w:webHidden/>
           </w:rPr>
-          <w:instrText xml:space="preserve"> PAGEREF _Toc239066289 \h </w:instrText>
+          <w:instrText xml:space="preserve"> PAGEREF _Toc239067803 \h </w:instrText>
         </w:r>
         <w:r>
           <w:rPr>
@@ -3604,7 +3604,7 @@
             <w:noProof/>
             <w:webHidden/>
           </w:rPr>
-          <w:t>31</w:t>
+          <w:t>30</w:t>
         </w:r>
         <w:r>
           <w:rPr>
@@ -3626,7 +3626,7 @@
           <w:noProof/>
         </w:rPr>
       </w:pPr>
-      <w:hyperlink w:anchor="_Toc239066290" w:history="1">
+      <w:hyperlink w:anchor="_Toc239067804" w:history="1">
         <w:r>
           <w:rPr>
             <w:rStyle w:val="Collegamentoipertestuale"/>
@@ -3653,7 +3653,7 @@
             <w:noProof/>
             <w:webHidden/>
           </w:rPr>
-          <w:instrText xml:space="preserve"> PAGEREF _Toc239066290 \h </w:instrText>
+          <w:instrText xml:space="preserve"> PAGEREF _Toc239067804 \h </w:instrText>
         </w:r>
         <w:r>
           <w:rPr>
@@ -3673,7 +3673,7 @@
             <w:noProof/>
             <w:webHidden/>
           </w:rPr>
-          <w:t>31</w:t>
+          <w:t>30</w:t>
         </w:r>
         <w:r>
           <w:rPr>
@@ -3695,7 +3695,7 @@
           <w:noProof/>
         </w:rPr>
       </w:pPr>
-      <w:hyperlink w:anchor="_Toc239066291" w:history="1">
+      <w:hyperlink w:anchor="_Toc239067805" w:history="1">
         <w:r>
           <w:rPr>
             <w:rStyle w:val="Collegamentoipertestuale"/>
@@ -3722,7 +3722,7 @@
             <w:noProof/>
             <w:webHidden/>
           </w:rPr>
-          <w:instrText xml:space="preserve"> PAGEREF _Toc239066291 \h </w:instrText>
+          <w:instrText xml:space="preserve"> PAGEREF _Toc239067805 \h </w:instrText>
         </w:r>
         <w:r>
           <w:rPr>
@@ -3742,7 +3742,7 @@
             <w:noProof/>
             <w:webHidden/>
           </w:rPr>
-          <w:t>31</w:t>
+          <w:t>30</w:t>
         </w:r>
         <w:r>
           <w:rPr>
@@ -3764,7 +3764,7 @@
           <w:noProof/>
         </w:rPr>
       </w:pPr>
-      <w:hyperlink w:anchor="_Toc239066292" w:history="1">
+      <w:hyperlink w:anchor="_Toc239067806" w:history="1">
         <w:r>
           <w:rPr>
             <w:rStyle w:val="Collegamentoipertestuale"/>
@@ -3791,7 +3791,7 @@
             <w:noProof/>
             <w:webHidden/>
           </w:rPr>
-          <w:instrText xml:space="preserve"> PAGEREF _Toc239066292 \h </w:instrText>
+          <w:instrText xml:space="preserve"> PAGEREF _Toc239067806 \h </w:instrText>
         </w:r>
         <w:r>
           <w:rPr>
@@ -3811,7 +3811,7 @@
             <w:noProof/>
             <w:webHidden/>
           </w:rPr>
-          <w:t>32</w:t>
+          <w:t>31</w:t>
         </w:r>
         <w:r>
           <w:rPr>
@@ -3833,7 +3833,7 @@
           <w:noProof/>
         </w:rPr>
       </w:pPr>
-      <w:hyperlink w:anchor="_Toc239066293" w:history="1">
+      <w:hyperlink w:anchor="_Toc239067807" w:history="1">
         <w:r>
           <w:rPr>
             <w:rStyle w:val="Collegamentoipertestuale"/>
@@ -3860,7 +3860,7 @@
             <w:noProof/>
             <w:webHidden/>
           </w:rPr>
-          <w:instrText xml:space="preserve"> PAGEREF _Toc239066293 \h </w:instrText>
+          <w:instrText xml:space="preserve"> PAGEREF _Toc239067807 \h </w:instrText>
         </w:r>
         <w:r>
           <w:rPr>
@@ -3880,7 +3880,7 @@
             <w:noProof/>
             <w:webHidden/>
           </w:rPr>
-          <w:t>33</w:t>
+          <w:t>32</w:t>
         </w:r>
         <w:r>
           <w:rPr>
@@ -3902,7 +3902,7 @@
           <w:noProof/>
         </w:rPr>
       </w:pPr>
-      <w:hyperlink w:anchor="_Toc239066294" w:history="1">
+      <w:hyperlink w:anchor="_Toc239067808" w:history="1">
         <w:r>
           <w:rPr>
             <w:rStyle w:val="Collegamentoipertestuale"/>
@@ -3929,7 +3929,7 @@
             <w:noProof/>
             <w:webHidden/>
           </w:rPr>
-          <w:instrText xml:space="preserve"> PAGEREF _Toc239066294 \h </w:instrText>
+          <w:instrText xml:space="preserve"> PAGEREF _Toc239067808 \h </w:instrText>
         </w:r>
         <w:r>
           <w:rPr>
@@ -3949,7 +3949,7 @@
             <w:noProof/>
             <w:webHidden/>
           </w:rPr>
-          <w:t>33</w:t>
+          <w:t>32</w:t>
         </w:r>
         <w:r>
           <w:rPr>
@@ -3971,7 +3971,7 @@
           <w:noProof/>
         </w:rPr>
       </w:pPr>
-      <w:hyperlink w:anchor="_Toc239066295" w:history="1">
+      <w:hyperlink w:anchor="_Toc239067809" w:history="1">
         <w:r>
           <w:rPr>
             <w:rStyle w:val="Collegamentoipertestuale"/>
@@ -3998,7 +3998,7 @@
             <w:noProof/>
             <w:webHidden/>
           </w:rPr>
-          <w:instrText xml:space="preserve"> PAGEREF _Toc239066295 \h </w:instrText>
+          <w:instrText xml:space="preserve"> PAGEREF _Toc239067809 \h </w:instrText>
         </w:r>
         <w:r>
           <w:rPr>
@@ -4018,7 +4018,7 @@
             <w:noProof/>
             <w:webHidden/>
           </w:rPr>
-          <w:t>34</w:t>
+          <w:t>33</w:t>
         </w:r>
         <w:r>
           <w:rPr>
@@ -4040,7 +4040,7 @@
           <w:noProof/>
         </w:rPr>
       </w:pPr>
-      <w:hyperlink w:anchor="_Toc239066296" w:history="1">
+      <w:hyperlink w:anchor="_Toc239067810" w:history="1">
         <w:r>
           <w:rPr>
             <w:rStyle w:val="Collegamentoipertestuale"/>
@@ -4068,7 +4068,7 @@
             <w:noProof/>
             <w:webHidden/>
           </w:rPr>
-          <w:instrText xml:space="preserve"> PAGEREF _Toc239066296 \h </w:instrText>
+          <w:instrText xml:space="preserve"> PAGEREF _Toc239067810 \h </w:instrText>
         </w:r>
         <w:r>
           <w:rPr>
@@ -4088,7 +4088,7 @@
             <w:noProof/>
             <w:webHidden/>
           </w:rPr>
-          <w:t>35</w:t>
+          <w:t>34</w:t>
         </w:r>
         <w:r>
           <w:rPr>
@@ -4117,7 +4117,7 @@
       <w:pPr>
         <w:pStyle w:val="Titolo1"/>
       </w:pPr>
-      <w:bookmarkStart w:id="0" w:name="_Toc239066175"/>
+      <w:bookmarkStart w:id="0" w:name="_Toc239067758"/>
       <w:r>
         <w:t>Elenco delle figure</w:t>
       </w:r>
@@ -4143,7 +4143,7 @@
       <w:r>
         <w:fldChar w:fldCharType="separate"/>
       </w:r>
-      <w:hyperlink w:anchor="_Toc239066297" w:history="1">
+      <w:hyperlink w:anchor="_Toc239067811" w:history="1">
         <w:r>
           <w:rPr>
             <w:rStyle w:val="Collegamentoipertestuale"/>
@@ -4170,7 +4170,7 @@
             <w:noProof/>
             <w:webHidden/>
           </w:rPr>
-          <w:instrText xml:space="preserve"> PAGEREF _Toc239066297 \h </w:instrText>
+          <w:instrText xml:space="preserve"> PAGEREF _Toc239067811 \h </w:instrText>
         </w:r>
         <w:r>
           <w:rPr>
@@ -4212,7 +4212,7 @@
           <w:noProof/>
         </w:rPr>
       </w:pPr>
-      <w:hyperlink w:anchor="_Toc239066298" w:history="1">
+      <w:hyperlink w:anchor="_Toc239067812" w:history="1">
         <w:r>
           <w:rPr>
             <w:rStyle w:val="Collegamentoipertestuale"/>
@@ -4239,7 +4239,7 @@
             <w:noProof/>
             <w:webHidden/>
           </w:rPr>
-          <w:instrText xml:space="preserve"> PAGEREF _Toc239066298 \h </w:instrText>
+          <w:instrText xml:space="preserve"> PAGEREF _Toc239067812 \h </w:instrText>
         </w:r>
         <w:r>
           <w:rPr>
@@ -4281,7 +4281,7 @@
           <w:noProof/>
         </w:rPr>
       </w:pPr>
-      <w:hyperlink w:anchor="_Toc239066299" w:history="1">
+      <w:hyperlink w:anchor="_Toc239067813" w:history="1">
         <w:r>
           <w:rPr>
             <w:rStyle w:val="Collegamentoipertestuale"/>
@@ -4308,7 +4308,7 @@
             <w:noProof/>
             <w:webHidden/>
           </w:rPr>
-          <w:instrText xml:space="preserve"> PAGEREF _Toc239066299 \h </w:instrText>
+          <w:instrText xml:space="preserve"> PAGEREF _Toc239067813 \h </w:instrText>
         </w:r>
         <w:r>
           <w:rPr>
@@ -4350,7 +4350,7 @@
           <w:noProof/>
         </w:rPr>
       </w:pPr>
-      <w:hyperlink w:anchor="_Toc239066300" w:history="1">
+      <w:hyperlink w:anchor="_Toc239067814" w:history="1">
         <w:r>
           <w:rPr>
             <w:rStyle w:val="Collegamentoipertestuale"/>
@@ -4377,7 +4377,7 @@
             <w:noProof/>
             <w:webHidden/>
           </w:rPr>
-          <w:instrText xml:space="preserve"> PAGEREF _Toc239066300 \h </w:instrText>
+          <w:instrText xml:space="preserve"> PAGEREF _Toc239067814 \h </w:instrText>
         </w:r>
         <w:r>
           <w:rPr>
@@ -4419,7 +4419,7 @@
           <w:noProof/>
         </w:rPr>
       </w:pPr>
-      <w:hyperlink w:anchor="_Toc239066301" w:history="1">
+      <w:hyperlink w:anchor="_Toc239067815" w:history="1">
         <w:r>
           <w:rPr>
             <w:rStyle w:val="Collegamentoipertestuale"/>
@@ -4446,7 +4446,7 @@
             <w:noProof/>
             <w:webHidden/>
           </w:rPr>
-          <w:instrText xml:space="preserve"> PAGEREF _Toc239066301 \h </w:instrText>
+          <w:instrText xml:space="preserve"> PAGEREF _Toc239067815 \h </w:instrText>
         </w:r>
         <w:r>
           <w:rPr>
@@ -4488,7 +4488,7 @@
           <w:noProof/>
         </w:rPr>
       </w:pPr>
-      <w:hyperlink w:anchor="_Toc239066302" w:history="1">
+      <w:hyperlink w:anchor="_Toc239067816" w:history="1">
         <w:r>
           <w:rPr>
             <w:rStyle w:val="Collegamentoipertestuale"/>
@@ -4515,7 +4515,7 @@
             <w:noProof/>
             <w:webHidden/>
           </w:rPr>
-          <w:instrText xml:space="preserve"> PAGEREF _Toc239066302 \h </w:instrText>
+          <w:instrText xml:space="preserve"> PAGEREF _Toc239067816 \h </w:instrText>
         </w:r>
         <w:r>
           <w:rPr>
@@ -4557,7 +4557,7 @@
           <w:noProof/>
         </w:rPr>
       </w:pPr>
-      <w:hyperlink w:anchor="_Toc239066303" w:history="1">
+      <w:hyperlink w:anchor="_Toc239067817" w:history="1">
         <w:r>
           <w:rPr>
             <w:rStyle w:val="Collegamentoipertestuale"/>
@@ -4584,7 +4584,7 @@
             <w:noProof/>
             <w:webHidden/>
           </w:rPr>
-          <w:instrText xml:space="preserve"> PAGEREF _Toc239066303 \h </w:instrText>
+          <w:instrText xml:space="preserve"> PAGEREF _Toc239067817 \h </w:instrText>
         </w:r>
         <w:r>
           <w:rPr>
@@ -4626,7 +4626,7 @@
           <w:noProof/>
         </w:rPr>
       </w:pPr>
-      <w:hyperlink w:anchor="_Toc239066304" w:history="1">
+      <w:hyperlink w:anchor="_Toc239067818" w:history="1">
         <w:r>
           <w:rPr>
             <w:rStyle w:val="Collegamentoipertestuale"/>
@@ -4653,7 +4653,7 @@
             <w:noProof/>
             <w:webHidden/>
           </w:rPr>
-          <w:instrText xml:space="preserve"> PAGEREF _Toc239066304 \h </w:instrText>
+          <w:instrText xml:space="preserve"> PAGEREF _Toc239067818 \h </w:instrText>
         </w:r>
         <w:r>
           <w:rPr>
@@ -4695,7 +4695,7 @@
           <w:noProof/>
         </w:rPr>
       </w:pPr>
-      <w:hyperlink w:anchor="_Toc239066305" w:history="1">
+      <w:hyperlink w:anchor="_Toc239067819" w:history="1">
         <w:r>
           <w:rPr>
             <w:rStyle w:val="Collegamentoipertestuale"/>
@@ -4722,7 +4722,7 @@
             <w:noProof/>
             <w:webHidden/>
           </w:rPr>
-          <w:instrText xml:space="preserve"> PAGEREF _Toc239066305 \h </w:instrText>
+          <w:instrText xml:space="preserve"> PAGEREF _Toc239067819 \h </w:instrText>
         </w:r>
         <w:r>
           <w:rPr>
@@ -4764,7 +4764,7 @@
           <w:noProof/>
         </w:rPr>
       </w:pPr>
-      <w:hyperlink w:anchor="_Toc239066306" w:history="1">
+      <w:hyperlink w:anchor="_Toc239067820" w:history="1">
         <w:r>
           <w:rPr>
             <w:rStyle w:val="Collegamentoipertestuale"/>
@@ -4791,7 +4791,7 @@
             <w:noProof/>
             <w:webHidden/>
           </w:rPr>
-          <w:instrText xml:space="preserve"> PAGEREF _Toc239066306 \h </w:instrText>
+          <w:instrText xml:space="preserve"> PAGEREF _Toc239067820 \h </w:instrText>
         </w:r>
         <w:r>
           <w:rPr>
@@ -4833,7 +4833,7 @@
           <w:noProof/>
         </w:rPr>
       </w:pPr>
-      <w:hyperlink w:anchor="_Toc239066307" w:history="1">
+      <w:hyperlink w:anchor="_Toc239067821" w:history="1">
         <w:r>
           <w:rPr>
             <w:rStyle w:val="Collegamentoipertestuale"/>
@@ -4860,7 +4860,7 @@
             <w:noProof/>
             <w:webHidden/>
           </w:rPr>
-          <w:instrText xml:space="preserve"> PAGEREF _Toc239066307 \h </w:instrText>
+          <w:instrText xml:space="preserve"> PAGEREF _Toc239067821 \h </w:instrText>
         </w:r>
         <w:r>
           <w:rPr>
@@ -4902,7 +4902,7 @@
           <w:noProof/>
         </w:rPr>
       </w:pPr>
-      <w:hyperlink w:anchor="_Toc239066308" w:history="1">
+      <w:hyperlink w:anchor="_Toc239067822" w:history="1">
         <w:r>
           <w:rPr>
             <w:rStyle w:val="Collegamentoipertestuale"/>
@@ -4929,7 +4929,7 @@
             <w:noProof/>
             <w:webHidden/>
           </w:rPr>
-          <w:instrText xml:space="preserve"> PAGEREF _Toc239066308 \h </w:instrText>
+          <w:instrText xml:space="preserve"> PAGEREF _Toc239067822 \h </w:instrText>
         </w:r>
         <w:r>
           <w:rPr>
@@ -4971,7 +4971,7 @@
           <w:noProof/>
         </w:rPr>
       </w:pPr>
-      <w:hyperlink w:anchor="_Toc239066309" w:history="1">
+      <w:hyperlink w:anchor="_Toc239067823" w:history="1">
         <w:r>
           <w:rPr>
             <w:rStyle w:val="Collegamentoipertestuale"/>
@@ -4998,7 +4998,7 @@
             <w:noProof/>
             <w:webHidden/>
           </w:rPr>
-          <w:instrText xml:space="preserve"> PAGEREF _Toc239066309 \h </w:instrText>
+          <w:instrText xml:space="preserve"> PAGEREF _Toc239067823 \h </w:instrText>
         </w:r>
         <w:r>
           <w:rPr>
@@ -5040,7 +5040,7 @@
           <w:noProof/>
         </w:rPr>
       </w:pPr>
-      <w:hyperlink w:anchor="_Toc239066310" w:history="1">
+      <w:hyperlink w:anchor="_Toc239067824" w:history="1">
         <w:r>
           <w:rPr>
             <w:rStyle w:val="Collegamentoipertestuale"/>
@@ -5067,7 +5067,7 @@
             <w:noProof/>
             <w:webHidden/>
           </w:rPr>
-          <w:instrText xml:space="preserve"> PAGEREF _Toc239066310 \h </w:instrText>
+          <w:instrText xml:space="preserve"> PAGEREF _Toc239067824 \h </w:instrText>
         </w:r>
         <w:r>
           <w:rPr>
@@ -5113,7 +5113,7 @@
       <w:r>
         <w:br w:type="page"/>
       </w:r>
-      <w:bookmarkStart w:id="1" w:name="_Toc239066176"/>
+      <w:bookmarkStart w:id="1" w:name="_Toc239067759"/>
       <w:r>
         <w:lastRenderedPageBreak/>
         <w:t>Elenco delle tabelle</w:t>
@@ -5140,7 +5140,7 @@
       <w:r>
         <w:fldChar w:fldCharType="separate"/>
       </w:r>
-      <w:hyperlink w:anchor="_Toc239066311" w:history="1">
+      <w:hyperlink w:anchor="_Toc239067825" w:history="1">
         <w:r>
           <w:rPr>
             <w:rStyle w:val="Collegamentoipertestuale"/>
@@ -5167,7 +5167,7 @@
             <w:noProof/>
             <w:webHidden/>
           </w:rPr>
-          <w:instrText xml:space="preserve"> PAGEREF _Toc239066311 \h </w:instrText>
+          <w:instrText xml:space="preserve"> PAGEREF _Toc239067825 \h </w:instrText>
         </w:r>
         <w:r>
           <w:rPr>
@@ -5209,7 +5209,7 @@
           <w:noProof/>
         </w:rPr>
       </w:pPr>
-      <w:hyperlink w:anchor="_Toc239066312" w:history="1">
+      <w:hyperlink w:anchor="_Toc239067826" w:history="1">
         <w:r>
           <w:rPr>
             <w:rStyle w:val="Collegamentoipertestuale"/>
@@ -5236,7 +5236,7 @@
             <w:noProof/>
             <w:webHidden/>
           </w:rPr>
-          <w:instrText xml:space="preserve"> PAGEREF _Toc239066312 \h </w:instrText>
+          <w:instrText xml:space="preserve"> PAGEREF _Toc239067826 \h </w:instrText>
         </w:r>
         <w:r>
           <w:rPr>
@@ -5297,7 +5297,7 @@
       <w:pPr>
         <w:pStyle w:val="Titolo1"/>
       </w:pPr>
-      <w:bookmarkStart w:id="2" w:name="_Toc239066177"/>
+      <w:bookmarkStart w:id="2" w:name="_Toc239067760"/>
       <w:r>
         <w:lastRenderedPageBreak/>
         <w:t>Capitolo 1 - Introduzione</w:t>
@@ -5308,7 +5308,7 @@
       <w:pPr>
         <w:pStyle w:val="Titolo2"/>
       </w:pPr>
-      <w:bookmarkStart w:id="3" w:name="_Toc239066178"/>
+      <w:bookmarkStart w:id="3" w:name="_Toc239067761"/>
       <w:r>
         <w:t>1.1 Contesto dei sistemi Internet of Things</w:t>
       </w:r>
@@ -5339,7 +5339,7 @@
       <w:pPr>
         <w:pStyle w:val="Titolo2"/>
       </w:pPr>
-      <w:bookmarkStart w:id="4" w:name="_Toc239066179"/>
+      <w:bookmarkStart w:id="4" w:name="_Toc239067762"/>
       <w:r>
         <w:t xml:space="preserve">1.2 </w:t>
       </w:r>
@@ -5389,7 +5389,7 @@
       <w:pPr>
         <w:pStyle w:val="Titolo2"/>
       </w:pPr>
-      <w:bookmarkStart w:id="5" w:name="_Toc239066180"/>
+      <w:bookmarkStart w:id="5" w:name="_Toc239067763"/>
       <w:r>
         <w:t>1.3 Problema della sicurezza IoT</w:t>
       </w:r>
@@ -5415,7 +5415,7 @@
       <w:pPr>
         <w:pStyle w:val="Titolo2"/>
       </w:pPr>
-      <w:bookmarkStart w:id="6" w:name="_Toc239066181"/>
+      <w:bookmarkStart w:id="6" w:name="_Toc239067764"/>
       <w:r>
         <w:t>1.4 Obiettivo e contributo della tesi</w:t>
       </w:r>
@@ -5435,7 +5435,7 @@
       <w:pPr>
         <w:pStyle w:val="Titolo2"/>
       </w:pPr>
-      <w:bookmarkStart w:id="7" w:name="_Toc239066182"/>
+      <w:bookmarkStart w:id="7" w:name="_Toc239067765"/>
       <w:r>
         <w:t>1.5 Struttura dell'elaborato</w:t>
       </w:r>
@@ -5451,7 +5451,7 @@
         <w:pStyle w:val="Titolo1"/>
         <w:pageBreakBefore/>
       </w:pPr>
-      <w:bookmarkStart w:id="8" w:name="_Toc239066183"/>
+      <w:bookmarkStart w:id="8" w:name="_Toc239067766"/>
       <w:r>
         <w:lastRenderedPageBreak/>
         <w:t>Capitolo 2 - Stato dell'arte</w:t>
@@ -5462,7 +5462,7 @@
       <w:pPr>
         <w:pStyle w:val="Titolo2"/>
       </w:pPr>
-      <w:bookmarkStart w:id="9" w:name="_Toc239066184"/>
+      <w:bookmarkStart w:id="9" w:name="_Toc239067767"/>
       <w:r>
         <w:t>2.1 Architetture IoT</w:t>
       </w:r>
@@ -5544,7 +5544,7 @@
       <w:pPr>
         <w:pStyle w:val="Titolo2"/>
       </w:pPr>
-      <w:bookmarkStart w:id="10" w:name="_Toc239066185"/>
+      <w:bookmarkStart w:id="10" w:name="_Toc239067768"/>
       <w:r>
         <w:t>2.2 Protocolli e comunicazione</w:t>
       </w:r>
@@ -5561,20 +5561,14 @@
       </w:r>
       <w:r>
         <w:lastRenderedPageBreak/>
-        <w:t>motivo, la sicurezza del broker e del</w:t>
-      </w:r>
-      <w:r>
-        <w:t>scarse</w:t>
-      </w:r>
-      <w:r>
-        <w:t>è un elemento importante nelle architetture IoT [4].</w:t>
+        <w:t>motivo, la sicurezza del broker e delle credenziali è un elemento importante nelle architetture IoT [4].</w:t>
       </w:r>
     </w:p>
     <w:p>
       <w:pPr>
         <w:pStyle w:val="Titolo2"/>
       </w:pPr>
-      <w:bookmarkStart w:id="11" w:name="_Toc239066186"/>
+      <w:bookmarkStart w:id="11" w:name="_Toc239067769"/>
       <w:r>
         <w:t>2.3 Vulnerabilità tipiche</w:t>
       </w:r>
@@ -5589,7 +5583,7 @@
       <w:pPr>
         <w:pStyle w:val="Titolo2"/>
       </w:pPr>
-      <w:bookmarkStart w:id="12" w:name="_Toc239066187"/>
+      <w:bookmarkStart w:id="12" w:name="_Toc239067770"/>
       <w:r>
         <w:t xml:space="preserve">2.4 </w:t>
       </w:r>
@@ -5622,7 +5616,7 @@
       <w:pPr>
         <w:pStyle w:val="Titolo2"/>
       </w:pPr>
-      <w:bookmarkStart w:id="13" w:name="_Toc239066188"/>
+      <w:bookmarkStart w:id="13" w:name="_Toc239067771"/>
       <w:r>
         <w:lastRenderedPageBreak/>
         <w:t xml:space="preserve">2.5 </w:t>
@@ -5653,7 +5647,7 @@
       <w:pPr>
         <w:pStyle w:val="Titolo2"/>
       </w:pPr>
-      <w:bookmarkStart w:id="14" w:name="_Toc239066189"/>
+      <w:bookmarkStart w:id="14" w:name="_Toc239067772"/>
       <w:r>
         <w:t>2.6 Machine learning applicato agli IDS</w:t>
       </w:r>
@@ -5734,7 +5728,7 @@
       <w:pPr>
         <w:pStyle w:val="Titolo2"/>
       </w:pPr>
-      <w:bookmarkStart w:id="15" w:name="_Toc239066190"/>
+      <w:bookmarkStart w:id="15" w:name="_Toc239067773"/>
       <w:r>
         <w:lastRenderedPageBreak/>
         <w:t>2.7 Requisiti di sicurezza in un ambiente IoT</w:t>
@@ -5781,20 +5775,14 @@
     </w:p>
     <w:p>
       <w:r>
-        <w:t xml:space="preserve">Oltre alla classica triade riservatezza-integrità-disponibilità, </w:t>
-      </w:r>
-      <w:r>
-        <w:t>devono essere considerate anche</w:t>
-      </w:r>
-      <w:r>
-        <w:t xml:space="preserve"> autenticazione, autorizzazione, tracciabilità e resilienza. L’autenticazione limita l’accessibilità del sistema solo a dispositivi e utenti autorizzati. L’autorizzazione limita ciò che puoi fare. La tracciabilità consente di ricostruire eventi e incidenti utilizzando i log. La resilienza descrive la capacità di un sistema di resistere, ma può anche continuare a funzionare in qualche modo nonostante guasti o attacchi.</w:t>
+        <w:t>Oltre alla classica triade riservatezza-integrità-disponibilità, devono essere considerate anche autenticazione, autorizzazione, tracciabilità e resilienza. L’autenticazione limita l’accesso al sistema a dispositivi e utenti autorizzati. L’autorizzazione definisce le operazioni consentite. La tracciabilità consente di ricostruire eventi e incidenti utilizzando i log. La resilienza descrive la capacità di un sistema di resistere e continuare a funzionare nonostante guasti o attacchi.</w:t>
       </w:r>
     </w:p>
     <w:p>
       <w:pPr>
         <w:pStyle w:val="Titolo2"/>
       </w:pPr>
-      <w:bookmarkStart w:id="16" w:name="_Toc239066191"/>
+      <w:bookmarkStart w:id="16" w:name="_Toc239067774"/>
       <w:r>
         <w:t>2.8 IDS in architetture edge e cloud</w:t>
       </w:r>
@@ -5840,20 +5828,14 @@
     </w:p>
     <w:p>
       <w:r>
-        <w:t xml:space="preserve">Qui la tesi adotta questa impostazione: la pipeline Python rappresenta l’intero livello sperimentale, adatto sia per l’addestramento sia per la valutazione; al contrario, il dimostratore Wokwi rappresenta un livello semplificato, </w:t>
-      </w:r>
-      <w:r>
-        <w:t>semplificato dell’inferenza embedded</w:t>
-      </w:r>
-      <w:r>
-        <w:t>. Ciò permette di parlare del compromesso tra accuratezza e portabilità quando si confrontano questi due livelli tra loro.</w:t>
+        <w:t>La tesi adotta questa impostazione: la pipeline Python rappresenta l’intero livello sperimentale, adatto sia all’addestramento sia alla valutazione; il dimostratore Wokwi rappresenta invece un livello semplificato dell’inferenza embedded. Il confronto tra i due livelli consente di discutere il compromesso tra accuratezza e portabilità.</w:t>
       </w:r>
     </w:p>
     <w:p>
       <w:pPr>
         <w:pStyle w:val="Titolo2"/>
       </w:pPr>
-      <w:bookmarkStart w:id="17" w:name="_Toc239066192"/>
+      <w:bookmarkStart w:id="17" w:name="_Toc239067775"/>
       <w:r>
         <w:t>2.9 Difficoltà specifiche del machine learning per la sicurezza</w:t>
       </w:r>
@@ -5891,7 +5873,7 @@
         <w:pStyle w:val="Titolo1"/>
         <w:pageBreakBefore/>
       </w:pPr>
-      <w:bookmarkStart w:id="18" w:name="_Toc239066193"/>
+      <w:bookmarkStart w:id="18" w:name="_Toc239067776"/>
       <w:r>
         <w:lastRenderedPageBreak/>
         <w:t>Capitolo 3 - Metodologia</w:t>
@@ -5902,7 +5884,7 @@
       <w:pPr>
         <w:pStyle w:val="Titolo2"/>
       </w:pPr>
-      <w:bookmarkStart w:id="19" w:name="_Toc239066194"/>
+      <w:bookmarkStart w:id="19" w:name="_Toc239067777"/>
       <w:r>
         <w:t>3.1 Organizzazione del repository</w:t>
       </w:r>
@@ -5922,7 +5904,7 @@
       <w:pPr>
         <w:pStyle w:val="Titolo2"/>
       </w:pPr>
-      <w:bookmarkStart w:id="20" w:name="_Toc239066195"/>
+      <w:bookmarkStart w:id="20" w:name="_Toc239067778"/>
       <w:r>
         <w:t>3.2 Dataset utilizzato</w:t>
       </w:r>
@@ -5980,7 +5962,7 @@
       <w:pPr>
         <w:pStyle w:val="Titolo2"/>
       </w:pPr>
-      <w:bookmarkStart w:id="21" w:name="_Toc239066196"/>
+      <w:bookmarkStart w:id="21" w:name="_Toc239067779"/>
       <w:r>
         <w:t>3.3 Validazione dei dati</w:t>
       </w:r>
@@ -6070,7 +6052,7 @@
       <w:pPr>
         <w:pStyle w:val="Titolo2"/>
       </w:pPr>
-      <w:bookmarkStart w:id="22" w:name="_Toc239066266"/>
+      <w:bookmarkStart w:id="22" w:name="_Toc239067780"/>
       <w:r>
         <w:t>3.4 Preprocessing e prevenzione del data leakage</w:t>
       </w:r>
@@ -6204,7 +6186,7 @@
       <w:r>
         <w:instrText xml:space="preserve"> TC "</w:instrText>
       </w:r>
-      <w:bookmarkStart w:id="23" w:name="_Toc239066297"/>
+      <w:bookmarkStart w:id="23" w:name="_Toc239067811"/>
       <w:r>
         <w:instrText>Figura 1 - Distribuzione delle classi binarie prima del preprocessing</w:instrText>
       </w:r>
@@ -6278,7 +6260,7 @@
       <w:r>
         <w:instrText xml:space="preserve"> TC "</w:instrText>
       </w:r>
-      <w:bookmarkStart w:id="24" w:name="_Toc239066298"/>
+      <w:bookmarkStart w:id="24" w:name="_Toc239067812"/>
       <w:r>
         <w:instrText>Figura 2 - Distribuzione delle classi binarie dopo il preprocessing</w:instrText>
       </w:r>
@@ -6294,7 +6276,7 @@
       <w:pPr>
         <w:pStyle w:val="Titolo2"/>
       </w:pPr>
-      <w:bookmarkStart w:id="25" w:name="_Toc239066267"/>
+      <w:bookmarkStart w:id="25" w:name="_Toc239067781"/>
       <w:r>
         <w:lastRenderedPageBreak/>
         <w:t>3.5 Split sperimentale</w:t>
@@ -6321,7 +6303,7 @@
       <w:pPr>
         <w:pStyle w:val="Titolo2"/>
       </w:pPr>
-      <w:bookmarkStart w:id="26" w:name="_Toc239066268"/>
+      <w:bookmarkStart w:id="26" w:name="_Toc239067782"/>
       <w:r>
         <w:t>3.6 Modelli baseline</w:t>
       </w:r>
@@ -6378,7 +6360,7 @@
       <w:pPr>
         <w:pStyle w:val="Titolo2"/>
       </w:pPr>
-      <w:bookmarkStart w:id="27" w:name="_Toc239066269"/>
+      <w:bookmarkStart w:id="27" w:name="_Toc239067783"/>
       <w:r>
         <w:t>3.7 Esperimenti estesi</w:t>
       </w:r>
@@ -6419,7 +6401,7 @@
       <w:pPr>
         <w:pStyle w:val="Titolo2"/>
       </w:pPr>
-      <w:bookmarkStart w:id="28" w:name="_Toc239066270"/>
+      <w:bookmarkStart w:id="28" w:name="_Toc239067784"/>
       <w:r>
         <w:t>3.8 Metriche di valutazione</w:t>
       </w:r>
@@ -6459,7 +6441,7 @@
       <w:pPr>
         <w:pStyle w:val="Titolo2"/>
       </w:pPr>
-      <w:bookmarkStart w:id="29" w:name="_Toc239066271"/>
+      <w:bookmarkStart w:id="29" w:name="_Toc239067785"/>
       <w:r>
         <w:t>3.9 Protocollo di esecuzione</w:t>
       </w:r>
@@ -6493,7 +6475,7 @@
       <w:pPr>
         <w:pStyle w:val="Titolo2"/>
       </w:pPr>
-      <w:bookmarkStart w:id="30" w:name="_Toc239066272"/>
+      <w:bookmarkStart w:id="30" w:name="_Toc239067786"/>
       <w:r>
         <w:t>3.10 Gestione degli artefatti</w:t>
       </w:r>
@@ -6526,7 +6508,7 @@
       <w:pPr>
         <w:pStyle w:val="Titolo2"/>
       </w:pPr>
-      <w:bookmarkStart w:id="31" w:name="_Toc239066273"/>
+      <w:bookmarkStart w:id="31" w:name="_Toc239067787"/>
       <w:r>
         <w:t>3.11 Simulazione IoT e dimostrazione embedded</w:t>
       </w:r>
@@ -6593,7 +6575,7 @@
         <w:pStyle w:val="Titolo1"/>
         <w:pageBreakBefore/>
       </w:pPr>
-      <w:bookmarkStart w:id="32" w:name="_Toc239066274"/>
+      <w:bookmarkStart w:id="32" w:name="_Toc239067788"/>
       <w:r>
         <w:lastRenderedPageBreak/>
         <w:t>Capitolo 4 - Risultati sperimentali</w:t>
@@ -6604,7 +6586,7 @@
       <w:pPr>
         <w:pStyle w:val="Titolo2"/>
       </w:pPr>
-      <w:bookmarkStart w:id="33" w:name="_Toc239066275"/>
+      <w:bookmarkStart w:id="33" w:name="_Toc239067789"/>
       <w:r>
         <w:t>4.1 Premessa sui risultati</w:t>
       </w:r>
@@ -6624,7 +6606,7 @@
       <w:pPr>
         <w:pStyle w:val="Titolo2"/>
       </w:pPr>
-      <w:bookmarkStart w:id="34" w:name="_Toc239066276"/>
+      <w:bookmarkStart w:id="34" w:name="_Toc239067790"/>
       <w:r>
         <w:t>4.2 Risultati baseline nella classificazione binaria</w:t>
       </w:r>
@@ -6645,7 +6627,7 @@
       <w:r>
         <w:instrText xml:space="preserve"> TC "</w:instrText>
       </w:r>
-      <w:bookmarkStart w:id="35" w:name="_Toc239066311"/>
+      <w:bookmarkStart w:id="35" w:name="_Toc239067825"/>
       <w:r>
         <w:instrText>Tabella 1 - Prestazioni dei modelli baseline nella classificazione binaria</w:instrText>
       </w:r>
@@ -7403,7 +7385,7 @@
       <w:r>
         <w:instrText xml:space="preserve"> TC "</w:instrText>
       </w:r>
-      <w:bookmarkStart w:id="36" w:name="_Toc239066299"/>
+      <w:bookmarkStart w:id="36" w:name="_Toc239067813"/>
       <w:r>
         <w:instrText>Figura 3 - Confronto dell'accuracy dei modelli baseline nella classificazione binaria</w:instrText>
       </w:r>
@@ -7477,7 +7459,7 @@
       <w:r>
         <w:instrText xml:space="preserve"> TC "</w:instrText>
       </w:r>
-      <w:bookmarkStart w:id="37" w:name="_Toc239066300"/>
+      <w:bookmarkStart w:id="37" w:name="_Toc239067814"/>
       <w:r>
         <w:instrText>Figura 4 - Confronto del Macro F1 dei modelli baseline nella classificazione binaria</w:instrText>
       </w:r>
@@ -7552,7 +7534,7 @@
       <w:r>
         <w:instrText xml:space="preserve"> TC "</w:instrText>
       </w:r>
-      <w:bookmarkStart w:id="38" w:name="_Toc239066301"/>
+      <w:bookmarkStart w:id="38" w:name="_Toc239067815"/>
       <w:r>
         <w:instrText>Figura 5 - Matrice di confusione LightGBM nella classificazione binaria</w:instrText>
       </w:r>
@@ -7568,7 +7550,7 @@
       <w:pPr>
         <w:pStyle w:val="Titolo2"/>
       </w:pPr>
-      <w:bookmarkStart w:id="39" w:name="_Toc239066277"/>
+      <w:bookmarkStart w:id="39" w:name="_Toc239067791"/>
       <w:r>
         <w:t>4.3 Risultati baseline nella classificazione multiclasse</w:t>
       </w:r>
@@ -7589,7 +7571,7 @@
       <w:r>
         <w:instrText xml:space="preserve"> TC "</w:instrText>
       </w:r>
-      <w:bookmarkStart w:id="40" w:name="_Toc239066312"/>
+      <w:bookmarkStart w:id="40" w:name="_Toc239067826"/>
       <w:r>
         <w:instrText>Tabella 2 - Prestazioni dei modelli baseline nella classificazione multiclasse</w:instrText>
       </w:r>
@@ -8352,7 +8334,7 @@
       <w:r>
         <w:instrText xml:space="preserve"> TC "</w:instrText>
       </w:r>
-      <w:bookmarkStart w:id="41" w:name="_Toc239066302"/>
+      <w:bookmarkStart w:id="41" w:name="_Toc239067816"/>
       <w:r>
         <w:instrText>Figura 6 - Confronto dell'accuracy dei modelli baseline nella classificazione multiclasse</w:instrText>
       </w:r>
@@ -8427,7 +8409,7 @@
       <w:r>
         <w:instrText xml:space="preserve"> TC "</w:instrText>
       </w:r>
-      <w:bookmarkStart w:id="42" w:name="_Toc239066303"/>
+      <w:bookmarkStart w:id="42" w:name="_Toc239067817"/>
       <w:r>
         <w:instrText>Figura 7 - Confronto del Macro F1 dei modelli baseline nella classificazione multiclasse</w:instrText>
       </w:r>
@@ -8502,7 +8484,7 @@
       <w:r>
         <w:instrText xml:space="preserve"> TC "</w:instrText>
       </w:r>
-      <w:bookmarkStart w:id="43" w:name="_Toc239066304"/>
+      <w:bookmarkStart w:id="43" w:name="_Toc239067818"/>
       <w:r>
         <w:instrText>Figura 8 - Matrice di confusione LightGBM nella classificazione multiclasse</w:instrText>
       </w:r>
@@ -8518,7 +8500,7 @@
       <w:pPr>
         <w:pStyle w:val="Titolo2"/>
       </w:pPr>
-      <w:bookmarkStart w:id="44" w:name="_Toc239066278"/>
+      <w:bookmarkStart w:id="44" w:name="_Toc239067792"/>
       <w:r>
         <w:t>4.4 Effetto del bilanciamento tramite SMOTE</w:t>
       </w:r>
@@ -8601,7 +8583,7 @@
       <w:r>
         <w:instrText xml:space="preserve"> TC "</w:instrText>
       </w:r>
-      <w:bookmarkStart w:id="45" w:name="_Toc239066305"/>
+      <w:bookmarkStart w:id="45" w:name="_Toc239067819"/>
       <w:r>
         <w:instrText>Figura 9 - Confronto Macro F1 con e senza SMOTE</w:instrText>
       </w:r>
@@ -8617,7 +8599,7 @@
       <w:pPr>
         <w:pStyle w:val="Titolo2"/>
       </w:pPr>
-      <w:bookmarkStart w:id="46" w:name="_Toc239066279"/>
+      <w:bookmarkStart w:id="46" w:name="_Toc239067793"/>
       <w:r>
         <w:t>4.5 Tuning iperparametrico</w:t>
       </w:r>
@@ -8724,7 +8706,7 @@
       <w:r>
         <w:instrText xml:space="preserve"> TC "</w:instrText>
       </w:r>
-      <w:bookmarkStart w:id="47" w:name="_Toc239066306"/>
+      <w:bookmarkStart w:id="47" w:name="_Toc239067820"/>
       <w:r>
         <w:instrText>Figura 10 - Confronto Macro F1 dei modelli sottoposti a tuning binario</w:instrText>
       </w:r>
@@ -8740,7 +8722,7 @@
       <w:pPr>
         <w:pStyle w:val="Titolo2"/>
       </w:pPr>
-      <w:bookmarkStart w:id="48" w:name="_Toc239066280"/>
+      <w:bookmarkStart w:id="48" w:name="_Toc239067794"/>
       <w:r>
         <w:t>4.6 Modelli aggiuntivi: MLPClassifier e Isolation Forest</w:t>
       </w:r>
@@ -8834,7 +8816,7 @@
       <w:r>
         <w:instrText xml:space="preserve"> TC "</w:instrText>
       </w:r>
-      <w:bookmarkStart w:id="49" w:name="_Toc239066307"/>
+      <w:bookmarkStart w:id="49" w:name="_Toc239067821"/>
       <w:r>
         <w:instrText>Figura 11 - Confronto Macro F1 degli esperimenti estesi binari</w:instrText>
       </w:r>
@@ -8909,7 +8891,7 @@
       <w:r>
         <w:instrText xml:space="preserve"> TC "</w:instrText>
       </w:r>
-      <w:bookmarkStart w:id="50" w:name="_Toc239066308"/>
+      <w:bookmarkStart w:id="50" w:name="_Toc239067822"/>
       <w:r>
         <w:instrText>Figura 12 - Confronto Macro F1 degli esperimenti estesi multiclasse</w:instrText>
       </w:r>
@@ -8925,7 +8907,7 @@
       <w:pPr>
         <w:pStyle w:val="Titolo2"/>
       </w:pPr>
-      <w:bookmarkStart w:id="51" w:name="_Toc239066281"/>
+      <w:bookmarkStart w:id="51" w:name="_Toc239067795"/>
       <w:r>
         <w:t>4.7 Interpretabilità dei modelli</w:t>
       </w:r>
@@ -9012,7 +8994,7 @@
       <w:r>
         <w:instrText xml:space="preserve"> TC "</w:instrText>
       </w:r>
-      <w:bookmarkStart w:id="52" w:name="_Toc239066309"/>
+      <w:bookmarkStart w:id="52" w:name="_Toc239067823"/>
       <w:r>
         <w:instrText>Figura 13 - Importanza delle feature nel modello LightGBM binario</w:instrText>
       </w:r>
@@ -9087,7 +9069,7 @@
       <w:r>
         <w:instrText xml:space="preserve"> TC "</w:instrText>
       </w:r>
-      <w:bookmarkStart w:id="53" w:name="_Toc239066310"/>
+      <w:bookmarkStart w:id="53" w:name="_Toc239067824"/>
       <w:r>
         <w:instrText>Figura 14 - Importanza delle feature nel modello LightGBM multiclasse</w:instrText>
       </w:r>
@@ -9103,7 +9085,7 @@
       <w:pPr>
         <w:pStyle w:val="Titolo2"/>
       </w:pPr>
-      <w:bookmarkStart w:id="54" w:name="_Toc239066282"/>
+      <w:bookmarkStart w:id="54" w:name="_Toc239067796"/>
       <w:r>
         <w:t>4.8 Latenza, dimensione e compressione</w:t>
       </w:r>
@@ -9111,19 +9093,7 @@
     </w:p>
     <w:p>
       <w:r>
-        <w:t xml:space="preserve">Oltre alle metriche predittive, sono state considerate anche misure relative al deployment. In un IDS pratico, il modello è tenuto a considerare il traffico in finestre temporali conformi a quanto è operativamente fattibile. Anche un modello accurato ma troppo lento o troppo grande potrebbe essere eccessivo per dispositivi edge o per un gateway a basso consumo. È stato utilizzato Joblib per l’analisi del deployment e si può vedere che </w:t>
-      </w:r>
-      <w:r>
-        <w:t>gli artefatti di LightGBM</w:t>
-      </w:r>
-      <w:r>
-        <w:t xml:space="preserve"> riducono significativamente la dimensione; da 2,09 MB a 0,85 MB nel caso binario e da 17,20 MB a 7,34 MB nel caso multiclass. Questi valori riguardano la compressione </w:t>
-      </w:r>
-      <w:r>
-        <w:t>dell’artefatto Python</w:t>
-      </w:r>
-      <w:r>
-        <w:t xml:space="preserve"> e non la quantizzazione per microcontrollori. Sono comunque utili per discutere il compromesso prestazioni/dimensione/portabilità.</w:t>
+        <w:t>Oltre alle metriche predittive, sono state considerate anche misure relative al deployment. In un IDS pratico, il traffico deve essere analizzato in finestre temporali compatibili con i vincoli operativi. Anche un modello accurato ma troppo lento o troppo grande potrebbe essere eccessivo per dispositivi edge o per un gateway a basso consumo. È stato utilizzato Joblib per l’analisi del deployment e gli artefatti di LightGBM riducono significativamente la dimensione: da 2,09 MB a 0,85 MB nel caso binario e da 17,20 MB a 7,34 MB nel caso multiclasse. Questi valori riguardano la compressione dell’artefatto Python e non la quantizzazione per microcontrollori. Sono comunque utili per discutere il compromesso tra prestazioni, dimensione e portabilità.</w:t>
       </w:r>
     </w:p>
     <w:p>
@@ -9140,186 +9110,159 @@
         <w:t>nella baseline</w:t>
       </w:r>
       <w:r>
-        <w:t xml:space="preserve">, con buona accuratezza dei dati e tempi di </w:t>
-      </w:r>
+        <w:t>, con buona accuratezza dei dati e tempi di inferenza soddisfacenti. Tuttavia, in un caso pratico, la selezione del modello dipenderebbe dall’endpoint di deployment: cloud, gateway o dispositivo embedded.</w:t>
+      </w:r>
+    </w:p>
+    <w:p>
+      <w:pPr>
+        <w:pStyle w:val="Titolo2"/>
+      </w:pPr>
+      <w:bookmarkStart w:id="55" w:name="_Toc239067797"/>
       <w:r>
         <w:lastRenderedPageBreak/>
-        <w:t>inferenza soddisfacenti. Tuttavia, in un caso pratico, la selezione del modello dipenderebbe dall’endpoint di deployment: cloud, gateway o dispositivo embedded.</w:t>
+        <w:t>4.9 Dimostratore embedded con Wokwi</w:t>
+      </w:r>
+      <w:bookmarkEnd w:id="55"/>
+    </w:p>
+    <w:p>
+      <w:r>
+        <w:t>È stato progettato un dimostratore Wokwi basato su ESP32</w:t>
+      </w:r>
+      <w:r>
+        <w:t xml:space="preserve"> per emulare l’esecuzione embedded di un modello IDS di piccole dimensioni. </w:t>
+      </w:r>
+      <w:r>
+        <w:t>Lo script di esportazione addestra una regressione logistica binaria</w:t>
+      </w:r>
+      <w:r>
+        <w:t xml:space="preserve"> su dieci feature numeriche, normalizza le variabili, </w:t>
+      </w:r>
+      <w:r>
+        <w:t>quantizza coefficienti e intercetta in int16 e genera</w:t>
+      </w:r>
+      <w:r>
+        <w:t xml:space="preserve"> l’header C++ </w:t>
+      </w:r>
+      <w:r>
+        <w:t>utilizzato dallo sketch Arduino</w:t>
+      </w:r>
+      <w:r>
+        <w:t>.</w:t>
+      </w:r>
+    </w:p>
+    <w:p>
+      <w:r>
+        <w:t xml:space="preserve">L’exporter calcola quindi la differenza nell’accuratezza del test set tra la pipeline originale in floating-point di Python e una emulazione Python della formula quantizzata che verrebbe eseguita dal firmware su 42.209 record, </w:t>
+      </w:r>
+      <w:r>
+        <w:t>per misurare l</w:t>
+      </w:r>
+      <w:r>
+        <w:t>’</w:t>
+      </w:r>
+      <w:r>
+        <w:t>impatto della quantizzazione</w:t>
+      </w:r>
+      <w:r>
+        <w:t xml:space="preserve">. Entrambe le varianti hanno raggiunto accuratezza 0,8180, F1-score 0,8888 e Macro F1 0,6933. L’accordo sulla predizione è del 100% con una differenza di 0,0000 nell’accuratezza e nella Macro F1. Pertanto, al livello di quantizzazione adottato, l’arrotondamento non ha alcuna influenza sulle classi predette per questo set di test. Tuttavia, </w:t>
+      </w:r>
+      <w:r>
+        <w:t>è importante notare</w:t>
+      </w:r>
+      <w:r>
+        <w:t xml:space="preserve"> che il confronto non tiene conto dell’effettivo consumo energetico o della latenza sull’hardware reale.</w:t>
+      </w:r>
+    </w:p>
+    <w:p>
+      <w:r>
+        <w:t xml:space="preserve">il progetto Wokwi </w:t>
+      </w:r>
+      <w:r>
+        <w:t xml:space="preserve">è disponibile </w:t>
+      </w:r>
+      <w:r>
+        <w:t>qui:</w:t>
+      </w:r>
+    </w:p>
+    <w:p>
+      <w:r>
+        <w:t>https://wokwi.com/projects/472799587810026497</w:t>
+      </w:r>
+    </w:p>
+    <w:p>
+      <w:r>
+        <w:t xml:space="preserve">Il dimostratore embedded è costituito da tre file principali: sketch.ino, embedded_model.h e diagram.json. </w:t>
+      </w:r>
+      <w:r>
+        <w:t>Lo sketch imposta</w:t>
+      </w:r>
+      <w:r>
+        <w:t xml:space="preserve"> una connessione seriale, carica i campioni di test, calcola la probabilità di attacco, ne stampa l’etichetta attesa e l’etichetta predetta per ciascun campione insieme alle rispettive probabilità. Il file diagram.json collega i pin seriali dell’ESP32 al monitor seriale virtuale, consentendo di controllare l’output durante la simulazione.</w:t>
+      </w:r>
+    </w:p>
+    <w:p>
+      <w:r>
+        <w:t>Il dimostratore non utilizza LightGBM. La scelta è intenzionale: LightGBM è il modello più efficace della baseline, ma la sua complessità renderebbe più difficile il deployment in uno sketch per microcontrollore. L’inferenza di un modello lineare può invece essere rappresentata come un prodotto scalare tra feature normalizzate e coefficienti quantizzati, seguito dalla funzione sigmoide. L’output è meno preciso, ma il modello risulta più adatto a mostrare la differenza concettuale tra la pipeline Python e l’inferenza embedded.</w:t>
+      </w:r>
+    </w:p>
+    <w:p>
+      <w:r>
+        <w:t>L’output seriale mostra previsioni generalmente corrette, pur con alcuni errori, indicando che il modello non si adatta perfettamente ai dati e che la baseline ensemble può ottenere prestazioni migliori del modello più complesso.</w:t>
       </w:r>
     </w:p>
     <w:p>
       <w:pPr>
         <w:pStyle w:val="Titolo2"/>
       </w:pPr>
-      <w:bookmarkStart w:id="55" w:name="_Toc239066283"/>
-      <w:r>
-        <w:t>4.9 Dimostratore embedded con Wokwi</w:t>
-      </w:r>
-      <w:bookmarkEnd w:id="55"/>
-    </w:p>
-    <w:p>
-      <w:r>
-        <w:t>È stato progettato un dimostratore Wokwi basato su ESP32</w:t>
-      </w:r>
-      <w:r>
-        <w:t xml:space="preserve"> per emulare l’esecuzione embedded di un modello IDS di piccole dimensioni. </w:t>
-      </w:r>
-      <w:r>
-        <w:t>Lo script di esportazione addestra una regressione logistica binaria</w:t>
-      </w:r>
-      <w:r>
-        <w:t xml:space="preserve"> su dieci feature numeriche, normalizza le variabili, </w:t>
-      </w:r>
-      <w:r>
-        <w:t>quantizza coefficienti e intercetta in int16 e genera</w:t>
-      </w:r>
-      <w:r>
-        <w:t xml:space="preserve"> l’header C++ </w:t>
-      </w:r>
-      <w:r>
-        <w:t>utilizzato dallo sketch Arduino</w:t>
-      </w:r>
-      <w:r>
-        <w:t>.</w:t>
-      </w:r>
-    </w:p>
-    <w:p>
-      <w:r>
-        <w:t xml:space="preserve">L’exporter calcola quindi la differenza nell’accuratezza del test set tra la pipeline originale in floating-point di Python e una emulazione Python della formula quantizzata che verrebbe eseguita dal firmware su 42.209 record, </w:t>
-      </w:r>
-      <w:r>
-        <w:t>per misurare l</w:t>
-      </w:r>
-      <w:r>
-        <w:t>’</w:t>
-      </w:r>
-      <w:r>
-        <w:t>impatto della quantizzazione</w:t>
-      </w:r>
-      <w:r>
-        <w:t xml:space="preserve">. Entrambe le varianti hanno raggiunto accuratezza 0,8180, F1-score 0,8888 e Macro F1 0,6933. L’accordo sulla predizione è del 100% con una differenza di 0,0000 nell’accuratezza e nella Macro F1. Pertanto, al livello di quantizzazione adottato, l’arrotondamento non ha alcuna influenza sulle classi predette per questo set di test. Tuttavia, </w:t>
-      </w:r>
-      <w:r>
-        <w:t>è importante notare</w:t>
-      </w:r>
-      <w:r>
-        <w:t xml:space="preserve"> che il confronto non tiene conto dell’effettivo consumo energetico o della latenza sull’hardware reale.</w:t>
-      </w:r>
-    </w:p>
-    <w:p>
-      <w:r>
-        <w:t xml:space="preserve">il progetto Wokwi </w:t>
-      </w:r>
-      <w:r>
-        <w:t xml:space="preserve">è disponibile </w:t>
-      </w:r>
-      <w:r>
-        <w:t>qui:</w:t>
-      </w:r>
-    </w:p>
-    <w:p>
-      <w:r>
-        <w:t>https://wokwi.com/projects/472799587810026497</w:t>
-      </w:r>
-    </w:p>
-    <w:p>
-      <w:r>
-        <w:t xml:space="preserve">Il dimostratore embedded è costituito da tre file principali: sketch.ino, embedded_model.h e diagram.json. </w:t>
-      </w:r>
-      <w:r>
-        <w:t>Lo sketch imposta</w:t>
-      </w:r>
-      <w:r>
-        <w:t xml:space="preserve"> una connessione seriale, carica i campioni di test, calcola la probabilità di attacco, ne stampa l’etichetta attesa e l’etichetta predetta per ciascun campione insieme alle rispettive probabilità. Il file diagram.json collega i pin seriali dell’ESP32 al monitor seriale virtuale, consentendo di controllare l’output durante la simulazione.</w:t>
-      </w:r>
-    </w:p>
-    <w:p>
-      <w:r>
-        <w:t xml:space="preserve">Il dimostratore non usa LightGBM. Il motivo di questa scelta è </w:t>
-      </w:r>
-      <w:r>
-        <w:t>voluto</w:t>
-      </w:r>
-      <w:r>
-        <w:t xml:space="preserve">: LightGBM è il modello </w:t>
-      </w:r>
-      <w:r>
-        <w:t>più</w:t>
-      </w:r>
-      <w:r>
-        <w:t xml:space="preserve"> potente del baseline, ma ha una complessità maggiore che renderebbe </w:t>
-      </w:r>
-      <w:r>
-        <w:t>più</w:t>
-      </w:r>
-      <w:r>
-        <w:t xml:space="preserve"> difficile il deployment così com’è in un puro sketch per microcontrollore. A questo proposito, si potrebbe rappresentare l’inferenza in un modello lineare</w:t>
-      </w:r>
-      <w:r>
-        <w:t xml:space="preserve">, </w:t>
-      </w:r>
-      <w:r>
-        <w:t>come un prodotto scalare di feature normalizzate e coefficienti quantizzati, seguito dalla funzione sigmoide, piuttosto che trattarla come somma di valori attesi pesati. L’output è meno preciso, ma è meglio adatto a dimostrare il diverso percorso concettuale tra una pipeline Python e l’inferenza embedded.</w:t>
-      </w:r>
-    </w:p>
-    <w:p>
-      <w:r>
-        <w:t>L’output seriale mostra previsioni generalmente corrette, pur con alcuni errori, indicando che il modello non si adatta perfettamente ai dati e che la baseline ensemble può ottenere prestazioni migliori del modello più complesso.</w:t>
+      <w:bookmarkStart w:id="56" w:name="_Toc239067798"/>
+      <w:r>
+        <w:t>4.10 Sintesi degli artefatti prodotti</w:t>
+      </w:r>
+      <w:bookmarkEnd w:id="56"/>
+    </w:p>
+    <w:p>
+      <w:pPr>
+        <w:rPr>
+          <w:lang w:val="en-US"/>
+        </w:rPr>
+      </w:pPr>
+      <w:r>
+        <w:t xml:space="preserve">Gli esperimenti hanno prodotto file CSV, grafici PNG e documentazione tecnica. </w:t>
+      </w:r>
+      <w:r>
+        <w:rPr>
+          <w:lang w:val="en-US"/>
+        </w:rPr>
+        <w:t>I principali file di metriche sono binary_baseline_metrics.csv, multiclass_baseline_metrics.csv, binary_extended_metrics.csv, multiclass_extended_metrics.csv,</w:t>
+      </w:r>
+      <w:r>
+        <w:rPr>
+          <w:lang w:val="en-US"/>
+        </w:rPr>
+        <w:t xml:space="preserve"> </w:t>
+      </w:r>
+      <w:r>
+        <w:rPr>
+          <w:lang w:val="en-US"/>
+        </w:rPr>
+        <w:t>smote_comparison.csv, hyperparameter_tuning_results.csv, latency_summary.csv, deployment_analysis.csv ed embedded_logistic_regression_metrics.csv.</w:t>
+      </w:r>
+    </w:p>
+    <w:p>
+      <w:r>
+        <w:t>I grafici principali includono confronti per accuracy, F1-score, Macro F1, matrici di confusione, distribuzioni delle classi e feature importance. Tali figure sono incluse nel documento per rendere immediata la lettura dei risultati e per collegare le metriche numeriche alla loro rappresentazione visuale.</w:t>
+      </w:r>
+    </w:p>
+    <w:p>
+      <w:r>
+        <w:t>La presenza di artefatti generati automaticamente rafforza la riproducibilità del lavoro. Un lettore può confrontare le tabelle riportate nel testo con i CSV nella directory results/metrics/ e verificare che le immagini inserite provengano dai file presenti in results/plots/.</w:t>
       </w:r>
     </w:p>
     <w:p>
       <w:pPr>
         <w:pStyle w:val="Titolo2"/>
       </w:pPr>
-      <w:bookmarkStart w:id="56" w:name="_Toc239066284"/>
-      <w:r>
-        <w:t>4.10 Sintesi degli artefatti prodotti</w:t>
-      </w:r>
-      <w:bookmarkEnd w:id="56"/>
-    </w:p>
-    <w:p>
-      <w:pPr>
-        <w:rPr>
-          <w:lang w:val="en-US"/>
-        </w:rPr>
-      </w:pPr>
-      <w:r>
-        <w:t xml:space="preserve">Gli esperimenti hanno prodotto file CSV, grafici PNG e documentazione tecnica. </w:t>
-      </w:r>
-      <w:r>
-        <w:rPr>
-          <w:lang w:val="en-US"/>
-        </w:rPr>
-        <w:t>I principali file di metriche sono binary_baseline_metrics.csv, multiclass_baseline_metrics.csv, binary_extended_metrics.csv, multiclass_extended_metrics.csv,</w:t>
-      </w:r>
-      <w:r>
-        <w:rPr>
-          <w:lang w:val="en-US"/>
-        </w:rPr>
-        <w:t xml:space="preserve"> </w:t>
-      </w:r>
-      <w:r>
-        <w:rPr>
-          <w:lang w:val="en-US"/>
-        </w:rPr>
-        <w:t>smote_comparison.csv, hyperparameter_tuning_results.csv, latency_summary.csv, deployment_analysis.csv ed embedded_logistic_regression_metrics.csv.</w:t>
-      </w:r>
-    </w:p>
-    <w:p>
-      <w:r>
-        <w:t>I grafici principali includono confronti per accuracy, F1-score, Macro F1, matrici di confusione, distribuzioni delle classi e feature importance. Tali figure sono incluse nel documento per rendere immediata la lettura dei risultati e per collegare le metriche numeriche alla loro rappresentazione visuale.</w:t>
-      </w:r>
-    </w:p>
-    <w:p>
-      <w:r>
-        <w:t>La presenza di artefatti generati automaticamente rafforza la riproducibilità del lavoro. Un lettore può confrontare le tabelle riportate nel testo con i CSV nella directory results/metrics/ e verificare che le immagini inserite provengano dai file presenti in results/plots/.</w:t>
-      </w:r>
-    </w:p>
-    <w:p>
-      <w:pPr>
-        <w:pStyle w:val="Titolo2"/>
-      </w:pPr>
-      <w:bookmarkStart w:id="57" w:name="_Toc239066285"/>
+      <w:bookmarkStart w:id="57" w:name="_Toc239067799"/>
       <w:r>
         <w:t>4.11 Lettura critica dei risultati</w:t>
       </w:r>
@@ -9359,7 +9302,7 @@
         <w:pStyle w:val="Titolo1"/>
         <w:pageBreakBefore/>
       </w:pPr>
-      <w:bookmarkStart w:id="58" w:name="_Toc239066286"/>
+      <w:bookmarkStart w:id="58" w:name="_Toc239067800"/>
       <w:r>
         <w:t>Capitolo 5 - Discussione e strategie di mitigazione</w:t>
       </w:r>
@@ -9369,7 +9312,7 @@
       <w:pPr>
         <w:pStyle w:val="Titolo2"/>
       </w:pPr>
-      <w:bookmarkStart w:id="59" w:name="_Toc239066287"/>
+      <w:bookmarkStart w:id="59" w:name="_Toc239067801"/>
       <w:r>
         <w:t>5.1 Interpretazione complessiva dei risultati</w:t>
       </w:r>
@@ -9443,7 +9386,7 @@
       <w:pPr>
         <w:pStyle w:val="Titolo2"/>
       </w:pPr>
-      <w:bookmarkStart w:id="60" w:name="_Toc239066288"/>
+      <w:bookmarkStart w:id="60" w:name="_Toc239067802"/>
       <w:r>
         <w:t>5.2 Interpretabilità contro prestazioni</w:t>
       </w:r>
@@ -9494,7 +9437,7 @@
       <w:pPr>
         <w:pStyle w:val="Titolo2"/>
       </w:pPr>
-      <w:bookmarkStart w:id="61" w:name="_Toc239066289"/>
+      <w:bookmarkStart w:id="61" w:name="_Toc239067803"/>
       <w:r>
         <w:t>5.3 Limiti del dataset statico</w:t>
       </w:r>
@@ -9520,7 +9463,7 @@
       <w:pPr>
         <w:pStyle w:val="Titolo2"/>
       </w:pPr>
-      <w:bookmarkStart w:id="62" w:name="_Toc239066290"/>
+      <w:bookmarkStart w:id="62" w:name="_Toc239067804"/>
       <w:r>
         <w:t>5.4 Limiti della simulazione Wokwi</w:t>
       </w:r>
@@ -9528,38 +9471,14 @@
     </w:p>
     <w:p>
       <w:r>
-        <w:t xml:space="preserve">Il dimostratore Wokwi è valido per mostrare un possibile primo passo verso l’inferenza embedded, </w:t>
-      </w:r>
-      <w:r>
-        <w:t>con alcune limitazioni</w:t>
-      </w:r>
-      <w:r>
-        <w:t xml:space="preserve">. </w:t>
-      </w:r>
-      <w:r>
-        <w:t>La simulazione non consente misurazioni</w:t>
-      </w:r>
-      <w:r>
-        <w:t xml:space="preserve">, senza alcun impatto sul consumo energetico reale, sulla temperatura, sulle interferenze, sulla latenza di rete fisica </w:t>
-      </w:r>
-      <w:r>
-        <w:t>o</w:t>
-      </w:r>
-      <w:r>
-        <w:t xml:space="preserve"> sui vincoli completi dell’hardware. Inoltre, si utilizzano campioni statici esportati per il modello embedded e non traffico acquisito in tempo reale da un’interfaccia di rete. Nonostante questi ostacoli, Wokwi è prezioso per tutta la tesi perché consente di dimostrare come il codice embedded funzioni senza hardware reale. </w:t>
-      </w:r>
-      <w:r>
-        <w:t>In futuro si potrebbe</w:t>
-      </w:r>
-      <w:r>
-        <w:t xml:space="preserve"> eseguire l’esperimento su dispositivi reali, con misurazioni della memoria occupata, del tempo di inferenza, della stabilità e del consumo energetico.</w:t>
+        <w:t>Il dimostratore Wokwi rappresenta un primo passo verso l’inferenza embedded, ma presenta alcune limitazioni. La simulazione non consente di misurare consumo energetico reale, temperatura, interferenze, latenza di rete fisica o vincoli completi dell’hardware. Inoltre, utilizza campioni statici esportati per il modello embedded e non traffico acquisito in tempo reale da un’interfaccia di rete. Wokwi consente comunque di verificare il funzionamento del codice embedded senza hardware reale. In futuro l’esperimento potrebbe essere eseguito su dispositivi fisici, misurando memoria occupata, tempo di inferenza, stabilità e consumo energetico.</w:t>
       </w:r>
     </w:p>
     <w:p>
       <w:pPr>
         <w:pStyle w:val="Titolo2"/>
       </w:pPr>
-      <w:bookmarkStart w:id="63" w:name="_Toc239066291"/>
+      <w:bookmarkStart w:id="63" w:name="_Toc239067805"/>
       <w:r>
         <w:t>5.5 Strategie di mitigazione</w:t>
       </w:r>
@@ -9594,7 +9513,7 @@
       <w:pPr>
         <w:pStyle w:val="Titolo2"/>
       </w:pPr>
-      <w:bookmarkStart w:id="64" w:name="_Toc239066292"/>
+      <w:bookmarkStart w:id="64" w:name="_Toc239067806"/>
       <w:r>
         <w:t>5.6 Possibile percorso verso una validazione su hardware reale</w:t>
       </w:r>
@@ -9625,7 +9544,7 @@
       <w:pPr>
         <w:pStyle w:val="Titolo2"/>
       </w:pPr>
-      <w:bookmarkStart w:id="65" w:name="_Toc239066293"/>
+      <w:bookmarkStart w:id="65" w:name="_Toc239067807"/>
       <w:r>
         <w:t>5.7 Indicazioni operative per un IDS IoT</w:t>
       </w:r>
@@ -9667,7 +9586,7 @@
       <w:pPr>
         <w:pStyle w:val="Titolo2"/>
       </w:pPr>
-      <w:bookmarkStart w:id="66" w:name="_Toc239066294"/>
+      <w:bookmarkStart w:id="66" w:name="_Toc239067808"/>
       <w:r>
         <w:t>5.8 Considerazioni etiche e di gestione dei dati</w:t>
       </w:r>
@@ -9695,7 +9614,7 @@
         <w:pStyle w:val="Titolo1"/>
         <w:pageBreakBefore/>
       </w:pPr>
-      <w:bookmarkStart w:id="67" w:name="_Toc239066295"/>
+      <w:bookmarkStart w:id="67" w:name="_Toc239067809"/>
       <w:r>
         <w:t>Capitolo 6 - Conclusioni</w:t>
       </w:r>
@@ -9727,13 +9646,7 @@
     </w:p>
     <w:p>
       <w:r>
-        <w:t xml:space="preserve">Risultati: non i </w:t>
-      </w:r>
-      <w:r>
-        <w:t>più</w:t>
-      </w:r>
-      <w:r>
-        <w:t xml:space="preserve"> accurati, ma la regressione logistica è un modello semplice e interpretabile, adatto per un compito dimostrativo embedded. Il confronto è stato ampliato e sono stati discussi limiti e vantaggi dei diversi approcci con esperimenti estesi che includono SMOTE, tuning, MLPClassifier e Isolation Forest. L’analisi SHAP e le misure di deployment hanno spinto la valutazione oltre le metriche predittive. Il dimostratore Wokwi è stato dimostrato che l’export e la simulazione di un modello compatto su ESP32 sono possibili, ma anche per mostrare il compromesso tra accuratezza e portabilità.</w:t>
+        <w:t>La regressione logistica, pur non essendo il modello più accurato, è semplice e interpretabile e risulta adatta a un compito dimostrativo embedded. Il confronto è stato ampliato con esperimenti su SMOTE, tuning, MLPClassifier e Isolation Forest, discutendone limiti e vantaggi. L’analisi SHAP e le misure di deployment hanno esteso la valutazione oltre le sole metriche predittive. Il dimostratore Wokwi mostra che l’esportazione e la simulazione di un modello compatto su ESP32 sono possibili e rende evidente il compromesso tra accuratezza e portabilità.</w:t>
       </w:r>
     </w:p>
     <w:p>
@@ -9771,7 +9684,7 @@
           <w:lang w:val="en-US"/>
         </w:rPr>
       </w:pPr>
-      <w:bookmarkStart w:id="68" w:name="_Toc239066296"/>
+      <w:bookmarkStart w:id="68" w:name="_Toc239067810"/>
       <w:r>
         <w:rPr>
           <w:lang w:val="en-US"/>

</xml_diff>

<commit_message>
Regenerate final thesis documents
</commit_message>
<xml_diff>
--- a/thesis/final_thesis.docx
+++ b/thesis/final_thesis.docx
@@ -5321,7 +5321,13 @@
     </w:p>
     <w:p>
       <w:r>
-        <w:t xml:space="preserve">Esistono numerosi scenari applicativi. Le smart home sono sistemi di sicurezza domestica, sistemi di illuminazione/attuazione e controllo di riscaldamento e raffreddamento tramite vari elementi di inoltro (sensori). I dispositivi distribuiti nelle smart city assistono nel monitoraggio del traffico, nell’illuminazione pubblica, nel parcheggio intelligente e nella gestione ambientale. Per quanto riguarda il settore sanitario, strumenti connessi potrebbero assemblare dati clinici e facilitare il monitoraggio a distanza. L’Internet of Things utilizzato nell’industria </w:t>
+        <w:t xml:space="preserve">Esistono numerosi scenari applicativi. Le smart home sono sistemi di sicurezza domestica, sistemi di illuminazione/attuazione e controllo di riscaldamento e raffreddamento tramite vari </w:t>
+      </w:r>
+      <w:r>
+        <w:t>sensori</w:t>
+      </w:r>
+      <w:r>
+        <w:t xml:space="preserve">. I dispositivi distribuiti nelle smart city assistono nel monitoraggio del traffico, nell’illuminazione pubblica, nel parcheggio intelligente e nella gestione ambientale. Per quanto riguarda il settore sanitario, strumenti connessi potrebbero assemblare dati clinici e facilitare il monitoraggio a distanza. L’Internet of Things utilizzato nell’industria </w:t>
       </w:r>
       <w:r>
         <w:t>è di aiuto</w:t>

</xml_diff>